<commit_message>
Mejoras de Mediator y Command, pruebas e informe actualizado
- Mediator: AvionSanitario con prioridad en la torre, aviso de nuevas
  posiciones en la cola y registro de aeronaves desde el cliente.
- Command: deshacer con historial, Ventilador, MacroComando y control
  con varios botones reasignables.
- Pruebas unitarias con JUnit 5 (13 pruebas) y pom.xml para mvn test.
- Diagramas UML regenerados y alineados con el código.
- Informe (docx y pdf) y presentación actualizados.
</commit_message>
<xml_diff>
--- a/documentacion/PDS_Actividad_03_Grupo02.docx
+++ b/documentacion/PDS_Actividad_03_Grupo02.docx
@@ -842,7 +842,41 @@
           <w:sz w:val="20"/>
           <w:szCs w:val="20"/>
         </w:rPr>
-        <w:t xml:space="preserve">Se eligieron dos patrones de comportamiento del catálogo propuesto: Mediator, aplicado a una torre de control que coordina el aterrizaje de varias aeronaves en una sola pista, y Command, aplicado a un control remoto que enciende y apaga una luz. Ambos están implementados en Java en el repositorio del grupo.</w:t>
+        <w:t xml:space="preserve">Este informe presenta la resolución de la Actividad 03 del Grupo 02. De los patrones de comportamiento propuestos elegimos Mediator y Command porque atacan dos problemas distintos que aparecen con frecuencia en sistemas reales: el primero ordena la forma en que se comunican varios objetos que compiten por un mismo recurso; el segundo convierte una petición en un objeto que se puede asignar, registrar, deshacer o agrupar.</w:t>
+      </w:r>
+    </w:p>
+    <w:p>
+      <w:pPr>
+        <w:pStyle w:val="NormalWeb"/>
+        <w:shd w:val="clear" w:color="auto" w:fill="FFFFFF"/>
+        <w:spacing w:line="360" w:lineRule="auto"/>
+        <w:jc w:val="both"/>
+      </w:pPr>
+      <w:r>
+        <w:rPr>
+          <w:rFonts w:asciiTheme="minorHAnsi" w:hAnsiTheme="minorHAnsi" w:cstheme="minorHAnsi"/>
+          <w:color w:val="767171" w:themeColor="background2" w:themeShade="80"/>
+          <w:sz w:val="20"/>
+          <w:szCs w:val="20"/>
+        </w:rPr>
+        <w:t xml:space="preserve">Para Mediator modelamos una torre de control que administra una sola pista para vuelos comerciales y sanitarios. Para Command, un control remoto programable que acciona la luz y el ventilador de una sala de reuniones, con historial para deshacer y escenas predefinidas. Ambas soluciones están implementadas en Java 8, cuentan con pruebas unitarias en JUnit 5 y se encuentran en el repositorio del grupo.</w:t>
+      </w:r>
+    </w:p>
+    <w:p>
+      <w:pPr>
+        <w:pStyle w:val="NormalWeb"/>
+        <w:shd w:val="clear" w:color="auto" w:fill="FFFFFF"/>
+        <w:spacing w:line="360" w:lineRule="auto"/>
+        <w:jc w:val="both"/>
+      </w:pPr>
+      <w:r>
+        <w:rPr>
+          <w:rFonts w:asciiTheme="minorHAnsi" w:hAnsiTheme="minorHAnsi" w:cstheme="minorHAnsi"/>
+          <w:color w:val="767171" w:themeColor="background2" w:themeShade="80"/>
+          <w:sz w:val="20"/>
+          <w:szCs w:val="20"/>
+        </w:rPr>
+        <w:t xml:space="preserve">Los dos patrones se desarrollan con la misma secuencia: escenario, problema de diseño, justificación frente a otras alternativas, participantes, modelo UML, código, validación y uso crítico de la IA. Al final se presentan las pruebas automatizadas, una síntesis comparativa y las conclusiones.</w:t>
       </w:r>
     </w:p>
     <w:p>
@@ -899,7 +933,24 @@
           <w:sz w:val="20"/>
           <w:szCs w:val="20"/>
         </w:rPr>
-        <w:t xml:space="preserve">Varias aeronaves quieren aterrizar en la misma pista. Solo una puede usarla a la vez; las demás esperan en el orden en que pidieron turno y se les avisa cuando la pista queda libre. Cada aeronave sabe reportar su posición, pedir autorización y aterrizar. Decidir quién usa la pista y llevar la cola no le corresponde.</w:t>
+        <w:t xml:space="preserve">Un aeródromo regional opera con una sola pista. En horas pico varias aeronaves se aproximan al mismo tiempo y todas necesitan aterrizar, pero la pista admite una sola a la vez. Los vuelos comerciales se atienden por orden de llegada; los vuelos sanitarios, que trasladan pacientes, tienen prioridad sobre los regulares que estén esperando, aunque nunca interrumpen un aterrizaje en curso.</w:t>
+      </w:r>
+    </w:p>
+    <w:p>
+      <w:pPr>
+        <w:pStyle w:val="NormalWeb"/>
+        <w:shd w:val="clear" w:color="auto" w:fill="FFFFFF"/>
+        <w:spacing w:line="360" w:lineRule="auto"/>
+        <w:jc w:val="both"/>
+      </w:pPr>
+      <w:r>
+        <w:rPr>
+          <w:rFonts w:asciiTheme="minorHAnsi" w:hAnsiTheme="minorHAnsi" w:cstheme="minorHAnsi"/>
+          <w:color w:val="767171" w:themeColor="background2" w:themeShade="80"/>
+          <w:sz w:val="20"/>
+          <w:szCs w:val="20"/>
+        </w:rPr>
+        <w:t xml:space="preserve">Cada aeronave sabe pedir autorización, esperar y aterrizar. Lo que no debería saber es quién más está en el aire, en qué orden van los demás ni qué regla de prioridad se aplica. Esa información y esas decisiones le corresponden al control de tránsito, no a cada avión.</w:t>
       </w:r>
     </w:p>
     <w:p>
@@ -936,7 +987,25 @@
           <w:sz w:val="20"/>
           <w:szCs w:val="20"/>
         </w:rPr>
-        <w:t xml:space="preserve">Sin un coordinador, cada aeronave tendría que comunicarse con todas las demás (Figura 1). Con n aeronaves hay n·(n−1) dependencias, las reglas de la pista quedan repartidas entre todas las clases y cada avión nuevo obliga a modificar los existentes. Lo que hay que ordenar es la interacción: quién usa la pista, en qué orden y quién avisa a quién.</w:t>
+        <w:t xml:space="preserve">Sin un coordinador, cada aeronave tiene que conocer y consultar a las demás antes de usar la pista (Figura 1). Con n aeronaves aparecen hasta n·(n−1) dependencias y la regla de turnos queda repartida entre todas las clases, porque cada una debe decidir por su cuenta si le toca. Introducir la prioridad sanitaria en ese esquema implicaría modificar todos los tipos de aeronave, y agregar un tipo nuevo obligaría a revisar los existentes.</w:t>
+      </w:r>
+    </w:p>
+    <w:p>
+      <w:pPr>
+        <w:pStyle w:val="NormalWeb"/>
+        <w:keepNext/>
+        <w:shd w:val="clear" w:color="auto" w:fill="FFFFFF"/>
+        <w:spacing w:line="360" w:lineRule="auto"/>
+        <w:jc w:val="both"/>
+      </w:pPr>
+      <w:r>
+        <w:rPr>
+          <w:rFonts w:asciiTheme="minorHAnsi" w:hAnsiTheme="minorHAnsi" w:cstheme="minorHAnsi"/>
+          <w:color w:val="767171" w:themeColor="background2" w:themeShade="80"/>
+          <w:sz w:val="20"/>
+          <w:szCs w:val="20"/>
+        </w:rPr>
+        <w:t xml:space="preserve">El problema, por tanto, no está en lo que hace cada aeronave sino en cómo interactúan. Lo que hay que organizar es quién usa la pista, en qué orden y quién avisa a quién cuando la situación cambia.</w:t>
       </w:r>
     </w:p>
     <w:p>
@@ -1059,12 +1128,13 @@
           <w:sz w:val="20"/>
           <w:szCs w:val="20"/>
         </w:rPr>
-        <w:t xml:space="preserve">Mediator encapsula en un objeto la forma en que interactúa un grupo de objetos, de modo que estos no se refieren entre sí (Gamma et al., 1994). Es lo que pide el escenario: la torre guarda el estado de la pista y la cola, y las aeronaves solo conocen la interfaz ITorreControl.</w:t>
-      </w:r>
-    </w:p>
-    <w:p>
-      <w:pPr>
-        <w:pStyle w:val="NormalWeb"/>
+        <w:t xml:space="preserve">Mediator encapsula en un objeto la forma en que interactúa un conjunto de objetos, de modo que estos no se refieran entre sí de manera explícita y su interacción pueda variar de forma independiente (Gamma et al., 1994). Es lo que pide el escenario: la torre concentra el estado de la pista, las colas y la regla de prioridad, mientras que las aeronaves solo conocen la interfaz ITorreControl.</w:t>
+      </w:r>
+    </w:p>
+    <w:p>
+      <w:pPr>
+        <w:pStyle w:val="NormalWeb"/>
+        <w:keepNext/>
         <w:shd w:val="clear" w:color="auto" w:fill="FFFFFF"/>
         <w:spacing w:after="60" w:afterAutospacing="0" w:line="360" w:lineRule="auto"/>
         <w:jc w:val="both"/>
@@ -1076,7 +1146,7 @@
           <w:sz w:val="20"/>
           <w:szCs w:val="20"/>
         </w:rPr>
-        <w:t xml:space="preserve">Alternativas descartadas:</w:t>
+        <w:t xml:space="preserve">Alternativas consideradas y descartadas:</w:t>
       </w:r>
     </w:p>
     <w:p>
@@ -1108,7 +1178,7 @@
           <w:sz w:val="20"/>
           <w:szCs w:val="20"/>
         </w:rPr>
-        <w:t xml:space="preserve"> Es la Figura 1: el acoplamiento crece con cada aeronave que se agrega.</w:t>
+        <w:t xml:space="preserve"> Es la Figura 1: el acoplamiento crece con cada aeronave que se agrega y la regla de turnos se duplica en todas las clases.</w:t>
       </w:r>
     </w:p>
     <w:p>
@@ -1140,7 +1210,7 @@
           <w:sz w:val="20"/>
           <w:szCs w:val="20"/>
         </w:rPr>
-        <w:t xml:space="preserve"> Sirve para avisar «pista libre», pero no decide a quién le toca. Todas las aeronaves en espera recibirían el aviso a la vez y cada una tendría que resolver el turno por su cuenta.</w:t>
+        <w:t xml:space="preserve"> Sirve para difundir el evento «pista libre», pero no decide a quién le corresponde. Todas las aeronaves en espera recibirían el aviso a la vez y tendrían que resolver el turno entre ellas, que es justamente el problema de partida.</w:t>
       </w:r>
     </w:p>
     <w:p>
@@ -1172,7 +1242,7 @@
           <w:sz w:val="20"/>
           <w:szCs w:val="20"/>
         </w:rPr>
-        <w:t xml:space="preserve"> Pasa la solicitud por una cadena hasta que alguien la atiende. Aquí siempre la atiende la torre, y la torre necesita ver la pista y la cola completas.</w:t>
+        <w:t xml:space="preserve"> Hace pasar una solicitud por una cadena hasta que alguien la atiende. Aquí siempre la atiende el mismo objeto, y ese objeto necesita ver el estado completo (pista y colas) para decidir.</w:t>
       </w:r>
     </w:p>
     <w:p>
@@ -1204,7 +1274,7 @@
           <w:sz w:val="20"/>
           <w:szCs w:val="20"/>
         </w:rPr>
-        <w:t xml:space="preserve"> Simplifica el acceso a un subsistema en un solo sentido. La torre, en cambio, también avisa a las aeronaves (recibirAutorizacion, recibirEspera), y esa comunicación de ida y vuelta es la que resuelve Mediator.</w:t>
+        <w:t xml:space="preserve"> Simplifica el acceso a un subsistema, pero la comunicación va en un solo sentido. La torre, en cambio, también se dirige a las aeronaves (recibirAutorizacion, recibirEspera); esa comunicación de ida y vuelta es la que caracteriza a Mediator.</w:t>
       </w:r>
     </w:p>
     <w:p>
@@ -1247,16 +1317,16 @@
           <w:sz w:val="20"/>
           <w:szCs w:val="20"/>
         </w:rPr>
-        <w:t xml:space="preserve">ITorreControl (Mediator):</w:t>
-      </w:r>
-      <w:r>
-        <w:rPr>
-          <w:rFonts w:asciiTheme="minorHAnsi" w:hAnsiTheme="minorHAnsi" w:cstheme="minorHAnsi"/>
-          <w:color w:val="767171" w:themeColor="background2" w:themeShade="80"/>
-          <w:sz w:val="20"/>
-          <w:szCs w:val="20"/>
-        </w:rPr>
-        <w:t xml:space="preserve"> define registrarAeronave(), solicitarAterrizaje() y liberarPista().</w:t>
+        <w:t xml:space="preserve">Mediator → ITorreControl:</w:t>
+      </w:r>
+      <w:r>
+        <w:rPr>
+          <w:rFonts w:asciiTheme="minorHAnsi" w:hAnsiTheme="minorHAnsi" w:cstheme="minorHAnsi"/>
+          <w:color w:val="767171" w:themeColor="background2" w:themeShade="80"/>
+          <w:sz w:val="20"/>
+          <w:szCs w:val="20"/>
+        </w:rPr>
+        <w:t xml:space="preserve"> declara las operaciones con las que un colega se comunica con la torre: registrarAeronave(), solicitarAterrizaje() y liberarPista().</w:t>
       </w:r>
     </w:p>
     <w:p>
@@ -1279,16 +1349,16 @@
           <w:sz w:val="20"/>
           <w:szCs w:val="20"/>
         </w:rPr>
-        <w:t xml:space="preserve">TorreControlConcreta (ConcreteMediator):</w:t>
-      </w:r>
-      <w:r>
-        <w:rPr>
-          <w:rFonts w:asciiTheme="minorHAnsi" w:hAnsiTheme="minorHAnsi" w:cstheme="minorHAnsi"/>
-          <w:color w:val="767171" w:themeColor="background2" w:themeShade="80"/>
-          <w:sz w:val="20"/>
-          <w:szCs w:val="20"/>
-        </w:rPr>
-        <w:t xml:space="preserve"> guarda las aeronaves registradas, la cola de espera y la aeronave en pista. Autoriza o encola cada solicitud y, cuando se libera la pista, autoriza a la siguiente.</w:t>
+        <w:t xml:space="preserve">ConcreteMediator → TorreControlConcreta:</w:t>
+      </w:r>
+      <w:r>
+        <w:rPr>
+          <w:rFonts w:asciiTheme="minorHAnsi" w:hAnsiTheme="minorHAnsi" w:cstheme="minorHAnsi"/>
+          <w:color w:val="767171" w:themeColor="background2" w:themeShade="80"/>
+          <w:sz w:val="20"/>
+          <w:szCs w:val="20"/>
+        </w:rPr>
+        <w:t xml:space="preserve"> mantiene el registro de aeronaves, la cola prioritaria, la cola regular y la aeronave en pista. Decide si autoriza o encola, aplica la prioridad sanitaria y, cuando la pista se libera, autoriza al siguiente. También avisa a los vuelos regulares cuando cambia su posición en la cola.</w:t>
       </w:r>
     </w:p>
     <w:p>
@@ -1311,16 +1381,16 @@
           <w:sz w:val="20"/>
           <w:szCs w:val="20"/>
         </w:rPr>
-        <w:t xml:space="preserve">Aeronave (Colleague):</w:t>
-      </w:r>
-      <w:r>
-        <w:rPr>
-          <w:rFonts w:asciiTheme="minorHAnsi" w:hAnsiTheme="minorHAnsi" w:cstheme="minorHAnsi"/>
-          <w:color w:val="767171" w:themeColor="background2" w:themeShade="80"/>
-          <w:sz w:val="20"/>
-          <w:szCs w:val="20"/>
-        </w:rPr>
-        <w:t xml:space="preserve"> clase abstracta. Se registra en la torre al crearse, pide autorización y recibe las respuestas de la torre.</w:t>
+        <w:t xml:space="preserve">Colleague → Aeronave:</w:t>
+      </w:r>
+      <w:r>
+        <w:rPr>
+          <w:rFonts w:asciiTheme="minorHAnsi" w:hAnsiTheme="minorHAnsi" w:cstheme="minorHAnsi"/>
+          <w:color w:val="767171" w:themeColor="background2" w:themeShade="80"/>
+          <w:sz w:val="20"/>
+          <w:szCs w:val="20"/>
+        </w:rPr>
+        <w:t xml:space="preserve"> clase abstracta que solo conoce a su mediador. Pide autorización, recibe las respuestas de la torre y aterriza únicamente si fue autorizada. Declara esPrioritaria() para que la torre clasifique la solicitud sin preguntar por el tipo concreto.</w:t>
       </w:r>
     </w:p>
     <w:p>
@@ -1343,16 +1413,16 @@
           <w:sz w:val="20"/>
           <w:szCs w:val="20"/>
         </w:rPr>
-        <w:t xml:space="preserve">AvionComercial (ConcreteColleague):</w:t>
-      </w:r>
-      <w:r>
-        <w:rPr>
-          <w:rFonts w:asciiTheme="minorHAnsi" w:hAnsiTheme="minorHAnsi" w:cstheme="minorHAnsi"/>
-          <w:color w:val="767171" w:themeColor="background2" w:themeShade="80"/>
-          <w:sz w:val="20"/>
-          <w:szCs w:val="20"/>
-        </w:rPr>
-        <w:t xml:space="preserve"> aterriza solo si tiene autorización y después libera la pista.</w:t>
+        <w:t xml:space="preserve">ConcreteColleague → AvionComercial y AvionSanitario:</w:t>
+      </w:r>
+      <w:r>
+        <w:rPr>
+          <w:rFonts w:asciiTheme="minorHAnsi" w:hAnsiTheme="minorHAnsi" w:cstheme="minorHAnsi"/>
+          <w:color w:val="767171" w:themeColor="background2" w:themeShade="80"/>
+          <w:sz w:val="20"/>
+          <w:szCs w:val="20"/>
+        </w:rPr>
+        <w:t xml:space="preserve"> cada uno indica si su vuelo es prioritario. Ninguno conoce al otro.</w:t>
       </w:r>
     </w:p>
     <w:p>
@@ -1375,16 +1445,118 @@
           <w:sz w:val="20"/>
           <w:szCs w:val="20"/>
         </w:rPr>
-        <w:t xml:space="preserve">MainMediatorTorreControl (Client):</w:t>
-      </w:r>
-      <w:r>
-        <w:rPr>
-          <w:rFonts w:asciiTheme="minorHAnsi" w:hAnsiTheme="minorHAnsi" w:cstheme="minorHAnsi"/>
-          <w:color w:val="767171" w:themeColor="background2" w:themeShade="80"/>
-          <w:sz w:val="20"/>
-          <w:szCs w:val="20"/>
-        </w:rPr>
-        <w:t xml:space="preserve"> arma la simulación con tres vuelos.</w:t>
+        <w:t xml:space="preserve">Client → MainMediatorTorreControl:</w:t>
+      </w:r>
+      <w:r>
+        <w:rPr>
+          <w:rFonts w:asciiTheme="minorHAnsi" w:hAnsiTheme="minorHAnsi" w:cstheme="minorHAnsi"/>
+          <w:color w:val="767171" w:themeColor="background2" w:themeShade="80"/>
+          <w:sz w:val="20"/>
+          <w:szCs w:val="20"/>
+        </w:rPr>
+        <w:t xml:space="preserve"> crea la torre y las aeronaves, las registra y ejecuta la simulación.</w:t>
+      </w:r>
+    </w:p>
+    <w:p>
+      <w:pPr>
+        <w:pStyle w:val="NormalWeb"/>
+        <w:keepNext/>
+        <w:shd w:val="clear" w:color="auto" w:fill="FFFFFF"/>
+        <w:spacing w:after="60" w:afterAutospacing="0" w:line="360" w:lineRule="auto"/>
+        <w:jc w:val="both"/>
+      </w:pPr>
+      <w:r>
+        <w:rPr>
+          <w:rFonts w:asciiTheme="minorHAnsi" w:hAnsiTheme="minorHAnsi" w:cstheme="minorHAnsi"/>
+          <w:color w:val="767171" w:themeColor="background2" w:themeShade="80"/>
+          <w:sz w:val="20"/>
+          <w:szCs w:val="20"/>
+        </w:rPr>
+        <w:t xml:space="preserve">La colaboración entre los objetos sigue esta secuencia:</w:t>
+      </w:r>
+    </w:p>
+    <w:p>
+      <w:pPr>
+        <w:pStyle w:val="NormalWeb"/>
+        <w:numPr>
+          <w:ilvl w:val="0"/>
+          <w:numId w:val="12"/>
+        </w:numPr>
+        <w:shd w:val="clear" w:color="auto" w:fill="FFFFFF"/>
+        <w:spacing w:before="40" w:beforeAutospacing="0" w:after="40" w:afterAutospacing="0" w:line="360" w:lineRule="auto"/>
+        <w:jc w:val="both"/>
+      </w:pPr>
+      <w:r>
+        <w:rPr>
+          <w:rFonts w:asciiTheme="minorHAnsi" w:hAnsiTheme="minorHAnsi" w:cstheme="minorHAnsi"/>
+          <w:color w:val="767171" w:themeColor="background2" w:themeShade="80"/>
+          <w:sz w:val="20"/>
+          <w:szCs w:val="20"/>
+        </w:rPr>
+        <w:t xml:space="preserve">El cliente registra cada aeronave en la torre. Si una aeronave no registrada pide pista, la torre la rechaza y no la ingresa a ninguna cola.</w:t>
+      </w:r>
+    </w:p>
+    <w:p>
+      <w:pPr>
+        <w:pStyle w:val="NormalWeb"/>
+        <w:numPr>
+          <w:ilvl w:val="0"/>
+          <w:numId w:val="12"/>
+        </w:numPr>
+        <w:shd w:val="clear" w:color="auto" w:fill="FFFFFF"/>
+        <w:spacing w:before="40" w:beforeAutospacing="0" w:after="40" w:afterAutospacing="0" w:line="360" w:lineRule="auto"/>
+        <w:jc w:val="both"/>
+      </w:pPr>
+      <w:r>
+        <w:rPr>
+          <w:rFonts w:asciiTheme="minorHAnsi" w:hAnsiTheme="minorHAnsi" w:cstheme="minorHAnsi"/>
+          <w:color w:val="767171" w:themeColor="background2" w:themeShade="80"/>
+          <w:sz w:val="20"/>
+          <w:szCs w:val="20"/>
+        </w:rPr>
+        <w:t xml:space="preserve">La aeronave invoca solicitarAutorizacion(), que delega en torre.solicitarAterrizaje(this).</w:t>
+      </w:r>
+    </w:p>
+    <w:p>
+      <w:pPr>
+        <w:pStyle w:val="NormalWeb"/>
+        <w:numPr>
+          <w:ilvl w:val="0"/>
+          <w:numId w:val="12"/>
+        </w:numPr>
+        <w:shd w:val="clear" w:color="auto" w:fill="FFFFFF"/>
+        <w:spacing w:before="40" w:beforeAutospacing="0" w:after="40" w:afterAutospacing="0" w:line="360" w:lineRule="auto"/>
+        <w:jc w:val="both"/>
+      </w:pPr>
+      <w:r>
+        <w:rPr>
+          <w:rFonts w:asciiTheme="minorHAnsi" w:hAnsiTheme="minorHAnsi" w:cstheme="minorHAnsi"/>
+          <w:color w:val="767171" w:themeColor="background2" w:themeShade="80"/>
+          <w:sz w:val="20"/>
+          <w:szCs w:val="20"/>
+        </w:rPr>
+        <w:t xml:space="preserve">Si la pista está libre, la torre la asigna y notifica recibirAutorizacion(). Si está ocupada, encola la solicitud según esPrioritaria() y notifica recibirEspera(posicion). Cuando ingresa un vuelo prioritario, la torre recalcula y comunica la nueva posición a los regulares que esperan.</w:t>
+      </w:r>
+    </w:p>
+    <w:p>
+      <w:pPr>
+        <w:pStyle w:val="NormalWeb"/>
+        <w:numPr>
+          <w:ilvl w:val="0"/>
+          <w:numId w:val="12"/>
+        </w:numPr>
+        <w:shd w:val="clear" w:color="auto" w:fill="FFFFFF"/>
+        <w:spacing w:before="40" w:beforeAutospacing="0" w:after="40" w:afterAutospacing="0" w:line="360" w:lineRule="auto"/>
+        <w:jc w:val="both"/>
+      </w:pPr>
+      <w:r>
+        <w:rPr>
+          <w:rFonts w:asciiTheme="minorHAnsi" w:hAnsiTheme="minorHAnsi" w:cstheme="minorHAnsi"/>
+          <w:color w:val="767171" w:themeColor="background2" w:themeShade="80"/>
+          <w:sz w:val="20"/>
+          <w:szCs w:val="20"/>
+        </w:rPr>
+        <w:t xml:space="preserve">Al aterrizar, la aeronave invoca liberarPista(this). La torre toma al siguiente (primero de la cola prioritaria y, si está vacía, de la regular) y lo autoriza.</w:t>
       </w:r>
     </w:p>
     <w:p>
@@ -1401,7 +1573,7 @@
           <w:sz w:val="20"/>
           <w:szCs w:val="20"/>
         </w:rPr>
-        <w:t xml:space="preserve">En la ejecución (Figura 3), VUELO-LA402 encuentra la pista libre y recibe autorización; VUELO-IB612 y VUELO-AA990 quedan en cola en las posiciones 1 y 2. Cada vez que un vuelo aterriza y libera la pista, la torre autoriza al siguiente. Ningún avión llama a otro.</w:t>
+        <w:t xml:space="preserve">En la ejecución (Figura 3), VUELO-LA402 encuentra la pista libre; VUELO-IB612 y VUELO-AA990 quedan en las posiciones 1 y 2. Cuando SANITARIO-HC01 pide pista pasa al primer lugar, y la torre informa a los dos comerciales que retroceden a las posiciones 2 y 3. VUELO-AA990 intenta aterrizar sin autorización y la propia aeronave lo impide. En todo el recorrido ningún avión invoca a otro.</w:t>
       </w:r>
     </w:p>
     <w:p>
@@ -1427,6 +1599,7 @@
     <w:p>
       <w:pPr>
         <w:pStyle w:val="NormalWeb"/>
+        <w:keepNext/>
         <w:shd w:val="clear" w:color="auto" w:fill="FFFFFF"/>
         <w:spacing w:line="360" w:lineRule="auto"/>
         <w:jc w:val="both"/>
@@ -1438,7 +1611,7 @@
           <w:sz w:val="20"/>
           <w:szCs w:val="20"/>
         </w:rPr>
-        <w:t xml:space="preserve">Notación UML según Fowler (2004). Las aeronaves apuntan a ITorreControl (0..* a 1) y TorreControlConcreta guarda listaAeronaves y colaEspera (1 a 0..*). MainMediatorTorreControl crea la torre y los aviones (dependencias «create»). No hay asociaciones entre aeronaves.</w:t>
+        <w:t xml:space="preserve">Seguimos la notación de Fowler (2004): las propiedades cuyo tipo es otra clase del modelo se dibujan como asociaciones navegables y no se repiten como atributos. Por eso TorreControlConcreta muestra cuatro asociaciones hacia Aeronave, una por cada propiedad del código: listaAeronaves (0..*), colaPrioritaria (0..*), colaEspera (0..*) y aeronaveEnPista (0..1). Las aeronaves navegan hacia ITorreControl (0..* a 1) y no existe ninguna asociación entre aeronaves. El cliente se relaciona con las clases que instancia mediante dependencias «create», y una nota documenta la regla de atención de la torre.</w:t>
       </w:r>
     </w:p>
     <w:p>
@@ -1455,7 +1628,7 @@
         </w:rPr>
         <w:drawing>
           <wp:inline distT="0" distB="0" distL="0" distR="0">
-            <wp:extent cx="5394960" cy="4010487"/>
+            <wp:extent cx="5394960" cy="3305174"/>
             <wp:effectExtent l="0" t="0" r="0" b="0"/>
             <wp:docPr id="902" name="Figura 2"/>
             <wp:cNvGraphicFramePr>
@@ -1477,7 +1650,7 @@
                   <pic:spPr>
                     <a:xfrm>
                       <a:off x="0" y="0"/>
-                      <a:ext cx="5394960" cy="4010487"/>
+                      <a:ext cx="5394960" cy="3305174"/>
                     </a:xfrm>
                     <a:prstGeom prst="rect">
                       <a:avLst/>
@@ -1557,27 +1730,17 @@
       <w:r>
         <w:rPr>
           <w:rFonts w:asciiTheme="minorHAnsi" w:hAnsiTheme="minorHAnsi" w:cstheme="minorHAnsi"/>
-          <w:b/>
-          <w:bCs/>
-          <w:color w:val="767171" w:themeColor="background2" w:themeShade="80"/>
-          <w:sz w:val="20"/>
-          <w:szCs w:val="20"/>
-        </w:rPr>
-        <w:t xml:space="preserve">Repositorio / enlace:</w:t>
-      </w:r>
-      <w:r>
-        <w:rPr>
-          <w:rFonts w:asciiTheme="minorHAnsi" w:hAnsiTheme="minorHAnsi" w:cstheme="minorHAnsi"/>
-          <w:color w:val="767171" w:themeColor="background2" w:themeShade="80"/>
-          <w:sz w:val="20"/>
-          <w:szCs w:val="20"/>
-        </w:rPr>
-        <w:t xml:space="preserve"> https://github.com/carytnas/PDS_Actividad03_Grupo02/tree/main/codigo/ejercicios/src/mediator</w:t>
-      </w:r>
-    </w:p>
-    <w:p>
-      <w:pPr>
-        <w:pStyle w:val="NormalWeb"/>
+          <w:color w:val="767171" w:themeColor="background2" w:themeShade="80"/>
+          <w:sz w:val="20"/>
+          <w:szCs w:val="20"/>
+        </w:rPr>
+        <w:t xml:space="preserve">Repositorio / enlace: https://github.com/carytnas/PDS_Actividad03_Grupo02/tree/main/codigo/ejercicios/src/mediator</w:t>
+      </w:r>
+    </w:p>
+    <w:p>
+      <w:pPr>
+        <w:pStyle w:val="NormalWeb"/>
+        <w:keepNext/>
         <w:shd w:val="clear" w:color="auto" w:fill="FFFFFF"/>
         <w:spacing w:line="360" w:lineRule="auto"/>
         <w:jc w:val="both"/>
@@ -1589,7 +1752,7 @@
           <w:sz w:val="20"/>
           <w:szCs w:val="20"/>
         </w:rPr>
-        <w:t xml:space="preserve">La clase central es TorreControlConcreta:</w:t>
+        <w:t xml:space="preserve">El núcleo del patrón está en TorreControlConcreta. Se muestran los dos métodos que concentran las reglas: cómo se atiende una solicitud y qué ocurre cuando se libera la pista.</w:t>
       </w:r>
     </w:p>
     <w:p>
@@ -1609,7 +1772,7 @@
           <w:sz w:val="16"/>
           <w:szCs w:val="16"/>
         </w:rPr>
-        <w:t xml:space="preserve">src/mediator/TorreControlConcreta.java</w:t>
+        <w:t xml:space="preserve">src/mediator/TorreControlConcreta.java (fragmento)</w:t>
       </w:r>
     </w:p>
     <w:p>
@@ -1627,7 +1790,7 @@
           <w:sz w:val="14"/>
           <w:szCs w:val="14"/>
         </w:rPr>
-        <w:t xml:space="preserve">package mediator;</w:t>
+        <w:t xml:space="preserve">public class TorreControlConcreta implements ITorreControl {</w:t>
       </w:r>
     </w:p>
     <w:p>
@@ -1645,6 +1808,24 @@
           <w:sz w:val="14"/>
           <w:szCs w:val="14"/>
         </w:rPr>
+        <w:t xml:space="preserve">  // ... atributos y demás métodos</w:t>
+      </w:r>
+    </w:p>
+    <w:p>
+      <w:pPr>
+        <w:pStyle w:val="NormalWeb"/>
+        <w:keepNext/>
+        <w:shd w:val="clear" w:color="auto" w:fill="F2F2F2"/>
+        <w:spacing w:before="0" w:beforeAutospacing="0" w:after="0" w:afterAutospacing="0" w:line="240" w:lineRule="auto"/>
+        <w:jc w:val="left"/>
+      </w:pPr>
+      <w:r>
+        <w:rPr>
+          <w:rFonts w:ascii="Courier New" w:hAnsi="Courier New" w:cs="Courier New"/>
+          <w:color w:val="262626"/>
+          <w:sz w:val="14"/>
+          <w:szCs w:val="14"/>
+        </w:rPr>
         <w:t xml:space="preserve"> </w:t>
       </w:r>
     </w:p>
@@ -1662,58 +1843,41 @@
           <w:sz w:val="14"/>
           <w:szCs w:val="14"/>
         </w:rPr>
-        <w:t xml:space="preserve">import java.util.ArrayList;</w:t>
-      </w:r>
-    </w:p>
-    <w:p>
-      <w:pPr>
-        <w:pStyle w:val="NormalWeb"/>
-        <w:shd w:val="clear" w:color="auto" w:fill="F2F2F2"/>
-        <w:spacing w:before="0" w:beforeAutospacing="0" w:after="0" w:afterAutospacing="0" w:line="240" w:lineRule="auto"/>
-        <w:jc w:val="left"/>
-      </w:pPr>
-      <w:r>
-        <w:rPr>
-          <w:rFonts w:ascii="Courier New" w:hAnsi="Courier New" w:cs="Courier New"/>
-          <w:color w:val="262626"/>
-          <w:sz w:val="14"/>
-          <w:szCs w:val="14"/>
-        </w:rPr>
-        <w:t xml:space="preserve">import java.util.LinkedList;</w:t>
-      </w:r>
-    </w:p>
-    <w:p>
-      <w:pPr>
-        <w:pStyle w:val="NormalWeb"/>
-        <w:shd w:val="clear" w:color="auto" w:fill="F2F2F2"/>
-        <w:spacing w:before="0" w:beforeAutospacing="0" w:after="0" w:afterAutospacing="0" w:line="240" w:lineRule="auto"/>
-        <w:jc w:val="left"/>
-      </w:pPr>
-      <w:r>
-        <w:rPr>
-          <w:rFonts w:ascii="Courier New" w:hAnsi="Courier New" w:cs="Courier New"/>
-          <w:color w:val="262626"/>
-          <w:sz w:val="14"/>
-          <w:szCs w:val="14"/>
-        </w:rPr>
-        <w:t xml:space="preserve">import java.util.List;</w:t>
-      </w:r>
-    </w:p>
-    <w:p>
-      <w:pPr>
-        <w:pStyle w:val="NormalWeb"/>
-        <w:shd w:val="clear" w:color="auto" w:fill="F2F2F2"/>
-        <w:spacing w:before="0" w:beforeAutospacing="0" w:after="0" w:afterAutospacing="0" w:line="240" w:lineRule="auto"/>
-        <w:jc w:val="left"/>
-      </w:pPr>
-      <w:r>
-        <w:rPr>
-          <w:rFonts w:ascii="Courier New" w:hAnsi="Courier New" w:cs="Courier New"/>
-          <w:color w:val="262626"/>
-          <w:sz w:val="14"/>
-          <w:szCs w:val="14"/>
-        </w:rPr>
-        <w:t xml:space="preserve">import java.util.Queue;</w:t>
+        <w:t xml:space="preserve">  @Override</w:t>
+      </w:r>
+    </w:p>
+    <w:p>
+      <w:pPr>
+        <w:pStyle w:val="NormalWeb"/>
+        <w:shd w:val="clear" w:color="auto" w:fill="F2F2F2"/>
+        <w:spacing w:before="0" w:beforeAutospacing="0" w:after="0" w:afterAutospacing="0" w:line="240" w:lineRule="auto"/>
+        <w:jc w:val="left"/>
+      </w:pPr>
+      <w:r>
+        <w:rPr>
+          <w:rFonts w:ascii="Courier New" w:hAnsi="Courier New" w:cs="Courier New"/>
+          <w:color w:val="262626"/>
+          <w:sz w:val="14"/>
+          <w:szCs w:val="14"/>
+        </w:rPr>
+        <w:t xml:space="preserve">  public void solicitarAterrizaje(Aeronave aeronave) {</w:t>
+      </w:r>
+    </w:p>
+    <w:p>
+      <w:pPr>
+        <w:pStyle w:val="NormalWeb"/>
+        <w:shd w:val="clear" w:color="auto" w:fill="F2F2F2"/>
+        <w:spacing w:before="0" w:beforeAutospacing="0" w:after="0" w:afterAutospacing="0" w:line="240" w:lineRule="auto"/>
+        <w:jc w:val="left"/>
+      </w:pPr>
+      <w:r>
+        <w:rPr>
+          <w:rFonts w:ascii="Courier New" w:hAnsi="Courier New" w:cs="Courier New"/>
+          <w:color w:val="262626"/>
+          <w:sz w:val="14"/>
+          <w:szCs w:val="14"/>
+        </w:rPr>
+        <w:t xml:space="preserve">    System.out.println("\n[TORRE] Solicitud recibida de la aeronave: " + aeronave.getIdentificador());</w:t>
       </w:r>
     </w:p>
     <w:p>
@@ -1747,7 +1911,143 @@
           <w:sz w:val="14"/>
           <w:szCs w:val="14"/>
         </w:rPr>
-        <w:t xml:space="preserve">public class TorreControlConcreta implements ITorreControl {</w:t>
+        <w:t xml:space="preserve">    if (!listaAeronaves.contains(aeronave)) {</w:t>
+      </w:r>
+    </w:p>
+    <w:p>
+      <w:pPr>
+        <w:pStyle w:val="NormalWeb"/>
+        <w:shd w:val="clear" w:color="auto" w:fill="F2F2F2"/>
+        <w:spacing w:before="0" w:beforeAutospacing="0" w:after="0" w:afterAutospacing="0" w:line="240" w:lineRule="auto"/>
+        <w:jc w:val="left"/>
+      </w:pPr>
+      <w:r>
+        <w:rPr>
+          <w:rFonts w:ascii="Courier New" w:hAnsi="Courier New" w:cs="Courier New"/>
+          <w:color w:val="262626"/>
+          <w:sz w:val="14"/>
+          <w:szCs w:val="14"/>
+        </w:rPr>
+        <w:t xml:space="preserve">      System.out.println("[TORRE AVISO] La aeronave " + aeronave.getIdentificador() + " no está registrada.");</w:t>
+      </w:r>
+    </w:p>
+    <w:p>
+      <w:pPr>
+        <w:pStyle w:val="NormalWeb"/>
+        <w:shd w:val="clear" w:color="auto" w:fill="F2F2F2"/>
+        <w:spacing w:before="0" w:beforeAutospacing="0" w:after="0" w:afterAutospacing="0" w:line="240" w:lineRule="auto"/>
+        <w:jc w:val="left"/>
+      </w:pPr>
+      <w:r>
+        <w:rPr>
+          <w:rFonts w:ascii="Courier New" w:hAnsi="Courier New" w:cs="Courier New"/>
+          <w:color w:val="262626"/>
+          <w:sz w:val="14"/>
+          <w:szCs w:val="14"/>
+        </w:rPr>
+        <w:t xml:space="preserve">      return;</w:t>
+      </w:r>
+    </w:p>
+    <w:p>
+      <w:pPr>
+        <w:pStyle w:val="NormalWeb"/>
+        <w:shd w:val="clear" w:color="auto" w:fill="F2F2F2"/>
+        <w:spacing w:before="0" w:beforeAutospacing="0" w:after="0" w:afterAutospacing="0" w:line="240" w:lineRule="auto"/>
+        <w:jc w:val="left"/>
+      </w:pPr>
+      <w:r>
+        <w:rPr>
+          <w:rFonts w:ascii="Courier New" w:hAnsi="Courier New" w:cs="Courier New"/>
+          <w:color w:val="262626"/>
+          <w:sz w:val="14"/>
+          <w:szCs w:val="14"/>
+        </w:rPr>
+        <w:t xml:space="preserve">    }</w:t>
+      </w:r>
+    </w:p>
+    <w:p>
+      <w:pPr>
+        <w:pStyle w:val="NormalWeb"/>
+        <w:shd w:val="clear" w:color="auto" w:fill="F2F2F2"/>
+        <w:spacing w:before="0" w:beforeAutospacing="0" w:after="0" w:afterAutospacing="0" w:line="240" w:lineRule="auto"/>
+        <w:jc w:val="left"/>
+      </w:pPr>
+      <w:r>
+        <w:rPr>
+          <w:rFonts w:ascii="Courier New" w:hAnsi="Courier New" w:cs="Courier New"/>
+          <w:color w:val="262626"/>
+          <w:sz w:val="14"/>
+          <w:szCs w:val="14"/>
+        </w:rPr>
+        <w:t xml:space="preserve">    if (aeronave == aeronaveEnPista || colaPrioritaria.contains(aeronave) || colaEspera.contains(aeronave)) {</w:t>
+      </w:r>
+    </w:p>
+    <w:p>
+      <w:pPr>
+        <w:pStyle w:val="NormalWeb"/>
+        <w:shd w:val="clear" w:color="auto" w:fill="F2F2F2"/>
+        <w:spacing w:before="0" w:beforeAutospacing="0" w:after="0" w:afterAutospacing="0" w:line="240" w:lineRule="auto"/>
+        <w:jc w:val="left"/>
+      </w:pPr>
+      <w:r>
+        <w:rPr>
+          <w:rFonts w:ascii="Courier New" w:hAnsi="Courier New" w:cs="Courier New"/>
+          <w:color w:val="262626"/>
+          <w:sz w:val="14"/>
+          <w:szCs w:val="14"/>
+        </w:rPr>
+        <w:t xml:space="preserve">      System.out.println("[TORRE AVISO] La aeronave " + aeronave.getIdentificador()</w:t>
+      </w:r>
+    </w:p>
+    <w:p>
+      <w:pPr>
+        <w:pStyle w:val="NormalWeb"/>
+        <w:shd w:val="clear" w:color="auto" w:fill="F2F2F2"/>
+        <w:spacing w:before="0" w:beforeAutospacing="0" w:after="0" w:afterAutospacing="0" w:line="240" w:lineRule="auto"/>
+        <w:jc w:val="left"/>
+      </w:pPr>
+      <w:r>
+        <w:rPr>
+          <w:rFonts w:ascii="Courier New" w:hAnsi="Courier New" w:cs="Courier New"/>
+          <w:color w:val="262626"/>
+          <w:sz w:val="14"/>
+          <w:szCs w:val="14"/>
+        </w:rPr>
+        <w:t xml:space="preserve">          + " ya tiene la pista asignada o está en la cola de espera.");</w:t>
+      </w:r>
+    </w:p>
+    <w:p>
+      <w:pPr>
+        <w:pStyle w:val="NormalWeb"/>
+        <w:shd w:val="clear" w:color="auto" w:fill="F2F2F2"/>
+        <w:spacing w:before="0" w:beforeAutospacing="0" w:after="0" w:afterAutospacing="0" w:line="240" w:lineRule="auto"/>
+        <w:jc w:val="left"/>
+      </w:pPr>
+      <w:r>
+        <w:rPr>
+          <w:rFonts w:ascii="Courier New" w:hAnsi="Courier New" w:cs="Courier New"/>
+          <w:color w:val="262626"/>
+          <w:sz w:val="14"/>
+          <w:szCs w:val="14"/>
+        </w:rPr>
+        <w:t xml:space="preserve">      return;</w:t>
+      </w:r>
+    </w:p>
+    <w:p>
+      <w:pPr>
+        <w:pStyle w:val="NormalWeb"/>
+        <w:shd w:val="clear" w:color="auto" w:fill="F2F2F2"/>
+        <w:spacing w:before="0" w:beforeAutospacing="0" w:after="0" w:afterAutospacing="0" w:line="240" w:lineRule="auto"/>
+        <w:jc w:val="left"/>
+      </w:pPr>
+      <w:r>
+        <w:rPr>
+          <w:rFonts w:ascii="Courier New" w:hAnsi="Courier New" w:cs="Courier New"/>
+          <w:color w:val="262626"/>
+          <w:sz w:val="14"/>
+          <w:szCs w:val="14"/>
+        </w:rPr>
+        <w:t xml:space="preserve">    }</w:t>
       </w:r>
     </w:p>
     <w:p>
@@ -1781,41 +2081,262 @@
           <w:sz w:val="14"/>
           <w:szCs w:val="14"/>
         </w:rPr>
-        <w:t xml:space="preserve">  private List&lt;Aeronave&gt; listaAeronaves = new ArrayList&lt;Aeronave&gt;();</w:t>
-      </w:r>
-    </w:p>
-    <w:p>
-      <w:pPr>
-        <w:pStyle w:val="NormalWeb"/>
-        <w:shd w:val="clear" w:color="auto" w:fill="F2F2F2"/>
-        <w:spacing w:before="0" w:beforeAutospacing="0" w:after="0" w:afterAutospacing="0" w:line="240" w:lineRule="auto"/>
-        <w:jc w:val="left"/>
-      </w:pPr>
-      <w:r>
-        <w:rPr>
-          <w:rFonts w:ascii="Courier New" w:hAnsi="Courier New" w:cs="Courier New"/>
-          <w:color w:val="262626"/>
-          <w:sz w:val="14"/>
-          <w:szCs w:val="14"/>
-        </w:rPr>
-        <w:t xml:space="preserve">  private Queue&lt;Aeronave&gt; colaEspera = new LinkedList&lt;Aeronave&gt;();</w:t>
-      </w:r>
-    </w:p>
-    <w:p>
-      <w:pPr>
-        <w:pStyle w:val="NormalWeb"/>
-        <w:shd w:val="clear" w:color="auto" w:fill="F2F2F2"/>
-        <w:spacing w:before="0" w:beforeAutospacing="0" w:after="0" w:afterAutospacing="0" w:line="240" w:lineRule="auto"/>
-        <w:jc w:val="left"/>
-      </w:pPr>
-      <w:r>
-        <w:rPr>
-          <w:rFonts w:ascii="Courier New" w:hAnsi="Courier New" w:cs="Courier New"/>
-          <w:color w:val="262626"/>
-          <w:sz w:val="14"/>
-          <w:szCs w:val="14"/>
-        </w:rPr>
-        <w:t xml:space="preserve">  private Aeronave aeronaveEnPista = null;</w:t>
+        <w:t xml:space="preserve">    if (aeronaveEnPista == null) {</w:t>
+      </w:r>
+    </w:p>
+    <w:p>
+      <w:pPr>
+        <w:pStyle w:val="NormalWeb"/>
+        <w:shd w:val="clear" w:color="auto" w:fill="F2F2F2"/>
+        <w:spacing w:before="0" w:beforeAutospacing="0" w:after="0" w:afterAutospacing="0" w:line="240" w:lineRule="auto"/>
+        <w:jc w:val="left"/>
+      </w:pPr>
+      <w:r>
+        <w:rPr>
+          <w:rFonts w:ascii="Courier New" w:hAnsi="Courier New" w:cs="Courier New"/>
+          <w:color w:val="262626"/>
+          <w:sz w:val="14"/>
+          <w:szCs w:val="14"/>
+        </w:rPr>
+        <w:t xml:space="preserve">      autorizar(aeronave);</w:t>
+      </w:r>
+    </w:p>
+    <w:p>
+      <w:pPr>
+        <w:pStyle w:val="NormalWeb"/>
+        <w:shd w:val="clear" w:color="auto" w:fill="F2F2F2"/>
+        <w:spacing w:before="0" w:beforeAutospacing="0" w:after="0" w:afterAutospacing="0" w:line="240" w:lineRule="auto"/>
+        <w:jc w:val="left"/>
+      </w:pPr>
+      <w:r>
+        <w:rPr>
+          <w:rFonts w:ascii="Courier New" w:hAnsi="Courier New" w:cs="Courier New"/>
+          <w:color w:val="262626"/>
+          <w:sz w:val="14"/>
+          <w:szCs w:val="14"/>
+        </w:rPr>
+        <w:t xml:space="preserve">    } else if (aeronave.esPrioritaria()) {</w:t>
+      </w:r>
+    </w:p>
+    <w:p>
+      <w:pPr>
+        <w:pStyle w:val="NormalWeb"/>
+        <w:shd w:val="clear" w:color="auto" w:fill="F2F2F2"/>
+        <w:spacing w:before="0" w:beforeAutospacing="0" w:after="0" w:afterAutospacing="0" w:line="240" w:lineRule="auto"/>
+        <w:jc w:val="left"/>
+      </w:pPr>
+      <w:r>
+        <w:rPr>
+          <w:rFonts w:ascii="Courier New" w:hAnsi="Courier New" w:cs="Courier New"/>
+          <w:color w:val="262626"/>
+          <w:sz w:val="14"/>
+          <w:szCs w:val="14"/>
+        </w:rPr>
+        <w:t xml:space="preserve">      colaPrioritaria.add(aeronave);</w:t>
+      </w:r>
+    </w:p>
+    <w:p>
+      <w:pPr>
+        <w:pStyle w:val="NormalWeb"/>
+        <w:shd w:val="clear" w:color="auto" w:fill="F2F2F2"/>
+        <w:spacing w:before="0" w:beforeAutospacing="0" w:after="0" w:afterAutospacing="0" w:line="240" w:lineRule="auto"/>
+        <w:jc w:val="left"/>
+      </w:pPr>
+      <w:r>
+        <w:rPr>
+          <w:rFonts w:ascii="Courier New" w:hAnsi="Courier New" w:cs="Courier New"/>
+          <w:color w:val="262626"/>
+          <w:sz w:val="14"/>
+          <w:szCs w:val="14"/>
+        </w:rPr>
+        <w:t xml:space="preserve">      System.out.println("[TORRE] Vuelo prioritario " + aeronave.getIdentificador()</w:t>
+      </w:r>
+    </w:p>
+    <w:p>
+      <w:pPr>
+        <w:pStyle w:val="NormalWeb"/>
+        <w:shd w:val="clear" w:color="auto" w:fill="F2F2F2"/>
+        <w:spacing w:before="0" w:beforeAutospacing="0" w:after="0" w:afterAutospacing="0" w:line="240" w:lineRule="auto"/>
+        <w:jc w:val="left"/>
+      </w:pPr>
+      <w:r>
+        <w:rPr>
+          <w:rFonts w:ascii="Courier New" w:hAnsi="Courier New" w:cs="Courier New"/>
+          <w:color w:val="262626"/>
+          <w:sz w:val="14"/>
+          <w:szCs w:val="14"/>
+        </w:rPr>
+        <w:t xml:space="preserve">          + ": pasa delante de los vuelos regulares en espera.");</w:t>
+      </w:r>
+    </w:p>
+    <w:p>
+      <w:pPr>
+        <w:pStyle w:val="NormalWeb"/>
+        <w:shd w:val="clear" w:color="auto" w:fill="F2F2F2"/>
+        <w:spacing w:before="0" w:beforeAutospacing="0" w:after="0" w:afterAutospacing="0" w:line="240" w:lineRule="auto"/>
+        <w:jc w:val="left"/>
+      </w:pPr>
+      <w:r>
+        <w:rPr>
+          <w:rFonts w:ascii="Courier New" w:hAnsi="Courier New" w:cs="Courier New"/>
+          <w:color w:val="262626"/>
+          <w:sz w:val="14"/>
+          <w:szCs w:val="14"/>
+        </w:rPr>
+        <w:t xml:space="preserve">      aeronave.recibirEspera(colaPrioritaria.size());</w:t>
+      </w:r>
+    </w:p>
+    <w:p>
+      <w:pPr>
+        <w:pStyle w:val="NormalWeb"/>
+        <w:shd w:val="clear" w:color="auto" w:fill="F2F2F2"/>
+        <w:spacing w:before="0" w:beforeAutospacing="0" w:after="0" w:afterAutospacing="0" w:line="240" w:lineRule="auto"/>
+        <w:jc w:val="left"/>
+      </w:pPr>
+      <w:r>
+        <w:rPr>
+          <w:rFonts w:ascii="Courier New" w:hAnsi="Courier New" w:cs="Courier New"/>
+          <w:color w:val="262626"/>
+          <w:sz w:val="14"/>
+          <w:szCs w:val="14"/>
+        </w:rPr>
+        <w:t xml:space="preserve">      // Los vuelos regulares retroceden un puesto; la torre se lo comunica a cada uno.</w:t>
+      </w:r>
+    </w:p>
+    <w:p>
+      <w:pPr>
+        <w:pStyle w:val="NormalWeb"/>
+        <w:shd w:val="clear" w:color="auto" w:fill="F2F2F2"/>
+        <w:spacing w:before="0" w:beforeAutospacing="0" w:after="0" w:afterAutospacing="0" w:line="240" w:lineRule="auto"/>
+        <w:jc w:val="left"/>
+      </w:pPr>
+      <w:r>
+        <w:rPr>
+          <w:rFonts w:ascii="Courier New" w:hAnsi="Courier New" w:cs="Courier New"/>
+          <w:color w:val="262626"/>
+          <w:sz w:val="14"/>
+          <w:szCs w:val="14"/>
+        </w:rPr>
+        <w:t xml:space="preserve">      notificarPosiciones(colaEspera, colaPrioritaria.size());</w:t>
+      </w:r>
+    </w:p>
+    <w:p>
+      <w:pPr>
+        <w:pStyle w:val="NormalWeb"/>
+        <w:shd w:val="clear" w:color="auto" w:fill="F2F2F2"/>
+        <w:spacing w:before="0" w:beforeAutospacing="0" w:after="0" w:afterAutospacing="0" w:line="240" w:lineRule="auto"/>
+        <w:jc w:val="left"/>
+      </w:pPr>
+      <w:r>
+        <w:rPr>
+          <w:rFonts w:ascii="Courier New" w:hAnsi="Courier New" w:cs="Courier New"/>
+          <w:color w:val="262626"/>
+          <w:sz w:val="14"/>
+          <w:szCs w:val="14"/>
+        </w:rPr>
+        <w:t xml:space="preserve">    } else {</w:t>
+      </w:r>
+    </w:p>
+    <w:p>
+      <w:pPr>
+        <w:pStyle w:val="NormalWeb"/>
+        <w:shd w:val="clear" w:color="auto" w:fill="F2F2F2"/>
+        <w:spacing w:before="0" w:beforeAutospacing="0" w:after="0" w:afterAutospacing="0" w:line="240" w:lineRule="auto"/>
+        <w:jc w:val="left"/>
+      </w:pPr>
+      <w:r>
+        <w:rPr>
+          <w:rFonts w:ascii="Courier New" w:hAnsi="Courier New" w:cs="Courier New"/>
+          <w:color w:val="262626"/>
+          <w:sz w:val="14"/>
+          <w:szCs w:val="14"/>
+        </w:rPr>
+        <w:t xml:space="preserve">      colaEspera.add(aeronave);</w:t>
+      </w:r>
+    </w:p>
+    <w:p>
+      <w:pPr>
+        <w:pStyle w:val="NormalWeb"/>
+        <w:shd w:val="clear" w:color="auto" w:fill="F2F2F2"/>
+        <w:spacing w:before="0" w:beforeAutospacing="0" w:after="0" w:afterAutospacing="0" w:line="240" w:lineRule="auto"/>
+        <w:jc w:val="left"/>
+      </w:pPr>
+      <w:r>
+        <w:rPr>
+          <w:rFonts w:ascii="Courier New" w:hAnsi="Courier New" w:cs="Courier New"/>
+          <w:color w:val="262626"/>
+          <w:sz w:val="14"/>
+          <w:szCs w:val="14"/>
+        </w:rPr>
+        <w:t xml:space="preserve">      System.out.println("[TORRE] Pista ocupada actualmente por [" + aeronaveEnPista.getIdentificador() + "]. "</w:t>
+      </w:r>
+    </w:p>
+    <w:p>
+      <w:pPr>
+        <w:pStyle w:val="NormalWeb"/>
+        <w:shd w:val="clear" w:color="auto" w:fill="F2F2F2"/>
+        <w:spacing w:before="0" w:beforeAutospacing="0" w:after="0" w:afterAutospacing="0" w:line="240" w:lineRule="auto"/>
+        <w:jc w:val="left"/>
+      </w:pPr>
+      <w:r>
+        <w:rPr>
+          <w:rFonts w:ascii="Courier New" w:hAnsi="Courier New" w:cs="Courier New"/>
+          <w:color w:val="262626"/>
+          <w:sz w:val="14"/>
+          <w:szCs w:val="14"/>
+        </w:rPr>
+        <w:t xml:space="preserve">          + aeronave.getIdentificador() + ", mantenga el patrón de espera.");</w:t>
+      </w:r>
+    </w:p>
+    <w:p>
+      <w:pPr>
+        <w:pStyle w:val="NormalWeb"/>
+        <w:shd w:val="clear" w:color="auto" w:fill="F2F2F2"/>
+        <w:spacing w:before="0" w:beforeAutospacing="0" w:after="0" w:afterAutospacing="0" w:line="240" w:lineRule="auto"/>
+        <w:jc w:val="left"/>
+      </w:pPr>
+      <w:r>
+        <w:rPr>
+          <w:rFonts w:ascii="Courier New" w:hAnsi="Courier New" w:cs="Courier New"/>
+          <w:color w:val="262626"/>
+          <w:sz w:val="14"/>
+          <w:szCs w:val="14"/>
+        </w:rPr>
+        <w:t xml:space="preserve">      aeronave.recibirEspera(colaPrioritaria.size() + colaEspera.size());</w:t>
+      </w:r>
+    </w:p>
+    <w:p>
+      <w:pPr>
+        <w:pStyle w:val="NormalWeb"/>
+        <w:shd w:val="clear" w:color="auto" w:fill="F2F2F2"/>
+        <w:spacing w:before="0" w:beforeAutospacing="0" w:after="0" w:afterAutospacing="0" w:line="240" w:lineRule="auto"/>
+        <w:jc w:val="left"/>
+      </w:pPr>
+      <w:r>
+        <w:rPr>
+          <w:rFonts w:ascii="Courier New" w:hAnsi="Courier New" w:cs="Courier New"/>
+          <w:color w:val="262626"/>
+          <w:sz w:val="14"/>
+          <w:szCs w:val="14"/>
+        </w:rPr>
+        <w:t xml:space="preserve">    }</w:t>
+      </w:r>
+    </w:p>
+    <w:p>
+      <w:pPr>
+        <w:pStyle w:val="NormalWeb"/>
+        <w:shd w:val="clear" w:color="auto" w:fill="F2F2F2"/>
+        <w:spacing w:before="0" w:beforeAutospacing="0" w:after="0" w:afterAutospacing="0" w:line="240" w:lineRule="auto"/>
+        <w:jc w:val="left"/>
+      </w:pPr>
+      <w:r>
+        <w:rPr>
+          <w:rFonts w:ascii="Courier New" w:hAnsi="Courier New" w:cs="Courier New"/>
+          <w:color w:val="262626"/>
+          <w:sz w:val="14"/>
+          <w:szCs w:val="14"/>
+        </w:rPr>
+        <w:t xml:space="preserve">  }</w:t>
       </w:r>
     </w:p>
     <w:p>
@@ -1866,41 +2387,126 @@
           <w:sz w:val="14"/>
           <w:szCs w:val="14"/>
         </w:rPr>
-        <w:t xml:space="preserve">  public void registrarAeronave(Aeronave aeronave) {</w:t>
-      </w:r>
-    </w:p>
-    <w:p>
-      <w:pPr>
-        <w:pStyle w:val="NormalWeb"/>
-        <w:shd w:val="clear" w:color="auto" w:fill="F2F2F2"/>
-        <w:spacing w:before="0" w:beforeAutospacing="0" w:after="0" w:afterAutospacing="0" w:line="240" w:lineRule="auto"/>
-        <w:jc w:val="left"/>
-      </w:pPr>
-      <w:r>
-        <w:rPr>
-          <w:rFonts w:ascii="Courier New" w:hAnsi="Courier New" w:cs="Courier New"/>
-          <w:color w:val="262626"/>
-          <w:sz w:val="14"/>
-          <w:szCs w:val="14"/>
-        </w:rPr>
-        <w:t xml:space="preserve">    listaAeronaves.add(aeronave);</w:t>
-      </w:r>
-    </w:p>
-    <w:p>
-      <w:pPr>
-        <w:pStyle w:val="NormalWeb"/>
-        <w:shd w:val="clear" w:color="auto" w:fill="F2F2F2"/>
-        <w:spacing w:before="0" w:beforeAutospacing="0" w:after="0" w:afterAutospacing="0" w:line="240" w:lineRule="auto"/>
-        <w:jc w:val="left"/>
-      </w:pPr>
-      <w:r>
-        <w:rPr>
-          <w:rFonts w:ascii="Courier New" w:hAnsi="Courier New" w:cs="Courier New"/>
-          <w:color w:val="262626"/>
-          <w:sz w:val="14"/>
-          <w:szCs w:val="14"/>
-        </w:rPr>
-        <w:t xml:space="preserve">  }</w:t>
+        <w:t xml:space="preserve">  public void liberarPista(Aeronave aeronave) {</w:t>
+      </w:r>
+    </w:p>
+    <w:p>
+      <w:pPr>
+        <w:pStyle w:val="NormalWeb"/>
+        <w:shd w:val="clear" w:color="auto" w:fill="F2F2F2"/>
+        <w:spacing w:before="0" w:beforeAutospacing="0" w:after="0" w:afterAutospacing="0" w:line="240" w:lineRule="auto"/>
+        <w:jc w:val="left"/>
+      </w:pPr>
+      <w:r>
+        <w:rPr>
+          <w:rFonts w:ascii="Courier New" w:hAnsi="Courier New" w:cs="Courier New"/>
+          <w:color w:val="262626"/>
+          <w:sz w:val="14"/>
+          <w:szCs w:val="14"/>
+        </w:rPr>
+        <w:t xml:space="preserve">    if (aeronaveEnPista != aeronave) {</w:t>
+      </w:r>
+    </w:p>
+    <w:p>
+      <w:pPr>
+        <w:pStyle w:val="NormalWeb"/>
+        <w:shd w:val="clear" w:color="auto" w:fill="F2F2F2"/>
+        <w:spacing w:before="0" w:beforeAutospacing="0" w:after="0" w:afterAutospacing="0" w:line="240" w:lineRule="auto"/>
+        <w:jc w:val="left"/>
+      </w:pPr>
+      <w:r>
+        <w:rPr>
+          <w:rFonts w:ascii="Courier New" w:hAnsi="Courier New" w:cs="Courier New"/>
+          <w:color w:val="262626"/>
+          <w:sz w:val="14"/>
+          <w:szCs w:val="14"/>
+        </w:rPr>
+        <w:t xml:space="preserve">      System.out.println("[TORRE AVISO] La aeronave " + aeronave.getIdentificador()</w:t>
+      </w:r>
+    </w:p>
+    <w:p>
+      <w:pPr>
+        <w:pStyle w:val="NormalWeb"/>
+        <w:shd w:val="clear" w:color="auto" w:fill="F2F2F2"/>
+        <w:spacing w:before="0" w:beforeAutospacing="0" w:after="0" w:afterAutospacing="0" w:line="240" w:lineRule="auto"/>
+        <w:jc w:val="left"/>
+      </w:pPr>
+      <w:r>
+        <w:rPr>
+          <w:rFonts w:ascii="Courier New" w:hAnsi="Courier New" w:cs="Courier New"/>
+          <w:color w:val="262626"/>
+          <w:sz w:val="14"/>
+          <w:szCs w:val="14"/>
+        </w:rPr>
+        <w:t xml:space="preserve">          + " intentó liberar la pista pero no estaba asignada a ella.");</w:t>
+      </w:r>
+    </w:p>
+    <w:p>
+      <w:pPr>
+        <w:pStyle w:val="NormalWeb"/>
+        <w:shd w:val="clear" w:color="auto" w:fill="F2F2F2"/>
+        <w:spacing w:before="0" w:beforeAutospacing="0" w:after="0" w:afterAutospacing="0" w:line="240" w:lineRule="auto"/>
+        <w:jc w:val="left"/>
+      </w:pPr>
+      <w:r>
+        <w:rPr>
+          <w:rFonts w:ascii="Courier New" w:hAnsi="Courier New" w:cs="Courier New"/>
+          <w:color w:val="262626"/>
+          <w:sz w:val="14"/>
+          <w:szCs w:val="14"/>
+        </w:rPr>
+        <w:t xml:space="preserve">      return;</w:t>
+      </w:r>
+    </w:p>
+    <w:p>
+      <w:pPr>
+        <w:pStyle w:val="NormalWeb"/>
+        <w:shd w:val="clear" w:color="auto" w:fill="F2F2F2"/>
+        <w:spacing w:before="0" w:beforeAutospacing="0" w:after="0" w:afterAutospacing="0" w:line="240" w:lineRule="auto"/>
+        <w:jc w:val="left"/>
+      </w:pPr>
+      <w:r>
+        <w:rPr>
+          <w:rFonts w:ascii="Courier New" w:hAnsi="Courier New" w:cs="Courier New"/>
+          <w:color w:val="262626"/>
+          <w:sz w:val="14"/>
+          <w:szCs w:val="14"/>
+        </w:rPr>
+        <w:t xml:space="preserve">    }</w:t>
+      </w:r>
+    </w:p>
+    <w:p>
+      <w:pPr>
+        <w:pStyle w:val="NormalWeb"/>
+        <w:shd w:val="clear" w:color="auto" w:fill="F2F2F2"/>
+        <w:spacing w:before="0" w:beforeAutospacing="0" w:after="0" w:afterAutospacing="0" w:line="240" w:lineRule="auto"/>
+        <w:jc w:val="left"/>
+      </w:pPr>
+      <w:r>
+        <w:rPr>
+          <w:rFonts w:ascii="Courier New" w:hAnsi="Courier New" w:cs="Courier New"/>
+          <w:color w:val="262626"/>
+          <w:sz w:val="14"/>
+          <w:szCs w:val="14"/>
+        </w:rPr>
+        <w:t xml:space="preserve">    System.out.println("[TORRE] La aeronave " + aeronave.getIdentificador() + " ha liberado la pista.");</w:t>
+      </w:r>
+    </w:p>
+    <w:p>
+      <w:pPr>
+        <w:pStyle w:val="NormalWeb"/>
+        <w:shd w:val="clear" w:color="auto" w:fill="F2F2F2"/>
+        <w:spacing w:before="0" w:beforeAutospacing="0" w:after="0" w:afterAutospacing="0" w:line="240" w:lineRule="auto"/>
+        <w:jc w:val="left"/>
+      </w:pPr>
+      <w:r>
+        <w:rPr>
+          <w:rFonts w:ascii="Courier New" w:hAnsi="Courier New" w:cs="Courier New"/>
+          <w:color w:val="262626"/>
+          <w:sz w:val="14"/>
+          <w:szCs w:val="14"/>
+        </w:rPr>
+        <w:t xml:space="preserve">    aeronaveEnPista = null;</w:t>
       </w:r>
     </w:p>
     <w:p>
@@ -1934,109 +2540,41 @@
           <w:sz w:val="14"/>
           <w:szCs w:val="14"/>
         </w:rPr>
-        <w:t xml:space="preserve">  @Override</w:t>
-      </w:r>
-    </w:p>
-    <w:p>
-      <w:pPr>
-        <w:pStyle w:val="NormalWeb"/>
-        <w:shd w:val="clear" w:color="auto" w:fill="F2F2F2"/>
-        <w:spacing w:before="0" w:beforeAutospacing="0" w:after="0" w:afterAutospacing="0" w:line="240" w:lineRule="auto"/>
-        <w:jc w:val="left"/>
-      </w:pPr>
-      <w:r>
-        <w:rPr>
-          <w:rFonts w:ascii="Courier New" w:hAnsi="Courier New" w:cs="Courier New"/>
-          <w:color w:val="262626"/>
-          <w:sz w:val="14"/>
-          <w:szCs w:val="14"/>
-        </w:rPr>
-        <w:t xml:space="preserve">  public void solicitarAterrizaje(Aeronave aeronave) {</w:t>
-      </w:r>
-    </w:p>
-    <w:p>
-      <w:pPr>
-        <w:pStyle w:val="NormalWeb"/>
-        <w:shd w:val="clear" w:color="auto" w:fill="F2F2F2"/>
-        <w:spacing w:before="0" w:beforeAutospacing="0" w:after="0" w:afterAutospacing="0" w:line="240" w:lineRule="auto"/>
-        <w:jc w:val="left"/>
-      </w:pPr>
-      <w:r>
-        <w:rPr>
-          <w:rFonts w:ascii="Courier New" w:hAnsi="Courier New" w:cs="Courier New"/>
-          <w:color w:val="262626"/>
-          <w:sz w:val="14"/>
-          <w:szCs w:val="14"/>
-        </w:rPr>
-        <w:t xml:space="preserve">    System.out.println("\n[TORRE] Solicitud recibida de la aeronave: " + aeronave.getIdentificador());</w:t>
-      </w:r>
-    </w:p>
-    <w:p>
-      <w:pPr>
-        <w:pStyle w:val="NormalWeb"/>
-        <w:shd w:val="clear" w:color="auto" w:fill="F2F2F2"/>
-        <w:spacing w:before="0" w:beforeAutospacing="0" w:after="0" w:afterAutospacing="0" w:line="240" w:lineRule="auto"/>
-        <w:jc w:val="left"/>
-      </w:pPr>
-      <w:r>
-        <w:rPr>
-          <w:rFonts w:ascii="Courier New" w:hAnsi="Courier New" w:cs="Courier New"/>
-          <w:color w:val="262626"/>
-          <w:sz w:val="14"/>
-          <w:szCs w:val="14"/>
-        </w:rPr>
-        <w:t xml:space="preserve"> </w:t>
-      </w:r>
-    </w:p>
-    <w:p>
-      <w:pPr>
-        <w:pStyle w:val="NormalWeb"/>
-        <w:shd w:val="clear" w:color="auto" w:fill="F2F2F2"/>
-        <w:spacing w:before="0" w:beforeAutospacing="0" w:after="0" w:afterAutospacing="0" w:line="240" w:lineRule="auto"/>
-        <w:jc w:val="left"/>
-      </w:pPr>
-      <w:r>
-        <w:rPr>
-          <w:rFonts w:ascii="Courier New" w:hAnsi="Courier New" w:cs="Courier New"/>
-          <w:color w:val="262626"/>
-          <w:sz w:val="14"/>
-          <w:szCs w:val="14"/>
-        </w:rPr>
-        <w:t xml:space="preserve">    if (!listaAeronaves.contains(aeronave)) {</w:t>
-      </w:r>
-    </w:p>
-    <w:p>
-      <w:pPr>
-        <w:pStyle w:val="NormalWeb"/>
-        <w:shd w:val="clear" w:color="auto" w:fill="F2F2F2"/>
-        <w:spacing w:before="0" w:beforeAutospacing="0" w:after="0" w:afterAutospacing="0" w:line="240" w:lineRule="auto"/>
-        <w:jc w:val="left"/>
-      </w:pPr>
-      <w:r>
-        <w:rPr>
-          <w:rFonts w:ascii="Courier New" w:hAnsi="Courier New" w:cs="Courier New"/>
-          <w:color w:val="262626"/>
-          <w:sz w:val="14"/>
-          <w:szCs w:val="14"/>
-        </w:rPr>
-        <w:t xml:space="preserve">      System.out.println("[TORRE AVISO] La aeronave " + aeronave.getIdentificador() + " no está registrada.");</w:t>
-      </w:r>
-    </w:p>
-    <w:p>
-      <w:pPr>
-        <w:pStyle w:val="NormalWeb"/>
-        <w:shd w:val="clear" w:color="auto" w:fill="F2F2F2"/>
-        <w:spacing w:before="0" w:beforeAutospacing="0" w:after="0" w:afterAutospacing="0" w:line="240" w:lineRule="auto"/>
-        <w:jc w:val="left"/>
-      </w:pPr>
-      <w:r>
-        <w:rPr>
-          <w:rFonts w:ascii="Courier New" w:hAnsi="Courier New" w:cs="Courier New"/>
-          <w:color w:val="262626"/>
-          <w:sz w:val="14"/>
-          <w:szCs w:val="14"/>
-        </w:rPr>
-        <w:t xml:space="preserve">      return;</w:t>
+        <w:t xml:space="preserve">    Aeronave siguiente = colaPrioritaria.poll();</w:t>
+      </w:r>
+    </w:p>
+    <w:p>
+      <w:pPr>
+        <w:pStyle w:val="NormalWeb"/>
+        <w:shd w:val="clear" w:color="auto" w:fill="F2F2F2"/>
+        <w:spacing w:before="0" w:beforeAutospacing="0" w:after="0" w:afterAutospacing="0" w:line="240" w:lineRule="auto"/>
+        <w:jc w:val="left"/>
+      </w:pPr>
+      <w:r>
+        <w:rPr>
+          <w:rFonts w:ascii="Courier New" w:hAnsi="Courier New" w:cs="Courier New"/>
+          <w:color w:val="262626"/>
+          <w:sz w:val="14"/>
+          <w:szCs w:val="14"/>
+        </w:rPr>
+        <w:t xml:space="preserve">    if (siguiente == null) {</w:t>
+      </w:r>
+    </w:p>
+    <w:p>
+      <w:pPr>
+        <w:pStyle w:val="NormalWeb"/>
+        <w:shd w:val="clear" w:color="auto" w:fill="F2F2F2"/>
+        <w:spacing w:before="0" w:beforeAutospacing="0" w:after="0" w:afterAutospacing="0" w:line="240" w:lineRule="auto"/>
+        <w:jc w:val="left"/>
+      </w:pPr>
+      <w:r>
+        <w:rPr>
+          <w:rFonts w:ascii="Courier New" w:hAnsi="Courier New" w:cs="Courier New"/>
+          <w:color w:val="262626"/>
+          <w:sz w:val="14"/>
+          <w:szCs w:val="14"/>
+        </w:rPr>
+        <w:t xml:space="preserve">      siguiente = colaEspera.poll();</w:t>
       </w:r>
     </w:p>
     <w:p>
@@ -2070,58 +2608,24 @@
           <w:sz w:val="14"/>
           <w:szCs w:val="14"/>
         </w:rPr>
-        <w:t xml:space="preserve">    if (aeronave == aeronaveEnPista || colaEspera.contains(aeronave)) {</w:t>
-      </w:r>
-    </w:p>
-    <w:p>
-      <w:pPr>
-        <w:pStyle w:val="NormalWeb"/>
-        <w:shd w:val="clear" w:color="auto" w:fill="F2F2F2"/>
-        <w:spacing w:before="0" w:beforeAutospacing="0" w:after="0" w:afterAutospacing="0" w:line="240" w:lineRule="auto"/>
-        <w:jc w:val="left"/>
-      </w:pPr>
-      <w:r>
-        <w:rPr>
-          <w:rFonts w:ascii="Courier New" w:hAnsi="Courier New" w:cs="Courier New"/>
-          <w:color w:val="262626"/>
-          <w:sz w:val="14"/>
-          <w:szCs w:val="14"/>
-        </w:rPr>
-        <w:t xml:space="preserve">      System.out.println("[TORRE AVISO] La aeronave " + aeronave.getIdentificador()</w:t>
-      </w:r>
-    </w:p>
-    <w:p>
-      <w:pPr>
-        <w:pStyle w:val="NormalWeb"/>
-        <w:shd w:val="clear" w:color="auto" w:fill="F2F2F2"/>
-        <w:spacing w:before="0" w:beforeAutospacing="0" w:after="0" w:afterAutospacing="0" w:line="240" w:lineRule="auto"/>
-        <w:jc w:val="left"/>
-      </w:pPr>
-      <w:r>
-        <w:rPr>
-          <w:rFonts w:ascii="Courier New" w:hAnsi="Courier New" w:cs="Courier New"/>
-          <w:color w:val="262626"/>
-          <w:sz w:val="14"/>
-          <w:szCs w:val="14"/>
-        </w:rPr>
-        <w:t xml:space="preserve">          + " ya tiene la pista asignada o está en la cola de espera.");</w:t>
-      </w:r>
-    </w:p>
-    <w:p>
-      <w:pPr>
-        <w:pStyle w:val="NormalWeb"/>
-        <w:shd w:val="clear" w:color="auto" w:fill="F2F2F2"/>
-        <w:spacing w:before="0" w:beforeAutospacing="0" w:after="0" w:afterAutospacing="0" w:line="240" w:lineRule="auto"/>
-        <w:jc w:val="left"/>
-      </w:pPr>
-      <w:r>
-        <w:rPr>
-          <w:rFonts w:ascii="Courier New" w:hAnsi="Courier New" w:cs="Courier New"/>
-          <w:color w:val="262626"/>
-          <w:sz w:val="14"/>
-          <w:szCs w:val="14"/>
-        </w:rPr>
-        <w:t xml:space="preserve">      return;</w:t>
+        <w:t xml:space="preserve">    if (siguiente != null) {</w:t>
+      </w:r>
+    </w:p>
+    <w:p>
+      <w:pPr>
+        <w:pStyle w:val="NormalWeb"/>
+        <w:shd w:val="clear" w:color="auto" w:fill="F2F2F2"/>
+        <w:spacing w:before="0" w:beforeAutospacing="0" w:after="0" w:afterAutospacing="0" w:line="240" w:lineRule="auto"/>
+        <w:jc w:val="left"/>
+      </w:pPr>
+      <w:r>
+        <w:rPr>
+          <w:rFonts w:ascii="Courier New" w:hAnsi="Courier New" w:cs="Courier New"/>
+          <w:color w:val="262626"/>
+          <w:sz w:val="14"/>
+          <w:szCs w:val="14"/>
+        </w:rPr>
+        <w:t xml:space="preserve">      autorizar(siguiente);</w:t>
       </w:r>
     </w:p>
     <w:p>
@@ -2144,534 +2648,6 @@
     <w:p>
       <w:pPr>
         <w:pStyle w:val="NormalWeb"/>
-        <w:shd w:val="clear" w:color="auto" w:fill="F2F2F2"/>
-        <w:spacing w:before="0" w:beforeAutospacing="0" w:after="0" w:afterAutospacing="0" w:line="240" w:lineRule="auto"/>
-        <w:jc w:val="left"/>
-      </w:pPr>
-      <w:r>
-        <w:rPr>
-          <w:rFonts w:ascii="Courier New" w:hAnsi="Courier New" w:cs="Courier New"/>
-          <w:color w:val="262626"/>
-          <w:sz w:val="14"/>
-          <w:szCs w:val="14"/>
-        </w:rPr>
-        <w:t xml:space="preserve"> </w:t>
-      </w:r>
-    </w:p>
-    <w:p>
-      <w:pPr>
-        <w:pStyle w:val="NormalWeb"/>
-        <w:shd w:val="clear" w:color="auto" w:fill="F2F2F2"/>
-        <w:spacing w:before="0" w:beforeAutospacing="0" w:after="0" w:afterAutospacing="0" w:line="240" w:lineRule="auto"/>
-        <w:jc w:val="left"/>
-      </w:pPr>
-      <w:r>
-        <w:rPr>
-          <w:rFonts w:ascii="Courier New" w:hAnsi="Courier New" w:cs="Courier New"/>
-          <w:color w:val="262626"/>
-          <w:sz w:val="14"/>
-          <w:szCs w:val="14"/>
-        </w:rPr>
-        <w:t xml:space="preserve">    if (aeronaveEnPista == null) {</w:t>
-      </w:r>
-    </w:p>
-    <w:p>
-      <w:pPr>
-        <w:pStyle w:val="NormalWeb"/>
-        <w:shd w:val="clear" w:color="auto" w:fill="F2F2F2"/>
-        <w:spacing w:before="0" w:beforeAutospacing="0" w:after="0" w:afterAutospacing="0" w:line="240" w:lineRule="auto"/>
-        <w:jc w:val="left"/>
-      </w:pPr>
-      <w:r>
-        <w:rPr>
-          <w:rFonts w:ascii="Courier New" w:hAnsi="Courier New" w:cs="Courier New"/>
-          <w:color w:val="262626"/>
-          <w:sz w:val="14"/>
-          <w:szCs w:val="14"/>
-        </w:rPr>
-        <w:t xml:space="preserve">      autorizar(aeronave);</w:t>
-      </w:r>
-    </w:p>
-    <w:p>
-      <w:pPr>
-        <w:pStyle w:val="NormalWeb"/>
-        <w:shd w:val="clear" w:color="auto" w:fill="F2F2F2"/>
-        <w:spacing w:before="0" w:beforeAutospacing="0" w:after="0" w:afterAutospacing="0" w:line="240" w:lineRule="auto"/>
-        <w:jc w:val="left"/>
-      </w:pPr>
-      <w:r>
-        <w:rPr>
-          <w:rFonts w:ascii="Courier New" w:hAnsi="Courier New" w:cs="Courier New"/>
-          <w:color w:val="262626"/>
-          <w:sz w:val="14"/>
-          <w:szCs w:val="14"/>
-        </w:rPr>
-        <w:t xml:space="preserve">    } else {</w:t>
-      </w:r>
-    </w:p>
-    <w:p>
-      <w:pPr>
-        <w:pStyle w:val="NormalWeb"/>
-        <w:shd w:val="clear" w:color="auto" w:fill="F2F2F2"/>
-        <w:spacing w:before="0" w:beforeAutospacing="0" w:after="0" w:afterAutospacing="0" w:line="240" w:lineRule="auto"/>
-        <w:jc w:val="left"/>
-      </w:pPr>
-      <w:r>
-        <w:rPr>
-          <w:rFonts w:ascii="Courier New" w:hAnsi="Courier New" w:cs="Courier New"/>
-          <w:color w:val="262626"/>
-          <w:sz w:val="14"/>
-          <w:szCs w:val="14"/>
-        </w:rPr>
-        <w:t xml:space="preserve">      colaEspera.add(aeronave);</w:t>
-      </w:r>
-    </w:p>
-    <w:p>
-      <w:pPr>
-        <w:pStyle w:val="NormalWeb"/>
-        <w:shd w:val="clear" w:color="auto" w:fill="F2F2F2"/>
-        <w:spacing w:before="0" w:beforeAutospacing="0" w:after="0" w:afterAutospacing="0" w:line="240" w:lineRule="auto"/>
-        <w:jc w:val="left"/>
-      </w:pPr>
-      <w:r>
-        <w:rPr>
-          <w:rFonts w:ascii="Courier New" w:hAnsi="Courier New" w:cs="Courier New"/>
-          <w:color w:val="262626"/>
-          <w:sz w:val="14"/>
-          <w:szCs w:val="14"/>
-        </w:rPr>
-        <w:t xml:space="preserve">      System.out.println("[TORRE] Pista ocupada actualmente por [" + aeronaveEnPista.getIdentificador() + "]. "</w:t>
-      </w:r>
-    </w:p>
-    <w:p>
-      <w:pPr>
-        <w:pStyle w:val="NormalWeb"/>
-        <w:shd w:val="clear" w:color="auto" w:fill="F2F2F2"/>
-        <w:spacing w:before="0" w:beforeAutospacing="0" w:after="0" w:afterAutospacing="0" w:line="240" w:lineRule="auto"/>
-        <w:jc w:val="left"/>
-      </w:pPr>
-      <w:r>
-        <w:rPr>
-          <w:rFonts w:ascii="Courier New" w:hAnsi="Courier New" w:cs="Courier New"/>
-          <w:color w:val="262626"/>
-          <w:sz w:val="14"/>
-          <w:szCs w:val="14"/>
-        </w:rPr>
-        <w:t xml:space="preserve">          + aeronave.getIdentificador() + ", mantenga el patrón de espera.");</w:t>
-      </w:r>
-    </w:p>
-    <w:p>
-      <w:pPr>
-        <w:pStyle w:val="NormalWeb"/>
-        <w:shd w:val="clear" w:color="auto" w:fill="F2F2F2"/>
-        <w:spacing w:before="0" w:beforeAutospacing="0" w:after="0" w:afterAutospacing="0" w:line="240" w:lineRule="auto"/>
-        <w:jc w:val="left"/>
-      </w:pPr>
-      <w:r>
-        <w:rPr>
-          <w:rFonts w:ascii="Courier New" w:hAnsi="Courier New" w:cs="Courier New"/>
-          <w:color w:val="262626"/>
-          <w:sz w:val="14"/>
-          <w:szCs w:val="14"/>
-        </w:rPr>
-        <w:t xml:space="preserve">      aeronave.recibirEspera(colaEspera.size());</w:t>
-      </w:r>
-    </w:p>
-    <w:p>
-      <w:pPr>
-        <w:pStyle w:val="NormalWeb"/>
-        <w:shd w:val="clear" w:color="auto" w:fill="F2F2F2"/>
-        <w:spacing w:before="0" w:beforeAutospacing="0" w:after="0" w:afterAutospacing="0" w:line="240" w:lineRule="auto"/>
-        <w:jc w:val="left"/>
-      </w:pPr>
-      <w:r>
-        <w:rPr>
-          <w:rFonts w:ascii="Courier New" w:hAnsi="Courier New" w:cs="Courier New"/>
-          <w:color w:val="262626"/>
-          <w:sz w:val="14"/>
-          <w:szCs w:val="14"/>
-        </w:rPr>
-        <w:t xml:space="preserve">    }</w:t>
-      </w:r>
-    </w:p>
-    <w:p>
-      <w:pPr>
-        <w:pStyle w:val="NormalWeb"/>
-        <w:shd w:val="clear" w:color="auto" w:fill="F2F2F2"/>
-        <w:spacing w:before="0" w:beforeAutospacing="0" w:after="0" w:afterAutospacing="0" w:line="240" w:lineRule="auto"/>
-        <w:jc w:val="left"/>
-      </w:pPr>
-      <w:r>
-        <w:rPr>
-          <w:rFonts w:ascii="Courier New" w:hAnsi="Courier New" w:cs="Courier New"/>
-          <w:color w:val="262626"/>
-          <w:sz w:val="14"/>
-          <w:szCs w:val="14"/>
-        </w:rPr>
-        <w:t xml:space="preserve">  }</w:t>
-      </w:r>
-    </w:p>
-    <w:p>
-      <w:pPr>
-        <w:pStyle w:val="NormalWeb"/>
-        <w:shd w:val="clear" w:color="auto" w:fill="F2F2F2"/>
-        <w:spacing w:before="0" w:beforeAutospacing="0" w:after="0" w:afterAutospacing="0" w:line="240" w:lineRule="auto"/>
-        <w:jc w:val="left"/>
-      </w:pPr>
-      <w:r>
-        <w:rPr>
-          <w:rFonts w:ascii="Courier New" w:hAnsi="Courier New" w:cs="Courier New"/>
-          <w:color w:val="262626"/>
-          <w:sz w:val="14"/>
-          <w:szCs w:val="14"/>
-        </w:rPr>
-        <w:t xml:space="preserve"> </w:t>
-      </w:r>
-    </w:p>
-    <w:p>
-      <w:pPr>
-        <w:pStyle w:val="NormalWeb"/>
-        <w:shd w:val="clear" w:color="auto" w:fill="F2F2F2"/>
-        <w:spacing w:before="0" w:beforeAutospacing="0" w:after="0" w:afterAutospacing="0" w:line="240" w:lineRule="auto"/>
-        <w:jc w:val="left"/>
-      </w:pPr>
-      <w:r>
-        <w:rPr>
-          <w:rFonts w:ascii="Courier New" w:hAnsi="Courier New" w:cs="Courier New"/>
-          <w:color w:val="262626"/>
-          <w:sz w:val="14"/>
-          <w:szCs w:val="14"/>
-        </w:rPr>
-        <w:t xml:space="preserve">  @Override</w:t>
-      </w:r>
-    </w:p>
-    <w:p>
-      <w:pPr>
-        <w:pStyle w:val="NormalWeb"/>
-        <w:shd w:val="clear" w:color="auto" w:fill="F2F2F2"/>
-        <w:spacing w:before="0" w:beforeAutospacing="0" w:after="0" w:afterAutospacing="0" w:line="240" w:lineRule="auto"/>
-        <w:jc w:val="left"/>
-      </w:pPr>
-      <w:r>
-        <w:rPr>
-          <w:rFonts w:ascii="Courier New" w:hAnsi="Courier New" w:cs="Courier New"/>
-          <w:color w:val="262626"/>
-          <w:sz w:val="14"/>
-          <w:szCs w:val="14"/>
-        </w:rPr>
-        <w:t xml:space="preserve">  public void liberarPista(Aeronave aeronave) {</w:t>
-      </w:r>
-    </w:p>
-    <w:p>
-      <w:pPr>
-        <w:pStyle w:val="NormalWeb"/>
-        <w:shd w:val="clear" w:color="auto" w:fill="F2F2F2"/>
-        <w:spacing w:before="0" w:beforeAutospacing="0" w:after="0" w:afterAutospacing="0" w:line="240" w:lineRule="auto"/>
-        <w:jc w:val="left"/>
-      </w:pPr>
-      <w:r>
-        <w:rPr>
-          <w:rFonts w:ascii="Courier New" w:hAnsi="Courier New" w:cs="Courier New"/>
-          <w:color w:val="262626"/>
-          <w:sz w:val="14"/>
-          <w:szCs w:val="14"/>
-        </w:rPr>
-        <w:t xml:space="preserve">    if (aeronaveEnPista == aeronave) {</w:t>
-      </w:r>
-    </w:p>
-    <w:p>
-      <w:pPr>
-        <w:pStyle w:val="NormalWeb"/>
-        <w:shd w:val="clear" w:color="auto" w:fill="F2F2F2"/>
-        <w:spacing w:before="0" w:beforeAutospacing="0" w:after="0" w:afterAutospacing="0" w:line="240" w:lineRule="auto"/>
-        <w:jc w:val="left"/>
-      </w:pPr>
-      <w:r>
-        <w:rPr>
-          <w:rFonts w:ascii="Courier New" w:hAnsi="Courier New" w:cs="Courier New"/>
-          <w:color w:val="262626"/>
-          <w:sz w:val="14"/>
-          <w:szCs w:val="14"/>
-        </w:rPr>
-        <w:t xml:space="preserve">      System.out.println("[TORRE] La aeronave " + aeronave.getIdentificador() + " ha liberado la pista.");</w:t>
-      </w:r>
-    </w:p>
-    <w:p>
-      <w:pPr>
-        <w:pStyle w:val="NormalWeb"/>
-        <w:shd w:val="clear" w:color="auto" w:fill="F2F2F2"/>
-        <w:spacing w:before="0" w:beforeAutospacing="0" w:after="0" w:afterAutospacing="0" w:line="240" w:lineRule="auto"/>
-        <w:jc w:val="left"/>
-      </w:pPr>
-      <w:r>
-        <w:rPr>
-          <w:rFonts w:ascii="Courier New" w:hAnsi="Courier New" w:cs="Courier New"/>
-          <w:color w:val="262626"/>
-          <w:sz w:val="14"/>
-          <w:szCs w:val="14"/>
-        </w:rPr>
-        <w:t xml:space="preserve">      aeronaveEnPista = null;</w:t>
-      </w:r>
-    </w:p>
-    <w:p>
-      <w:pPr>
-        <w:pStyle w:val="NormalWeb"/>
-        <w:shd w:val="clear" w:color="auto" w:fill="F2F2F2"/>
-        <w:spacing w:before="0" w:beforeAutospacing="0" w:after="0" w:afterAutospacing="0" w:line="240" w:lineRule="auto"/>
-        <w:jc w:val="left"/>
-      </w:pPr>
-      <w:r>
-        <w:rPr>
-          <w:rFonts w:ascii="Courier New" w:hAnsi="Courier New" w:cs="Courier New"/>
-          <w:color w:val="262626"/>
-          <w:sz w:val="14"/>
-          <w:szCs w:val="14"/>
-        </w:rPr>
-        <w:t xml:space="preserve"> </w:t>
-      </w:r>
-    </w:p>
-    <w:p>
-      <w:pPr>
-        <w:pStyle w:val="NormalWeb"/>
-        <w:shd w:val="clear" w:color="auto" w:fill="F2F2F2"/>
-        <w:spacing w:before="0" w:beforeAutospacing="0" w:after="0" w:afterAutospacing="0" w:line="240" w:lineRule="auto"/>
-        <w:jc w:val="left"/>
-      </w:pPr>
-      <w:r>
-        <w:rPr>
-          <w:rFonts w:ascii="Courier New" w:hAnsi="Courier New" w:cs="Courier New"/>
-          <w:color w:val="262626"/>
-          <w:sz w:val="14"/>
-          <w:szCs w:val="14"/>
-        </w:rPr>
-        <w:t xml:space="preserve">      Aeronave siguiente = colaEspera.poll();</w:t>
-      </w:r>
-    </w:p>
-    <w:p>
-      <w:pPr>
-        <w:pStyle w:val="NormalWeb"/>
-        <w:shd w:val="clear" w:color="auto" w:fill="F2F2F2"/>
-        <w:spacing w:before="0" w:beforeAutospacing="0" w:after="0" w:afterAutospacing="0" w:line="240" w:lineRule="auto"/>
-        <w:jc w:val="left"/>
-      </w:pPr>
-      <w:r>
-        <w:rPr>
-          <w:rFonts w:ascii="Courier New" w:hAnsi="Courier New" w:cs="Courier New"/>
-          <w:color w:val="262626"/>
-          <w:sz w:val="14"/>
-          <w:szCs w:val="14"/>
-        </w:rPr>
-        <w:t xml:space="preserve">      if (siguiente != null) {</w:t>
-      </w:r>
-    </w:p>
-    <w:p>
-      <w:pPr>
-        <w:pStyle w:val="NormalWeb"/>
-        <w:shd w:val="clear" w:color="auto" w:fill="F2F2F2"/>
-        <w:spacing w:before="0" w:beforeAutospacing="0" w:after="0" w:afterAutospacing="0" w:line="240" w:lineRule="auto"/>
-        <w:jc w:val="left"/>
-      </w:pPr>
-      <w:r>
-        <w:rPr>
-          <w:rFonts w:ascii="Courier New" w:hAnsi="Courier New" w:cs="Courier New"/>
-          <w:color w:val="262626"/>
-          <w:sz w:val="14"/>
-          <w:szCs w:val="14"/>
-        </w:rPr>
-        <w:t xml:space="preserve">        autorizar(siguiente);</w:t>
-      </w:r>
-    </w:p>
-    <w:p>
-      <w:pPr>
-        <w:pStyle w:val="NormalWeb"/>
-        <w:shd w:val="clear" w:color="auto" w:fill="F2F2F2"/>
-        <w:spacing w:before="0" w:beforeAutospacing="0" w:after="0" w:afterAutospacing="0" w:line="240" w:lineRule="auto"/>
-        <w:jc w:val="left"/>
-      </w:pPr>
-      <w:r>
-        <w:rPr>
-          <w:rFonts w:ascii="Courier New" w:hAnsi="Courier New" w:cs="Courier New"/>
-          <w:color w:val="262626"/>
-          <w:sz w:val="14"/>
-          <w:szCs w:val="14"/>
-        </w:rPr>
-        <w:t xml:space="preserve">      }</w:t>
-      </w:r>
-    </w:p>
-    <w:p>
-      <w:pPr>
-        <w:pStyle w:val="NormalWeb"/>
-        <w:shd w:val="clear" w:color="auto" w:fill="F2F2F2"/>
-        <w:spacing w:before="0" w:beforeAutospacing="0" w:after="0" w:afterAutospacing="0" w:line="240" w:lineRule="auto"/>
-        <w:jc w:val="left"/>
-      </w:pPr>
-      <w:r>
-        <w:rPr>
-          <w:rFonts w:ascii="Courier New" w:hAnsi="Courier New" w:cs="Courier New"/>
-          <w:color w:val="262626"/>
-          <w:sz w:val="14"/>
-          <w:szCs w:val="14"/>
-        </w:rPr>
-        <w:t xml:space="preserve">    } else {</w:t>
-      </w:r>
-    </w:p>
-    <w:p>
-      <w:pPr>
-        <w:pStyle w:val="NormalWeb"/>
-        <w:shd w:val="clear" w:color="auto" w:fill="F2F2F2"/>
-        <w:spacing w:before="0" w:beforeAutospacing="0" w:after="0" w:afterAutospacing="0" w:line="240" w:lineRule="auto"/>
-        <w:jc w:val="left"/>
-      </w:pPr>
-      <w:r>
-        <w:rPr>
-          <w:rFonts w:ascii="Courier New" w:hAnsi="Courier New" w:cs="Courier New"/>
-          <w:color w:val="262626"/>
-          <w:sz w:val="14"/>
-          <w:szCs w:val="14"/>
-        </w:rPr>
-        <w:t xml:space="preserve">      System.out.println("[TORRE AVISO] La aeronave " + aeronave.getIdentificador()</w:t>
-      </w:r>
-    </w:p>
-    <w:p>
-      <w:pPr>
-        <w:pStyle w:val="NormalWeb"/>
-        <w:shd w:val="clear" w:color="auto" w:fill="F2F2F2"/>
-        <w:spacing w:before="0" w:beforeAutospacing="0" w:after="0" w:afterAutospacing="0" w:line="240" w:lineRule="auto"/>
-        <w:jc w:val="left"/>
-      </w:pPr>
-      <w:r>
-        <w:rPr>
-          <w:rFonts w:ascii="Courier New" w:hAnsi="Courier New" w:cs="Courier New"/>
-          <w:color w:val="262626"/>
-          <w:sz w:val="14"/>
-          <w:szCs w:val="14"/>
-        </w:rPr>
-        <w:t xml:space="preserve">          + " intentó liberar la pista pero no estaba asignada a ella.");</w:t>
-      </w:r>
-    </w:p>
-    <w:p>
-      <w:pPr>
-        <w:pStyle w:val="NormalWeb"/>
-        <w:shd w:val="clear" w:color="auto" w:fill="F2F2F2"/>
-        <w:spacing w:before="0" w:beforeAutospacing="0" w:after="0" w:afterAutospacing="0" w:line="240" w:lineRule="auto"/>
-        <w:jc w:val="left"/>
-      </w:pPr>
-      <w:r>
-        <w:rPr>
-          <w:rFonts w:ascii="Courier New" w:hAnsi="Courier New" w:cs="Courier New"/>
-          <w:color w:val="262626"/>
-          <w:sz w:val="14"/>
-          <w:szCs w:val="14"/>
-        </w:rPr>
-        <w:t xml:space="preserve">    }</w:t>
-      </w:r>
-    </w:p>
-    <w:p>
-      <w:pPr>
-        <w:pStyle w:val="NormalWeb"/>
-        <w:shd w:val="clear" w:color="auto" w:fill="F2F2F2"/>
-        <w:spacing w:before="0" w:beforeAutospacing="0" w:after="0" w:afterAutospacing="0" w:line="240" w:lineRule="auto"/>
-        <w:jc w:val="left"/>
-      </w:pPr>
-      <w:r>
-        <w:rPr>
-          <w:rFonts w:ascii="Courier New" w:hAnsi="Courier New" w:cs="Courier New"/>
-          <w:color w:val="262626"/>
-          <w:sz w:val="14"/>
-          <w:szCs w:val="14"/>
-        </w:rPr>
-        <w:t xml:space="preserve">  }</w:t>
-      </w:r>
-    </w:p>
-    <w:p>
-      <w:pPr>
-        <w:pStyle w:val="NormalWeb"/>
-        <w:shd w:val="clear" w:color="auto" w:fill="F2F2F2"/>
-        <w:spacing w:before="0" w:beforeAutospacing="0" w:after="0" w:afterAutospacing="0" w:line="240" w:lineRule="auto"/>
-        <w:jc w:val="left"/>
-      </w:pPr>
-      <w:r>
-        <w:rPr>
-          <w:rFonts w:ascii="Courier New" w:hAnsi="Courier New" w:cs="Courier New"/>
-          <w:color w:val="262626"/>
-          <w:sz w:val="14"/>
-          <w:szCs w:val="14"/>
-        </w:rPr>
-        <w:t xml:space="preserve"> </w:t>
-      </w:r>
-    </w:p>
-    <w:p>
-      <w:pPr>
-        <w:pStyle w:val="NormalWeb"/>
-        <w:shd w:val="clear" w:color="auto" w:fill="F2F2F2"/>
-        <w:spacing w:before="0" w:beforeAutospacing="0" w:after="0" w:afterAutospacing="0" w:line="240" w:lineRule="auto"/>
-        <w:jc w:val="left"/>
-      </w:pPr>
-      <w:r>
-        <w:rPr>
-          <w:rFonts w:ascii="Courier New" w:hAnsi="Courier New" w:cs="Courier New"/>
-          <w:color w:val="262626"/>
-          <w:sz w:val="14"/>
-          <w:szCs w:val="14"/>
-        </w:rPr>
-        <w:t xml:space="preserve">  private void autorizar(Aeronave aeronave) {</w:t>
-      </w:r>
-    </w:p>
-    <w:p>
-      <w:pPr>
-        <w:pStyle w:val="NormalWeb"/>
-        <w:shd w:val="clear" w:color="auto" w:fill="F2F2F2"/>
-        <w:spacing w:before="0" w:beforeAutospacing="0" w:after="0" w:afterAutospacing="0" w:line="240" w:lineRule="auto"/>
-        <w:jc w:val="left"/>
-      </w:pPr>
-      <w:r>
-        <w:rPr>
-          <w:rFonts w:ascii="Courier New" w:hAnsi="Courier New" w:cs="Courier New"/>
-          <w:color w:val="262626"/>
-          <w:sz w:val="14"/>
-          <w:szCs w:val="14"/>
-        </w:rPr>
-        <w:t xml:space="preserve">    aeronaveEnPista = aeronave;</w:t>
-      </w:r>
-    </w:p>
-    <w:p>
-      <w:pPr>
-        <w:pStyle w:val="NormalWeb"/>
-        <w:shd w:val="clear" w:color="auto" w:fill="F2F2F2"/>
-        <w:spacing w:before="0" w:beforeAutospacing="0" w:after="0" w:afterAutospacing="0" w:line="240" w:lineRule="auto"/>
-        <w:jc w:val="left"/>
-      </w:pPr>
-      <w:r>
-        <w:rPr>
-          <w:rFonts w:ascii="Courier New" w:hAnsi="Courier New" w:cs="Courier New"/>
-          <w:color w:val="262626"/>
-          <w:sz w:val="14"/>
-          <w:szCs w:val="14"/>
-        </w:rPr>
-        <w:t xml:space="preserve">    System.out.println("[TORRE] Autorizado el aterrizaje para: " + aeronave.getIdentificador() + ". Pista ocupada.");</w:t>
-      </w:r>
-    </w:p>
-    <w:p>
-      <w:pPr>
-        <w:pStyle w:val="NormalWeb"/>
-        <w:shd w:val="clear" w:color="auto" w:fill="F2F2F2"/>
-        <w:spacing w:before="0" w:beforeAutospacing="0" w:after="0" w:afterAutospacing="0" w:line="240" w:lineRule="auto"/>
-        <w:jc w:val="left"/>
-      </w:pPr>
-      <w:r>
-        <w:rPr>
-          <w:rFonts w:ascii="Courier New" w:hAnsi="Courier New" w:cs="Courier New"/>
-          <w:color w:val="262626"/>
-          <w:sz w:val="14"/>
-          <w:szCs w:val="14"/>
-        </w:rPr>
-        <w:t xml:space="preserve">    aeronave.recibirAutorizacion();</w:t>
-      </w:r>
-    </w:p>
-    <w:p>
-      <w:pPr>
-        <w:pStyle w:val="NormalWeb"/>
-        <w:keepNext/>
         <w:shd w:val="clear" w:color="auto" w:fill="F2F2F2"/>
         <w:spacing w:before="0" w:beforeAutospacing="0" w:after="0" w:afterAutospacing="0" w:line="240" w:lineRule="auto"/>
         <w:jc w:val="left"/>
@@ -2717,7 +2693,7 @@
         </w:rPr>
         <w:drawing>
           <wp:inline distT="0" distB="0" distL="0" distR="0">
-            <wp:extent cx="5394960" cy="3109629"/>
+            <wp:extent cx="5394960" cy="4585716"/>
             <wp:effectExtent l="0" t="0" r="0" b="0"/>
             <wp:docPr id="903" name="Figura 3"/>
             <wp:cNvGraphicFramePr>
@@ -2739,7 +2715,7 @@
                   <pic:spPr>
                     <a:xfrm>
                       <a:off x="0" y="0"/>
-                      <a:ext cx="5394960" cy="3109629"/>
+                      <a:ext cx="5394960" cy="4585716"/>
                     </a:xfrm>
                     <a:prstGeom prst="rect">
                       <a:avLst/>
@@ -2838,7 +2814,7 @@
           <w:sz w:val="20"/>
           <w:szCs w:val="20"/>
         </w:rPr>
-        <w:t xml:space="preserve"> las reglas de la pista quedaron en un solo lugar y los aviones dejaron de conocerse entre sí.</w:t>
+        <w:t xml:space="preserve"> las reglas de uso de la pista están en un solo lugar y las aeronaves dejaron de depender unas de otras. Cada aeronave mantiene una única dependencia, hacia ITorreControl, en lugar de n−1.</w:t>
       </w:r>
     </w:p>
     <w:p>
@@ -2861,16 +2837,16 @@
           <w:sz w:val="20"/>
           <w:szCs w:val="20"/>
         </w:rPr>
-        <w:t xml:space="preserve">Qué mejoró:</w:t>
-      </w:r>
-      <w:r>
-        <w:rPr>
-          <w:rFonts w:asciiTheme="minorHAnsi" w:hAnsiTheme="minorHAnsi" w:cstheme="minorHAnsi"/>
-          <w:color w:val="767171" w:themeColor="background2" w:themeShade="80"/>
-          <w:sz w:val="20"/>
-          <w:szCs w:val="20"/>
-        </w:rPr>
-        <w:t xml:space="preserve"> hay una sola dependencia (ITorreControl) en lugar de n·(n−1). Agregar un avión no afecta a los demás, y la regla de turnos se puede cambiar con otra implementación de ITorreControl.</w:t>
+        <w:t xml:space="preserve">Qué mejoró respecto de la solución directa:</w:t>
+      </w:r>
+      <w:r>
+        <w:rPr>
+          <w:rFonts w:asciiTheme="minorHAnsi" w:hAnsiTheme="minorHAnsi" w:cstheme="minorHAnsi"/>
+          <w:color w:val="767171" w:themeColor="background2" w:themeShade="80"/>
+          <w:sz w:val="20"/>
+          <w:szCs w:val="20"/>
+        </w:rPr>
+        <w:t xml:space="preserve"> lo comprobamos al extender el escenario. Agregar AvionSanitario no exigió tocar AvionComercial, y la regla de prioridad se implementó modificando solo TorreControlConcreta. En la versión directa ese mismo cambio habría alcanzado a todas las clases de aeronave.</w:t>
       </w:r>
     </w:p>
     <w:p>
@@ -2893,16 +2869,16 @@
           <w:sz w:val="20"/>
           <w:szCs w:val="20"/>
         </w:rPr>
-        <w:t xml:space="preserve">Costo:</w:t>
-      </w:r>
-      <w:r>
-        <w:rPr>
-          <w:rFonts w:asciiTheme="minorHAnsi" w:hAnsiTheme="minorHAnsi" w:cstheme="minorHAnsi"/>
-          <w:color w:val="767171" w:themeColor="background2" w:themeShade="80"/>
-          <w:sz w:val="20"/>
-          <w:szCs w:val="20"/>
-        </w:rPr>
-        <w:t xml:space="preserve"> la torre concentra toda la lógica y puede crecer demasiado. El flujo avión → torre → avión es más difícil de seguir.</w:t>
+        <w:t xml:space="preserve">Costos y complejidad:</w:t>
+      </w:r>
+      <w:r>
+        <w:rPr>
+          <w:rFonts w:asciiTheme="minorHAnsi" w:hAnsiTheme="minorHAnsi" w:cstheme="minorHAnsi"/>
+          <w:color w:val="767171" w:themeColor="background2" w:themeShade="80"/>
+          <w:sz w:val="20"/>
+          <w:szCs w:val="20"/>
+        </w:rPr>
+        <w:t xml:space="preserve"> la torre concentra la lógica y es la clase que más crece; si se sumaran reglas como meteorología, varias pistas o franjas horarias, terminaría convertida en un objeto monolítico y convendría dividirla. El flujo aeronave → torre → aeronave es menos evidente al leer el código que una llamada directa. Además, la torre es un punto único de falla y, en un sistema concurrente real, tendría que sincronizar el acceso a sus colas; la simulación es de un solo hilo.</w:t>
       </w:r>
     </w:p>
     <w:p>
@@ -2934,7 +2910,7 @@
           <w:sz w:val="20"/>
           <w:szCs w:val="20"/>
         </w:rPr>
-        <w:t xml:space="preserve"> si interactúan pocos objetos de forma simple, el mediador solo agrega una capa (Refactoring.Guru, s. f.-b).</w:t>
+        <w:t xml:space="preserve"> cuando los objetos que interactúan son pocos y sus relaciones son simples y estables, porque el mediador solo añade una capa de indirección (Refactoring.Guru, s. f.-b). Tampoco cuando la comunicación es en un solo sentido y basta con notificar eventos; en ese caso Observer es suficiente.</w:t>
       </w:r>
     </w:p>
     <w:p>
@@ -2960,6 +2936,7 @@
     <w:p>
       <w:pPr>
         <w:pStyle w:val="NormalWeb"/>
+        <w:keepNext/>
         <w:numPr>
           <w:ilvl w:val="0"/>
           <w:numId w:val="11"/>
@@ -3000,6 +2977,7 @@
     <w:p>
       <w:pPr>
         <w:pStyle w:val="NormalWeb"/>
+        <w:keepNext/>
         <w:numPr>
           <w:ilvl w:val="0"/>
           <w:numId w:val="11"/>
@@ -3017,7 +2995,7 @@
           <w:sz w:val="20"/>
           <w:szCs w:val="20"/>
         </w:rPr>
-        <w:t xml:space="preserve">Recomendación aceptada y justificación:</w:t>
+        <w:t xml:space="preserve">Prompt de revisión:</w:t>
       </w:r>
     </w:p>
     <w:p>
@@ -3034,12 +3012,13 @@
           <w:sz w:val="20"/>
           <w:szCs w:val="20"/>
         </w:rPr>
-        <w:t xml:space="preserve">Centralizar el estado de la pista y la validación de turnos en TorreControlConcreta. Se aceptó porque así las aeronaves no toman decisiones de tráfico y cada clase se limita a su rol en el patrón.</w:t>
-      </w:r>
-    </w:p>
-    <w:p>
-      <w:pPr>
-        <w:pStyle w:val="NormalWeb"/>
+        <w:t xml:space="preserve">“Revisa el documento guía de la actividad y lo desarrollado en nuestra resolución (código, UML e informe) y dinos qué se puede mejorar para obtener la calificación más alta.”</w:t>
+      </w:r>
+    </w:p>
+    <w:p>
+      <w:pPr>
+        <w:pStyle w:val="NormalWeb"/>
+        <w:keepNext/>
         <w:numPr>
           <w:ilvl w:val="0"/>
           <w:numId w:val="11"/>
@@ -3057,7 +3036,7 @@
           <w:sz w:val="20"/>
           <w:szCs w:val="20"/>
         </w:rPr>
-        <w:t xml:space="preserve">Recomendación modificada o rechazada y justificación:</w:t>
+        <w:t xml:space="preserve">Recomendación aceptada y justificación:</w:t>
       </w:r>
     </w:p>
     <w:p>
@@ -3074,7 +3053,82 @@
           <w:sz w:val="20"/>
           <w:szCs w:val="20"/>
         </w:rPr>
-        <w:t xml:space="preserve">Que cada aeronave tuviera una lista de las demás para avisarse entre sí ante emergencias en pista. Se rechazó porque los colegas no deben conocerse: una emergencia se reporta a la torre.</w:t>
+        <w:t xml:space="preserve">En la primera iteración, la IA propuso centralizar el estado de la pista y la validación de turnos en TorreControlConcreta. Lo aceptamos porque así las aeronaves no toman decisiones de tráfico y cada clase se limita a su rol en el patrón.</w:t>
+      </w:r>
+    </w:p>
+    <w:p>
+      <w:pPr>
+        <w:pStyle w:val="NormalWeb"/>
+        <w:shd w:val="clear" w:color="auto" w:fill="FFFFFF"/>
+        <w:spacing w:line="360" w:lineRule="auto"/>
+        <w:jc w:val="both"/>
+      </w:pPr>
+      <w:r>
+        <w:rPr>
+          <w:rFonts w:asciiTheme="minorHAnsi" w:hAnsiTheme="minorHAnsi" w:cstheme="minorHAnsi"/>
+          <w:color w:val="767171" w:themeColor="background2" w:themeShade="80"/>
+          <w:sz w:val="20"/>
+          <w:szCs w:val="20"/>
+        </w:rPr>
+        <w:t xml:space="preserve">En la revisión, la IA observó que el informe afirmaba que agregar aeronaves no afecta a las demás, pero el código tenía un único tipo de colega, de modo que la afirmación no estaba demostrada. Aceptamos incorporar AvionSanitario con prioridad porque convierte un argumento teórico en una extensión verificable y cubierta por pruebas. También aceptamos separar en el UML las asociaciones que antes aparecían agrupadas en una sola línea y mover el registro de las aeronaves al cliente, para no publicar this desde el constructor.</w:t>
+      </w:r>
+    </w:p>
+    <w:p>
+      <w:pPr>
+        <w:pStyle w:val="NormalWeb"/>
+        <w:keepNext/>
+        <w:numPr>
+          <w:ilvl w:val="0"/>
+          <w:numId w:val="11"/>
+        </w:numPr>
+        <w:shd w:val="clear" w:color="auto" w:fill="FFFFFF"/>
+        <w:spacing w:before="60" w:beforeAutospacing="0" w:after="0" w:afterAutospacing="0" w:line="360" w:lineRule="auto"/>
+        <w:jc w:val="both"/>
+      </w:pPr>
+      <w:r>
+        <w:rPr>
+          <w:rFonts w:asciiTheme="minorHAnsi" w:hAnsiTheme="minorHAnsi" w:cstheme="minorHAnsi"/>
+          <w:b/>
+          <w:bCs/>
+          <w:color w:val="767171" w:themeColor="background2" w:themeShade="80"/>
+          <w:sz w:val="20"/>
+          <w:szCs w:val="20"/>
+        </w:rPr>
+        <w:t xml:space="preserve">Recomendación modificada o rechazada y justificación:</w:t>
+      </w:r>
+    </w:p>
+    <w:p>
+      <w:pPr>
+        <w:pStyle w:val="NormalWeb"/>
+        <w:shd w:val="clear" w:color="auto" w:fill="FFFFFF"/>
+        <w:spacing w:line="360" w:lineRule="auto"/>
+        <w:jc w:val="both"/>
+      </w:pPr>
+      <w:r>
+        <w:rPr>
+          <w:rFonts w:asciiTheme="minorHAnsi" w:hAnsiTheme="minorHAnsi" w:cstheme="minorHAnsi"/>
+          <w:color w:val="767171" w:themeColor="background2" w:themeShade="80"/>
+          <w:sz w:val="20"/>
+          <w:szCs w:val="20"/>
+        </w:rPr>
+        <w:t xml:space="preserve">En la primera iteración, la IA sugirió que cada aeronave mantuviera una lista de las demás para avisarse entre sí ante emergencias en pista. La rechazamos porque contradice el patrón: los colegas no deben conocerse y una emergencia se reporta a la torre.</w:t>
+      </w:r>
+    </w:p>
+    <w:p>
+      <w:pPr>
+        <w:pStyle w:val="NormalWeb"/>
+        <w:shd w:val="clear" w:color="auto" w:fill="FFFFFF"/>
+        <w:spacing w:line="360" w:lineRule="auto"/>
+        <w:jc w:val="both"/>
+      </w:pPr>
+      <w:r>
+        <w:rPr>
+          <w:rFonts w:asciiTheme="minorHAnsi" w:hAnsiTheme="minorHAnsi" w:cstheme="minorHAnsi"/>
+          <w:color w:val="767171" w:themeColor="background2" w:themeShade="80"/>
+          <w:sz w:val="20"/>
+          <w:szCs w:val="20"/>
+        </w:rPr>
+        <w:t xml:space="preserve">En la revisión, la IA planteó como alternativa crear un segundo mediador, TorreControlConPrioridad. Lo descartamos porque habría duplicado toda la gestión de colas para cambiar una sola regla. Preferimos que cada aeronave declare si es prioritaria mediante esPrioritaria() y que la torre use ese dato; así se evita preguntar por el tipo con instanceof y se mantiene un único mediador.</w:t>
       </w:r>
     </w:p>
     <w:p>
@@ -3099,7 +3153,7 @@
           <w:sz w:val="26"/>
           <w:szCs w:val="26"/>
         </w:rPr>
-        <w:t xml:space="preserve">Patrón 02: Command – Control remoto de luces</w:t>
+        <w:t xml:space="preserve">Patrón 02: Command – Control remoto domótico</w:t>
       </w:r>
     </w:p>
     <w:p>
@@ -3136,7 +3190,24 @@
           <w:sz w:val="20"/>
           <w:szCs w:val="20"/>
         </w:rPr>
-        <w:t xml:space="preserve">Un control remoto enciende y apaga una luz. El control decide cuándo actuar (al presionar el botón) y la luz sabe cómo hacerlo. El mismo botón debe poder cambiar de acción mientras el programa está en ejecución.</w:t>
+        <w:t xml:space="preserve">Una sala de reuniones cuenta con iluminación y un ventilador que se manejan desde un control remoto programable de cuatro botones. El personal de soporte configura qué hace cada botón y puede reconfigurarlo sin reiniciar el sistema. Además de acciones simples, como encender la luz o ajustar el ventilador, se necesitan escenas: «Modo presentación» apaga la luz y baja el ventilador con un solo botón. Como los usuarios se equivocan, el control debe ofrecer un botón Deshacer que revierta la última acción, incluida una escena completa.</w:t>
+      </w:r>
+    </w:p>
+    <w:p>
+      <w:pPr>
+        <w:pStyle w:val="NormalWeb"/>
+        <w:shd w:val="clear" w:color="auto" w:fill="FFFFFF"/>
+        <w:spacing w:line="360" w:lineRule="auto"/>
+        <w:jc w:val="both"/>
+      </w:pPr>
+      <w:r>
+        <w:rPr>
+          <w:rFonts w:asciiTheme="minorHAnsi" w:hAnsiTheme="minorHAnsi" w:cstheme="minorHAnsi"/>
+          <w:color w:val="767171" w:themeColor="background2" w:themeShade="80"/>
+          <w:sz w:val="20"/>
+          <w:szCs w:val="20"/>
+        </w:rPr>
+        <w:t xml:space="preserve">El control decide cuándo se ejecuta una acción y los dispositivos saben cómo realizarla. La dificultad está en que el control no debería saber qué dispositivo hay del otro lado ni cómo se revierte cada acción.</w:t>
       </w:r>
     </w:p>
     <w:p>
@@ -3173,7 +3244,25 @@
           <w:sz w:val="20"/>
           <w:szCs w:val="20"/>
         </w:rPr>
-        <w:t xml:space="preserve">Si el control llama directamente a la luz con presionarBotonEncender() y presionarBotonApagar() (Figura 4), queda atado a ese dispositivo y a esas dos acciones. Cada acción o dispositivo nuevo obliga a modificar el control, y no hay forma de reasignar un botón en ejecución. La solicitud tiene que convertirse en un objeto que el control pueda ejecutar sin saber qué hay detrás.</w:t>
+        <w:t xml:space="preserve">La solución directa (Figura 4) es un ControlRemotoDirecto con una referencia a cada dispositivo y un método por botón. Funciona para dos acciones, pero escala mal: cada acción o dispositivo nuevo obliga a modificar el control, los botones quedan fijados en tiempo de compilación y no hay dónde registrar lo que se hizo para poder deshacerlo. Si se intenta resolver con un presionarBoton(accion) y un switch, el condicional crece con cada acción y el control sigue dependiendo de todos los dispositivos.</w:t>
+      </w:r>
+    </w:p>
+    <w:p>
+      <w:pPr>
+        <w:pStyle w:val="NormalWeb"/>
+        <w:keepNext/>
+        <w:shd w:val="clear" w:color="auto" w:fill="FFFFFF"/>
+        <w:spacing w:line="360" w:lineRule="auto"/>
+        <w:jc w:val="both"/>
+      </w:pPr>
+      <w:r>
+        <w:rPr>
+          <w:rFonts w:asciiTheme="minorHAnsi" w:hAnsiTheme="minorHAnsi" w:cstheme="minorHAnsi"/>
+          <w:color w:val="767171" w:themeColor="background2" w:themeShade="80"/>
+          <w:sz w:val="20"/>
+          <w:szCs w:val="20"/>
+        </w:rPr>
+        <w:t xml:space="preserve">Lo que hay que organizar es la solicitud misma: convertirla en un objeto que el control pueda guardar, ejecutar, registrar y revertir sin conocer su contenido.</w:t>
       </w:r>
     </w:p>
     <w:p>
@@ -3190,7 +3279,7 @@
         </w:rPr>
         <w:drawing>
           <wp:inline distT="0" distB="0" distL="0" distR="0">
-            <wp:extent cx="2651760" cy="2033355"/>
+            <wp:extent cx="3800000" cy="2906523"/>
             <wp:effectExtent l="0" t="0" r="0" b="0"/>
             <wp:docPr id="904" name="Figura 4"/>
             <wp:cNvGraphicFramePr>
@@ -3212,7 +3301,7 @@
                   <pic:spPr>
                     <a:xfrm>
                       <a:off x="0" y="0"/>
-                      <a:ext cx="2651760" cy="2033355"/>
+                      <a:ext cx="3800000" cy="2906523"/>
                     </a:xfrm>
                     <a:prstGeom prst="rect">
                       <a:avLst/>
@@ -3296,12 +3385,13 @@
           <w:sz w:val="20"/>
           <w:szCs w:val="20"/>
         </w:rPr>
-        <w:t xml:space="preserve">Command encapsula una solicitud como objeto; así se puede parametrizar a quien la invoca, encolarla o registrarla (Gamma et al., 1994). El control solo llama a ejecutar(), y lo que se ejecuta depende del comando que tenga asignado.</w:t>
-      </w:r>
-    </w:p>
-    <w:p>
-      <w:pPr>
-        <w:pStyle w:val="NormalWeb"/>
+        <w:t xml:space="preserve">Command encapsula una solicitud como objeto, lo que permite parametrizar a quien la invoca con distintas solicitudes, encolarlas o registrarlas, y soportar operaciones que se pueden deshacer (Gamma et al., 1994). Las tres necesidades del escenario corresponden a consecuencias directas del patrón: los botones reasignables son la parametrización del invocador; el deshacer se apoya en el historial de comandos ejecutados, y la escena es un comando compuesto, el MacroCommand que GoF incluye en la descripción del patrón. El caso del control remoto se inspira en el ejemplo clásico de Freeman y Robson (2020), que adaptamos a un escenario de domótica con historial de varios niveles.</w:t>
+      </w:r>
+    </w:p>
+    <w:p>
+      <w:pPr>
+        <w:pStyle w:val="NormalWeb"/>
+        <w:keepNext/>
         <w:shd w:val="clear" w:color="auto" w:fill="FFFFFF"/>
         <w:spacing w:after="60" w:afterAutospacing="0" w:line="360" w:lineRule="auto"/>
         <w:jc w:val="both"/>
@@ -3313,7 +3403,7 @@
           <w:sz w:val="20"/>
           <w:szCs w:val="20"/>
         </w:rPr>
-        <w:t xml:space="preserve">Alternativas descartadas:</w:t>
+        <w:t xml:space="preserve">Alternativas consideradas y descartadas:</w:t>
       </w:r>
     </w:p>
     <w:p>
@@ -3345,7 +3435,7 @@
           <w:sz w:val="20"/>
           <w:szCs w:val="20"/>
         </w:rPr>
-        <w:t xml:space="preserve"> Un presionarBoton(accion) con un switch. Hay que editarlo con cada acción nueva y sigue dependiendo de cada dispositivo.</w:t>
+        <w:t xml:space="preserve"> Un presionarBoton(accion) con un switch obliga a editar el control con cada acción nueva y lo mantiene acoplado a todos los dispositivos.</w:t>
       </w:r>
     </w:p>
     <w:p>
@@ -3377,7 +3467,7 @@
           <w:sz w:val="20"/>
           <w:szCs w:val="20"/>
         </w:rPr>
-        <w:t xml:space="preserve"> La estructura es casi igual, pero Strategy cambia cómo un objeto hace su propio trabajo. Aquí lo que cambia es qué orden se envía y a quién, y Command guarda al receptor dentro del objeto.</w:t>
+        <w:t xml:space="preserve"> La estructura se parece (una interfaz con un método y varias implementaciones), pero la intención es otra: Strategy cambia cómo un objeto realiza su propio trabajo, mientras que aquí cambia qué orden se envía y a qué receptor. Además, Strategy no contempla registrar ni deshacer ejecuciones, que son centrales en este caso.</w:t>
       </w:r>
     </w:p>
     <w:p>
@@ -3409,7 +3499,7 @@
           <w:sz w:val="20"/>
           <w:szCs w:val="20"/>
         </w:rPr>
-        <w:t xml:space="preserve"> El botón avisaría «me presionaron» y la luz decidiría qué hacer. La decisión vuelve a quedar en condicionales, ahora dentro de la luz, y cambiar la acción del botón significa cambiar suscripciones.</w:t>
+        <w:t xml:space="preserve"> El botón avisaría «me presionaron» y el dispositivo decidiría qué hacer. La decisión volvería a quedar en condicionales, ahora dentro del receptor; reasignar un botón implicaría cambiar suscripciones y el deshacer no tendría un lugar natural.</w:t>
       </w:r>
     </w:p>
     <w:p>
@@ -3432,16 +3522,16 @@
           <w:sz w:val="20"/>
           <w:szCs w:val="20"/>
         </w:rPr>
-        <w:t xml:space="preserve">Mediator.</w:t>
-      </w:r>
-      <w:r>
-        <w:rPr>
-          <w:rFonts w:asciiTheme="minorHAnsi" w:hAnsiTheme="minorHAnsi" w:cstheme="minorHAnsi"/>
-          <w:color w:val="767171" w:themeColor="background2" w:themeShade="80"/>
-          <w:sz w:val="20"/>
-          <w:szCs w:val="20"/>
-        </w:rPr>
-        <w:t xml:space="preserve"> No hay varios objetos que coordinar, solo uno que pide y otro que ejecuta.</w:t>
+        <w:t xml:space="preserve">Memento.</w:t>
+      </w:r>
+      <w:r>
+        <w:rPr>
+          <w:rFonts w:asciiTheme="minorHAnsi" w:hAnsiTheme="minorHAnsi" w:cstheme="minorHAnsi"/>
+          <w:color w:val="767171" w:themeColor="background2" w:themeShade="80"/>
+          <w:sz w:val="20"/>
+          <w:szCs w:val="20"/>
+        </w:rPr>
+        <w:t xml:space="preserve"> Podría guardar el estado de cada dispositivo para deshacer, pero obligaría al control a conocer y capturar el estado de todos los dispositivos. Con Command, cada comando guarda solo el dato mínimo que necesita para revertir su propia acción.</w:t>
       </w:r>
     </w:p>
     <w:p>
@@ -3484,16 +3574,16 @@
           <w:sz w:val="20"/>
           <w:szCs w:val="20"/>
         </w:rPr>
-        <w:t xml:space="preserve">IComando (Command):</w:t>
-      </w:r>
-      <w:r>
-        <w:rPr>
-          <w:rFonts w:asciiTheme="minorHAnsi" w:hAnsiTheme="minorHAnsi" w:cstheme="minorHAnsi"/>
-          <w:color w:val="767171" w:themeColor="background2" w:themeShade="80"/>
-          <w:sz w:val="20"/>
-          <w:szCs w:val="20"/>
-        </w:rPr>
-        <w:t xml:space="preserve"> declara ejecutar().</w:t>
+        <w:t xml:space="preserve">Command → IComando:</w:t>
+      </w:r>
+      <w:r>
+        <w:rPr>
+          <w:rFonts w:asciiTheme="minorHAnsi" w:hAnsiTheme="minorHAnsi" w:cstheme="minorHAnsi"/>
+          <w:color w:val="767171" w:themeColor="background2" w:themeShade="80"/>
+          <w:sz w:val="20"/>
+          <w:szCs w:val="20"/>
+        </w:rPr>
+        <w:t xml:space="preserve"> declara ejecutar() y deshacer().</w:t>
       </w:r>
     </w:p>
     <w:p>
@@ -3516,16 +3606,16 @@
           <w:sz w:val="20"/>
           <w:szCs w:val="20"/>
         </w:rPr>
-        <w:t xml:space="preserve">EncenderLuzCommand y ApagarLuzCommand (ConcreteCommand):</w:t>
-      </w:r>
-      <w:r>
-        <w:rPr>
-          <w:rFonts w:asciiTheme="minorHAnsi" w:hAnsiTheme="minorHAnsi" w:cstheme="minorHAnsi"/>
-          <w:color w:val="767171" w:themeColor="background2" w:themeShade="80"/>
-          <w:sz w:val="20"/>
-          <w:szCs w:val="20"/>
-        </w:rPr>
-        <w:t xml:space="preserve"> reciben la Luz en el constructor y en ejecutar() llaman a encender() o apagar().</w:t>
+        <w:t xml:space="preserve">ConcreteCommand → EncenderLuzCommand, ApagarLuzCommand y CambiarVelocidadVentiladorCommand:</w:t>
+      </w:r>
+      <w:r>
+        <w:rPr>
+          <w:rFonts w:asciiTheme="minorHAnsi" w:hAnsiTheme="minorHAnsi" w:cstheme="minorHAnsi"/>
+          <w:color w:val="767171" w:themeColor="background2" w:themeShade="80"/>
+          <w:sz w:val="20"/>
+          <w:szCs w:val="20"/>
+        </w:rPr>
+        <w:t xml:space="preserve"> vinculan una acción con su receptor. Antes de actuar guardan el estado previo del dispositivo para poder revertirlo.</w:t>
       </w:r>
     </w:p>
     <w:p>
@@ -3548,16 +3638,16 @@
           <w:sz w:val="20"/>
           <w:szCs w:val="20"/>
         </w:rPr>
-        <w:t xml:space="preserve">Luz (Receiver):</w:t>
-      </w:r>
-      <w:r>
-        <w:rPr>
-          <w:rFonts w:asciiTheme="minorHAnsi" w:hAnsiTheme="minorHAnsi" w:cstheme="minorHAnsi"/>
-          <w:color w:val="767171" w:themeColor="background2" w:themeShade="80"/>
-          <w:sz w:val="20"/>
-          <w:szCs w:val="20"/>
-        </w:rPr>
-        <w:t xml:space="preserve"> hace el trabajo real.</w:t>
+        <w:t xml:space="preserve">ConcreteCommand compuesto → MacroComando:</w:t>
+      </w:r>
+      <w:r>
+        <w:rPr>
+          <w:rFonts w:asciiTheme="minorHAnsi" w:hAnsiTheme="minorHAnsi" w:cstheme="minorHAnsi"/>
+          <w:color w:val="767171" w:themeColor="background2" w:themeShade="80"/>
+          <w:sz w:val="20"/>
+          <w:szCs w:val="20"/>
+        </w:rPr>
+        <w:t xml:space="preserve"> agrupa varios comandos; los ejecuta en orden y los deshace en orden inverso.</w:t>
       </w:r>
     </w:p>
     <w:p>
@@ -3580,16 +3670,16 @@
           <w:sz w:val="20"/>
           <w:szCs w:val="20"/>
         </w:rPr>
-        <w:t xml:space="preserve">ControlRemoto (Invoker):</w:t>
-      </w:r>
-      <w:r>
-        <w:rPr>
-          <w:rFonts w:asciiTheme="minorHAnsi" w:hAnsiTheme="minorHAnsi" w:cstheme="minorHAnsi"/>
-          <w:color w:val="767171" w:themeColor="background2" w:themeShade="80"/>
-          <w:sz w:val="20"/>
-          <w:szCs w:val="20"/>
-        </w:rPr>
-        <w:t xml:space="preserve"> guarda un IComando con setComando() y lo ejecuta en presionarBoton(). Si no tiene comando asignado, avisa y no hace nada.</w:t>
+        <w:t xml:space="preserve">Receiver → Luz y Ventilador:</w:t>
+      </w:r>
+      <w:r>
+        <w:rPr>
+          <w:rFonts w:asciiTheme="minorHAnsi" w:hAnsiTheme="minorHAnsi" w:cstheme="minorHAnsi"/>
+          <w:color w:val="767171" w:themeColor="background2" w:themeShade="80"/>
+          <w:sz w:val="20"/>
+          <w:szCs w:val="20"/>
+        </w:rPr>
+        <w:t xml:space="preserve"> realizan el trabajo y exponen su estado actual.</w:t>
       </w:r>
     </w:p>
     <w:p>
@@ -3612,16 +3702,150 @@
           <w:sz w:val="20"/>
           <w:szCs w:val="20"/>
         </w:rPr>
-        <w:t xml:space="preserve">MainCommandControlLuces (Client):</w:t>
-      </w:r>
-      <w:r>
-        <w:rPr>
-          <w:rFonts w:asciiTheme="minorHAnsi" w:hAnsiTheme="minorHAnsi" w:cstheme="minorHAnsi"/>
-          <w:color w:val="767171" w:themeColor="background2" w:themeShade="80"/>
-          <w:sz w:val="20"/>
-          <w:szCs w:val="20"/>
-        </w:rPr>
-        <w:t xml:space="preserve"> crea la luz, los comandos y el control, y los conecta.</w:t>
+        <w:t xml:space="preserve">Invoker → ControlRemoto:</w:t>
+      </w:r>
+      <w:r>
+        <w:rPr>
+          <w:rFonts w:asciiTheme="minorHAnsi" w:hAnsiTheme="minorHAnsi" w:cstheme="minorHAnsi"/>
+          <w:color w:val="767171" w:themeColor="background2" w:themeShade="80"/>
+          <w:sz w:val="20"/>
+          <w:szCs w:val="20"/>
+        </w:rPr>
+        <w:t xml:space="preserve"> guarda un comando por botón (ranura), lo ejecuta al presionarlo y apila cada comando ejecutado en el historial; presionarDeshacer() revierte el último.</w:t>
+      </w:r>
+    </w:p>
+    <w:p>
+      <w:pPr>
+        <w:pStyle w:val="NormalWeb"/>
+        <w:numPr>
+          <w:ilvl w:val="0"/>
+          <w:numId w:val="9"/>
+        </w:numPr>
+        <w:shd w:val="clear" w:color="auto" w:fill="FFFFFF"/>
+        <w:spacing w:before="40" w:beforeAutospacing="0" w:after="40" w:afterAutospacing="0" w:line="360" w:lineRule="auto"/>
+        <w:jc w:val="both"/>
+      </w:pPr>
+      <w:r>
+        <w:rPr>
+          <w:rFonts w:asciiTheme="minorHAnsi" w:hAnsiTheme="minorHAnsi" w:cstheme="minorHAnsi"/>
+          <w:b/>
+          <w:bCs/>
+          <w:color w:val="767171" w:themeColor="background2" w:themeShade="80"/>
+          <w:sz w:val="20"/>
+          <w:szCs w:val="20"/>
+        </w:rPr>
+        <w:t xml:space="preserve">Client → MainCommandControlLuces:</w:t>
+      </w:r>
+      <w:r>
+        <w:rPr>
+          <w:rFonts w:asciiTheme="minorHAnsi" w:hAnsiTheme="minorHAnsi" w:cstheme="minorHAnsi"/>
+          <w:color w:val="767171" w:themeColor="background2" w:themeShade="80"/>
+          <w:sz w:val="20"/>
+          <w:szCs w:val="20"/>
+        </w:rPr>
+        <w:t xml:space="preserve"> crea los dispositivos, los comandos y el control, y asigna cada comando a un botón.</w:t>
+      </w:r>
+    </w:p>
+    <w:p>
+      <w:pPr>
+        <w:pStyle w:val="NormalWeb"/>
+        <w:keepNext/>
+        <w:shd w:val="clear" w:color="auto" w:fill="FFFFFF"/>
+        <w:spacing w:after="60" w:afterAutospacing="0" w:line="360" w:lineRule="auto"/>
+        <w:jc w:val="both"/>
+      </w:pPr>
+      <w:r>
+        <w:rPr>
+          <w:rFonts w:asciiTheme="minorHAnsi" w:hAnsiTheme="minorHAnsi" w:cstheme="minorHAnsi"/>
+          <w:color w:val="767171" w:themeColor="background2" w:themeShade="80"/>
+          <w:sz w:val="20"/>
+          <w:szCs w:val="20"/>
+        </w:rPr>
+        <w:t xml:space="preserve">La colaboración entre los objetos sigue esta secuencia:</w:t>
+      </w:r>
+    </w:p>
+    <w:p>
+      <w:pPr>
+        <w:pStyle w:val="NormalWeb"/>
+        <w:numPr>
+          <w:ilvl w:val="0"/>
+          <w:numId w:val="13"/>
+        </w:numPr>
+        <w:shd w:val="clear" w:color="auto" w:fill="FFFFFF"/>
+        <w:spacing w:before="40" w:beforeAutospacing="0" w:after="40" w:afterAutospacing="0" w:line="360" w:lineRule="auto"/>
+        <w:jc w:val="both"/>
+      </w:pPr>
+      <w:r>
+        <w:rPr>
+          <w:rFonts w:asciiTheme="minorHAnsi" w:hAnsiTheme="minorHAnsi" w:cstheme="minorHAnsi"/>
+          <w:color w:val="767171" w:themeColor="background2" w:themeShade="80"/>
+          <w:sz w:val="20"/>
+          <w:szCs w:val="20"/>
+        </w:rPr>
+        <w:t xml:space="preserve">El cliente crea los receptores y los comandos concretos, y entrega a cada comando su receptor por el constructor.</w:t>
+      </w:r>
+    </w:p>
+    <w:p>
+      <w:pPr>
+        <w:pStyle w:val="NormalWeb"/>
+        <w:numPr>
+          <w:ilvl w:val="0"/>
+          <w:numId w:val="13"/>
+        </w:numPr>
+        <w:shd w:val="clear" w:color="auto" w:fill="FFFFFF"/>
+        <w:spacing w:before="40" w:beforeAutospacing="0" w:after="40" w:afterAutospacing="0" w:line="360" w:lineRule="auto"/>
+        <w:jc w:val="both"/>
+      </w:pPr>
+      <w:r>
+        <w:rPr>
+          <w:rFonts w:asciiTheme="minorHAnsi" w:hAnsiTheme="minorHAnsi" w:cstheme="minorHAnsi"/>
+          <w:color w:val="767171" w:themeColor="background2" w:themeShade="80"/>
+          <w:sz w:val="20"/>
+          <w:szCs w:val="20"/>
+        </w:rPr>
+        <w:t xml:space="preserve">El cliente asigna los comandos a las ranuras del control con asignarComando(); puede reasignarlas en cualquier momento.</w:t>
+      </w:r>
+    </w:p>
+    <w:p>
+      <w:pPr>
+        <w:pStyle w:val="NormalWeb"/>
+        <w:numPr>
+          <w:ilvl w:val="0"/>
+          <w:numId w:val="13"/>
+        </w:numPr>
+        <w:shd w:val="clear" w:color="auto" w:fill="FFFFFF"/>
+        <w:spacing w:before="40" w:beforeAutospacing="0" w:after="40" w:afterAutospacing="0" w:line="360" w:lineRule="auto"/>
+        <w:jc w:val="both"/>
+      </w:pPr>
+      <w:r>
+        <w:rPr>
+          <w:rFonts w:asciiTheme="minorHAnsi" w:hAnsiTheme="minorHAnsi" w:cstheme="minorHAnsi"/>
+          <w:color w:val="767171" w:themeColor="background2" w:themeShade="80"/>
+          <w:sz w:val="20"/>
+          <w:szCs w:val="20"/>
+        </w:rPr>
+        <w:t xml:space="preserve">Al presionar un botón, ControlRemoto invoca ejecutar() sobre el comando de esa ranura y lo apila en el historial. Si la ranura está vacía, avisa y no registra nada.</w:t>
+      </w:r>
+    </w:p>
+    <w:p>
+      <w:pPr>
+        <w:pStyle w:val="NormalWeb"/>
+        <w:numPr>
+          <w:ilvl w:val="0"/>
+          <w:numId w:val="13"/>
+        </w:numPr>
+        <w:shd w:val="clear" w:color="auto" w:fill="FFFFFF"/>
+        <w:spacing w:before="40" w:beforeAutospacing="0" w:after="40" w:afterAutospacing="0" w:line="360" w:lineRule="auto"/>
+        <w:jc w:val="both"/>
+      </w:pPr>
+      <w:r>
+        <w:rPr>
+          <w:rFonts w:asciiTheme="minorHAnsi" w:hAnsiTheme="minorHAnsi" w:cstheme="minorHAnsi"/>
+          <w:color w:val="767171" w:themeColor="background2" w:themeShade="80"/>
+          <w:sz w:val="20"/>
+          <w:szCs w:val="20"/>
+        </w:rPr>
+        <w:t xml:space="preserve">Al presionar Deshacer, el control desapila el último comando y llama a deshacer(). El comando restaura el estado que guardó; si es una macro, delega en sus comandos en orden inverso.</w:t>
       </w:r>
     </w:p>
     <w:p>
@@ -3638,7 +3862,7 @@
           <w:sz w:val="20"/>
           <w:szCs w:val="20"/>
         </w:rPr>
-        <w:t xml:space="preserve">En la ejecución (Figura 6), el cliente asigna EncenderLuzCommand, presiona el botón y la luz se enciende; después asigna ApagarLuzCommand al mismo botón y la luz se apaga. ControlRemoto nunca ve a la Luz.</w:t>
+        <w:t xml:space="preserve">En la ejecución (Figura 6) se enciende la luz y se sube el ventilador a velocidad 3; luego se activa «Modo presentación» y se deshace como una sola acción, con lo que la sala vuelve exactamente a luz encendida y velocidad 3. Después se reasigna el botón 2 a velocidad baja y, al deshacer hasta vaciar el historial, cada acción se revierte en orden inverso. En ningún momento ControlRemoto conoce a Luz ni a Ventilador.</w:t>
       </w:r>
     </w:p>
     <w:p>
@@ -3675,7 +3899,7 @@
           <w:sz w:val="20"/>
           <w:szCs w:val="20"/>
         </w:rPr>
-        <w:t xml:space="preserve">ControlRemoto tiene una agregación hacia IComando (0..1). Los dos comandos implementan IComando y delegan en Luz. MainCommandControlLuces crea los objetos (dependencias «create»).</w:t>
+        <w:t xml:space="preserve">ControlRemoto mantiene dos asociaciones con IComando: ranuras, una agregación (0..*) porque los comandos existen fuera del control y pueden compartirse entre botones, e historial (0..*), que registra lo ejecutado. Los cuatro comandos concretos realizan IComando; cada comando simple navega hacia su receptor con multiplicidad 1 y MacroComando agrega uno o más IComando, lo que expresa la estructura compuesta. Las constantes de Ventilador aparecen subrayadas por ser miembros estáticos. El cliente depende de ControlRemoto e IComando mediante «create», y una nota aclara que también crea los receptores.</w:t>
       </w:r>
     </w:p>
     <w:p>
@@ -3692,7 +3916,7 @@
         </w:rPr>
         <w:drawing>
           <wp:inline distT="0" distB="0" distL="0" distR="0">
-            <wp:extent cx="5394960" cy="3721311"/>
+            <wp:extent cx="5394960" cy="4957721"/>
             <wp:effectExtent l="0" t="0" r="0" b="0"/>
             <wp:docPr id="905" name="Figura 5"/>
             <wp:cNvGraphicFramePr>
@@ -3714,7 +3938,7 @@
                   <pic:spPr>
                     <a:xfrm>
                       <a:off x="0" y="0"/>
-                      <a:ext cx="5394960" cy="3721311"/>
+                      <a:ext cx="5394960" cy="4957721"/>
                     </a:xfrm>
                     <a:prstGeom prst="rect">
                       <a:avLst/>
@@ -3794,27 +4018,17 @@
       <w:r>
         <w:rPr>
           <w:rFonts w:asciiTheme="minorHAnsi" w:hAnsiTheme="minorHAnsi" w:cstheme="minorHAnsi"/>
-          <w:b/>
-          <w:bCs/>
-          <w:color w:val="767171" w:themeColor="background2" w:themeShade="80"/>
-          <w:sz w:val="20"/>
-          <w:szCs w:val="20"/>
-        </w:rPr>
-        <w:t xml:space="preserve">Repositorio / enlace:</w:t>
-      </w:r>
-      <w:r>
-        <w:rPr>
-          <w:rFonts w:asciiTheme="minorHAnsi" w:hAnsiTheme="minorHAnsi" w:cstheme="minorHAnsi"/>
-          <w:color w:val="767171" w:themeColor="background2" w:themeShade="80"/>
-          <w:sz w:val="20"/>
-          <w:szCs w:val="20"/>
-        </w:rPr>
-        <w:t xml:space="preserve"> https://github.com/carytnas/PDS_Actividad03_Grupo02/tree/main/codigo/ejercicios/src/command</w:t>
-      </w:r>
-    </w:p>
-    <w:p>
-      <w:pPr>
-        <w:pStyle w:val="NormalWeb"/>
+          <w:color w:val="767171" w:themeColor="background2" w:themeShade="80"/>
+          <w:sz w:val="20"/>
+          <w:szCs w:val="20"/>
+        </w:rPr>
+        <w:t xml:space="preserve">Repositorio / enlace: https://github.com/carytnas/PDS_Actividad03_Grupo02/tree/main/codigo/ejercicios/src/command</w:t>
+      </w:r>
+    </w:p>
+    <w:p>
+      <w:pPr>
+        <w:pStyle w:val="NormalWeb"/>
+        <w:keepNext/>
         <w:shd w:val="clear" w:color="auto" w:fill="FFFFFF"/>
         <w:spacing w:line="360" w:lineRule="auto"/>
         <w:jc w:val="both"/>
@@ -3826,7 +4040,7 @@
           <w:sz w:val="20"/>
           <w:szCs w:val="20"/>
         </w:rPr>
-        <w:t xml:space="preserve">Se muestran el invocador y uno de los comandos:</w:t>
+        <w:t xml:space="preserve">Se muestran el invocador y uno de los comandos concretos:</w:t>
       </w:r>
     </w:p>
     <w:p>
@@ -3888,6 +4102,58 @@
     <w:p>
       <w:pPr>
         <w:pStyle w:val="NormalWeb"/>
+        <w:keepNext/>
+        <w:shd w:val="clear" w:color="auto" w:fill="F2F2F2"/>
+        <w:spacing w:before="0" w:beforeAutospacing="0" w:after="0" w:afterAutospacing="0" w:line="240" w:lineRule="auto"/>
+        <w:jc w:val="left"/>
+      </w:pPr>
+      <w:r>
+        <w:rPr>
+          <w:rFonts w:ascii="Courier New" w:hAnsi="Courier New" w:cs="Courier New"/>
+          <w:color w:val="262626"/>
+          <w:sz w:val="14"/>
+          <w:szCs w:val="14"/>
+        </w:rPr>
+        <w:t xml:space="preserve">import java.util.ArrayDeque;</w:t>
+      </w:r>
+    </w:p>
+    <w:p>
+      <w:pPr>
+        <w:pStyle w:val="NormalWeb"/>
+        <w:shd w:val="clear" w:color="auto" w:fill="F2F2F2"/>
+        <w:spacing w:before="0" w:beforeAutospacing="0" w:after="0" w:afterAutospacing="0" w:line="240" w:lineRule="auto"/>
+        <w:jc w:val="left"/>
+      </w:pPr>
+      <w:r>
+        <w:rPr>
+          <w:rFonts w:ascii="Courier New" w:hAnsi="Courier New" w:cs="Courier New"/>
+          <w:color w:val="262626"/>
+          <w:sz w:val="14"/>
+          <w:szCs w:val="14"/>
+        </w:rPr>
+        <w:t xml:space="preserve">import java.util.Deque;</w:t>
+      </w:r>
+    </w:p>
+    <w:p>
+      <w:pPr>
+        <w:pStyle w:val="NormalWeb"/>
+        <w:shd w:val="clear" w:color="auto" w:fill="F2F2F2"/>
+        <w:spacing w:before="0" w:beforeAutospacing="0" w:after="0" w:afterAutospacing="0" w:line="240" w:lineRule="auto"/>
+        <w:jc w:val="left"/>
+      </w:pPr>
+      <w:r>
+        <w:rPr>
+          <w:rFonts w:ascii="Courier New" w:hAnsi="Courier New" w:cs="Courier New"/>
+          <w:color w:val="262626"/>
+          <w:sz w:val="14"/>
+          <w:szCs w:val="14"/>
+        </w:rPr>
+        <w:t xml:space="preserve"> </w:t>
+      </w:r>
+    </w:p>
+    <w:p>
+      <w:pPr>
+        <w:pStyle w:val="NormalWeb"/>
         <w:shd w:val="clear" w:color="auto" w:fill="F2F2F2"/>
         <w:spacing w:before="0" w:beforeAutospacing="0" w:after="0" w:afterAutospacing="0" w:line="240" w:lineRule="auto"/>
         <w:jc w:val="left"/>
@@ -3916,7 +4182,24 @@
           <w:sz w:val="14"/>
           <w:szCs w:val="14"/>
         </w:rPr>
-        <w:t xml:space="preserve">  private IComando comando;</w:t>
+        <w:t xml:space="preserve">  private final IComando[] ranuras;</w:t>
+      </w:r>
+    </w:p>
+    <w:p>
+      <w:pPr>
+        <w:pStyle w:val="NormalWeb"/>
+        <w:shd w:val="clear" w:color="auto" w:fill="F2F2F2"/>
+        <w:spacing w:before="0" w:beforeAutospacing="0" w:after="0" w:afterAutospacing="0" w:line="240" w:lineRule="auto"/>
+        <w:jc w:val="left"/>
+      </w:pPr>
+      <w:r>
+        <w:rPr>
+          <w:rFonts w:ascii="Courier New" w:hAnsi="Courier New" w:cs="Courier New"/>
+          <w:color w:val="262626"/>
+          <w:sz w:val="14"/>
+          <w:szCs w:val="14"/>
+        </w:rPr>
+        <w:t xml:space="preserve">  private final Deque&lt;IComando&gt; historial = new ArrayDeque&lt;IComando&gt;();</w:t>
       </w:r>
     </w:p>
     <w:p>
@@ -3950,24 +4233,24 @@
           <w:sz w:val="14"/>
           <w:szCs w:val="14"/>
         </w:rPr>
-        <w:t xml:space="preserve">  public void setComando(IComando comando) {</w:t>
-      </w:r>
-    </w:p>
-    <w:p>
-      <w:pPr>
-        <w:pStyle w:val="NormalWeb"/>
-        <w:shd w:val="clear" w:color="auto" w:fill="F2F2F2"/>
-        <w:spacing w:before="0" w:beforeAutospacing="0" w:after="0" w:afterAutospacing="0" w:line="240" w:lineRule="auto"/>
-        <w:jc w:val="left"/>
-      </w:pPr>
-      <w:r>
-        <w:rPr>
-          <w:rFonts w:ascii="Courier New" w:hAnsi="Courier New" w:cs="Courier New"/>
-          <w:color w:val="262626"/>
-          <w:sz w:val="14"/>
-          <w:szCs w:val="14"/>
-        </w:rPr>
-        <w:t xml:space="preserve">    this.comando = comando;</w:t>
+        <w:t xml:space="preserve">  public ControlRemoto(int numeroRanuras) {</w:t>
+      </w:r>
+    </w:p>
+    <w:p>
+      <w:pPr>
+        <w:pStyle w:val="NormalWeb"/>
+        <w:shd w:val="clear" w:color="auto" w:fill="F2F2F2"/>
+        <w:spacing w:before="0" w:beforeAutospacing="0" w:after="0" w:afterAutospacing="0" w:line="240" w:lineRule="auto"/>
+        <w:jc w:val="left"/>
+      </w:pPr>
+      <w:r>
+        <w:rPr>
+          <w:rFonts w:ascii="Courier New" w:hAnsi="Courier New" w:cs="Courier New"/>
+          <w:color w:val="262626"/>
+          <w:sz w:val="14"/>
+          <w:szCs w:val="14"/>
+        </w:rPr>
+        <w:t xml:space="preserve">    this.ranuras = new IComando[numeroRanuras];</w:t>
       </w:r>
     </w:p>
     <w:p>
@@ -4018,7 +4301,126 @@
           <w:sz w:val="14"/>
           <w:szCs w:val="14"/>
         </w:rPr>
-        <w:t xml:space="preserve">  public void presionarBoton() {</w:t>
+        <w:t xml:space="preserve">  public void asignarComando(int ranura, IComando comando) {</w:t>
+      </w:r>
+    </w:p>
+    <w:p>
+      <w:pPr>
+        <w:pStyle w:val="NormalWeb"/>
+        <w:shd w:val="clear" w:color="auto" w:fill="F2F2F2"/>
+        <w:spacing w:before="0" w:beforeAutospacing="0" w:after="0" w:afterAutospacing="0" w:line="240" w:lineRule="auto"/>
+        <w:jc w:val="left"/>
+      </w:pPr>
+      <w:r>
+        <w:rPr>
+          <w:rFonts w:ascii="Courier New" w:hAnsi="Courier New" w:cs="Courier New"/>
+          <w:color w:val="262626"/>
+          <w:sz w:val="14"/>
+          <w:szCs w:val="14"/>
+        </w:rPr>
+        <w:t xml:space="preserve">    validarRanura(ranura);</w:t>
+      </w:r>
+    </w:p>
+    <w:p>
+      <w:pPr>
+        <w:pStyle w:val="NormalWeb"/>
+        <w:shd w:val="clear" w:color="auto" w:fill="F2F2F2"/>
+        <w:spacing w:before="0" w:beforeAutospacing="0" w:after="0" w:afterAutospacing="0" w:line="240" w:lineRule="auto"/>
+        <w:jc w:val="left"/>
+      </w:pPr>
+      <w:r>
+        <w:rPr>
+          <w:rFonts w:ascii="Courier New" w:hAnsi="Courier New" w:cs="Courier New"/>
+          <w:color w:val="262626"/>
+          <w:sz w:val="14"/>
+          <w:szCs w:val="14"/>
+        </w:rPr>
+        <w:t xml:space="preserve">    ranuras[ranura] = comando;</w:t>
+      </w:r>
+    </w:p>
+    <w:p>
+      <w:pPr>
+        <w:pStyle w:val="NormalWeb"/>
+        <w:shd w:val="clear" w:color="auto" w:fill="F2F2F2"/>
+        <w:spacing w:before="0" w:beforeAutospacing="0" w:after="0" w:afterAutospacing="0" w:line="240" w:lineRule="auto"/>
+        <w:jc w:val="left"/>
+      </w:pPr>
+      <w:r>
+        <w:rPr>
+          <w:rFonts w:ascii="Courier New" w:hAnsi="Courier New" w:cs="Courier New"/>
+          <w:color w:val="262626"/>
+          <w:sz w:val="14"/>
+          <w:szCs w:val="14"/>
+        </w:rPr>
+        <w:t xml:space="preserve">  }</w:t>
+      </w:r>
+    </w:p>
+    <w:p>
+      <w:pPr>
+        <w:pStyle w:val="NormalWeb"/>
+        <w:shd w:val="clear" w:color="auto" w:fill="F2F2F2"/>
+        <w:spacing w:before="0" w:beforeAutospacing="0" w:after="0" w:afterAutospacing="0" w:line="240" w:lineRule="auto"/>
+        <w:jc w:val="left"/>
+      </w:pPr>
+      <w:r>
+        <w:rPr>
+          <w:rFonts w:ascii="Courier New" w:hAnsi="Courier New" w:cs="Courier New"/>
+          <w:color w:val="262626"/>
+          <w:sz w:val="14"/>
+          <w:szCs w:val="14"/>
+        </w:rPr>
+        <w:t xml:space="preserve"> </w:t>
+      </w:r>
+    </w:p>
+    <w:p>
+      <w:pPr>
+        <w:pStyle w:val="NormalWeb"/>
+        <w:shd w:val="clear" w:color="auto" w:fill="F2F2F2"/>
+        <w:spacing w:before="0" w:beforeAutospacing="0" w:after="0" w:afterAutospacing="0" w:line="240" w:lineRule="auto"/>
+        <w:jc w:val="left"/>
+      </w:pPr>
+      <w:r>
+        <w:rPr>
+          <w:rFonts w:ascii="Courier New" w:hAnsi="Courier New" w:cs="Courier New"/>
+          <w:color w:val="262626"/>
+          <w:sz w:val="14"/>
+          <w:szCs w:val="14"/>
+        </w:rPr>
+        <w:t xml:space="preserve">  public void presionarBoton(int ranura) {</w:t>
+      </w:r>
+    </w:p>
+    <w:p>
+      <w:pPr>
+        <w:pStyle w:val="NormalWeb"/>
+        <w:shd w:val="clear" w:color="auto" w:fill="F2F2F2"/>
+        <w:spacing w:before="0" w:beforeAutospacing="0" w:after="0" w:afterAutospacing="0" w:line="240" w:lineRule="auto"/>
+        <w:jc w:val="left"/>
+      </w:pPr>
+      <w:r>
+        <w:rPr>
+          <w:rFonts w:ascii="Courier New" w:hAnsi="Courier New" w:cs="Courier New"/>
+          <w:color w:val="262626"/>
+          <w:sz w:val="14"/>
+          <w:szCs w:val="14"/>
+        </w:rPr>
+        <w:t xml:space="preserve">    validarRanura(ranura);</w:t>
+      </w:r>
+    </w:p>
+    <w:p>
+      <w:pPr>
+        <w:pStyle w:val="NormalWeb"/>
+        <w:shd w:val="clear" w:color="auto" w:fill="F2F2F2"/>
+        <w:spacing w:before="0" w:beforeAutospacing="0" w:after="0" w:afterAutospacing="0" w:line="240" w:lineRule="auto"/>
+        <w:jc w:val="left"/>
+      </w:pPr>
+      <w:r>
+        <w:rPr>
+          <w:rFonts w:ascii="Courier New" w:hAnsi="Courier New" w:cs="Courier New"/>
+          <w:color w:val="262626"/>
+          <w:sz w:val="14"/>
+          <w:szCs w:val="14"/>
+        </w:rPr>
+        <w:t xml:space="preserve">    IComando comando = ranuras[ranura];</w:t>
       </w:r>
     </w:p>
     <w:p>
@@ -4052,7 +4454,7 @@
           <w:sz w:val="14"/>
           <w:szCs w:val="14"/>
         </w:rPr>
-        <w:t xml:space="preserve">      System.out.println("No hay ningún comando asignado en el control remoto.");</w:t>
+        <w:t xml:space="preserve">      System.out.println("El botón " + ranura + " no tiene ningún comando asignado.");</w:t>
       </w:r>
     </w:p>
     <w:p>
@@ -4109,7 +4511,261 @@
     <w:p>
       <w:pPr>
         <w:pStyle w:val="NormalWeb"/>
-        <w:keepNext/>
+        <w:shd w:val="clear" w:color="auto" w:fill="F2F2F2"/>
+        <w:spacing w:before="0" w:beforeAutospacing="0" w:after="0" w:afterAutospacing="0" w:line="240" w:lineRule="auto"/>
+        <w:jc w:val="left"/>
+      </w:pPr>
+      <w:r>
+        <w:rPr>
+          <w:rFonts w:ascii="Courier New" w:hAnsi="Courier New" w:cs="Courier New"/>
+          <w:color w:val="262626"/>
+          <w:sz w:val="14"/>
+          <w:szCs w:val="14"/>
+        </w:rPr>
+        <w:t xml:space="preserve">    historial.push(comando);</w:t>
+      </w:r>
+    </w:p>
+    <w:p>
+      <w:pPr>
+        <w:pStyle w:val="NormalWeb"/>
+        <w:shd w:val="clear" w:color="auto" w:fill="F2F2F2"/>
+        <w:spacing w:before="0" w:beforeAutospacing="0" w:after="0" w:afterAutospacing="0" w:line="240" w:lineRule="auto"/>
+        <w:jc w:val="left"/>
+      </w:pPr>
+      <w:r>
+        <w:rPr>
+          <w:rFonts w:ascii="Courier New" w:hAnsi="Courier New" w:cs="Courier New"/>
+          <w:color w:val="262626"/>
+          <w:sz w:val="14"/>
+          <w:szCs w:val="14"/>
+        </w:rPr>
+        <w:t xml:space="preserve">  }</w:t>
+      </w:r>
+    </w:p>
+    <w:p>
+      <w:pPr>
+        <w:pStyle w:val="NormalWeb"/>
+        <w:shd w:val="clear" w:color="auto" w:fill="F2F2F2"/>
+        <w:spacing w:before="0" w:beforeAutospacing="0" w:after="0" w:afterAutospacing="0" w:line="240" w:lineRule="auto"/>
+        <w:jc w:val="left"/>
+      </w:pPr>
+      <w:r>
+        <w:rPr>
+          <w:rFonts w:ascii="Courier New" w:hAnsi="Courier New" w:cs="Courier New"/>
+          <w:color w:val="262626"/>
+          <w:sz w:val="14"/>
+          <w:szCs w:val="14"/>
+        </w:rPr>
+        <w:t xml:space="preserve"> </w:t>
+      </w:r>
+    </w:p>
+    <w:p>
+      <w:pPr>
+        <w:pStyle w:val="NormalWeb"/>
+        <w:shd w:val="clear" w:color="auto" w:fill="F2F2F2"/>
+        <w:spacing w:before="0" w:beforeAutospacing="0" w:after="0" w:afterAutospacing="0" w:line="240" w:lineRule="auto"/>
+        <w:jc w:val="left"/>
+      </w:pPr>
+      <w:r>
+        <w:rPr>
+          <w:rFonts w:ascii="Courier New" w:hAnsi="Courier New" w:cs="Courier New"/>
+          <w:color w:val="262626"/>
+          <w:sz w:val="14"/>
+          <w:szCs w:val="14"/>
+        </w:rPr>
+        <w:t xml:space="preserve">  public void presionarDeshacer() {</w:t>
+      </w:r>
+    </w:p>
+    <w:p>
+      <w:pPr>
+        <w:pStyle w:val="NormalWeb"/>
+        <w:shd w:val="clear" w:color="auto" w:fill="F2F2F2"/>
+        <w:spacing w:before="0" w:beforeAutospacing="0" w:after="0" w:afterAutospacing="0" w:line="240" w:lineRule="auto"/>
+        <w:jc w:val="left"/>
+      </w:pPr>
+      <w:r>
+        <w:rPr>
+          <w:rFonts w:ascii="Courier New" w:hAnsi="Courier New" w:cs="Courier New"/>
+          <w:color w:val="262626"/>
+          <w:sz w:val="14"/>
+          <w:szCs w:val="14"/>
+        </w:rPr>
+        <w:t xml:space="preserve">    if (historial.isEmpty()) {</w:t>
+      </w:r>
+    </w:p>
+    <w:p>
+      <w:pPr>
+        <w:pStyle w:val="NormalWeb"/>
+        <w:shd w:val="clear" w:color="auto" w:fill="F2F2F2"/>
+        <w:spacing w:before="0" w:beforeAutospacing="0" w:after="0" w:afterAutospacing="0" w:line="240" w:lineRule="auto"/>
+        <w:jc w:val="left"/>
+      </w:pPr>
+      <w:r>
+        <w:rPr>
+          <w:rFonts w:ascii="Courier New" w:hAnsi="Courier New" w:cs="Courier New"/>
+          <w:color w:val="262626"/>
+          <w:sz w:val="14"/>
+          <w:szCs w:val="14"/>
+        </w:rPr>
+        <w:t xml:space="preserve">      System.out.println("No hay acciones para deshacer.");</w:t>
+      </w:r>
+    </w:p>
+    <w:p>
+      <w:pPr>
+        <w:pStyle w:val="NormalWeb"/>
+        <w:shd w:val="clear" w:color="auto" w:fill="F2F2F2"/>
+        <w:spacing w:before="0" w:beforeAutospacing="0" w:after="0" w:afterAutospacing="0" w:line="240" w:lineRule="auto"/>
+        <w:jc w:val="left"/>
+      </w:pPr>
+      <w:r>
+        <w:rPr>
+          <w:rFonts w:ascii="Courier New" w:hAnsi="Courier New" w:cs="Courier New"/>
+          <w:color w:val="262626"/>
+          <w:sz w:val="14"/>
+          <w:szCs w:val="14"/>
+        </w:rPr>
+        <w:t xml:space="preserve">      return;</w:t>
+      </w:r>
+    </w:p>
+    <w:p>
+      <w:pPr>
+        <w:pStyle w:val="NormalWeb"/>
+        <w:shd w:val="clear" w:color="auto" w:fill="F2F2F2"/>
+        <w:spacing w:before="0" w:beforeAutospacing="0" w:after="0" w:afterAutospacing="0" w:line="240" w:lineRule="auto"/>
+        <w:jc w:val="left"/>
+      </w:pPr>
+      <w:r>
+        <w:rPr>
+          <w:rFonts w:ascii="Courier New" w:hAnsi="Courier New" w:cs="Courier New"/>
+          <w:color w:val="262626"/>
+          <w:sz w:val="14"/>
+          <w:szCs w:val="14"/>
+        </w:rPr>
+        <w:t xml:space="preserve">    }</w:t>
+      </w:r>
+    </w:p>
+    <w:p>
+      <w:pPr>
+        <w:pStyle w:val="NormalWeb"/>
+        <w:shd w:val="clear" w:color="auto" w:fill="F2F2F2"/>
+        <w:spacing w:before="0" w:beforeAutospacing="0" w:after="0" w:afterAutospacing="0" w:line="240" w:lineRule="auto"/>
+        <w:jc w:val="left"/>
+      </w:pPr>
+      <w:r>
+        <w:rPr>
+          <w:rFonts w:ascii="Courier New" w:hAnsi="Courier New" w:cs="Courier New"/>
+          <w:color w:val="262626"/>
+          <w:sz w:val="14"/>
+          <w:szCs w:val="14"/>
+        </w:rPr>
+        <w:t xml:space="preserve">    historial.pop().deshacer();</w:t>
+      </w:r>
+    </w:p>
+    <w:p>
+      <w:pPr>
+        <w:pStyle w:val="NormalWeb"/>
+        <w:shd w:val="clear" w:color="auto" w:fill="F2F2F2"/>
+        <w:spacing w:before="0" w:beforeAutospacing="0" w:after="0" w:afterAutospacing="0" w:line="240" w:lineRule="auto"/>
+        <w:jc w:val="left"/>
+      </w:pPr>
+      <w:r>
+        <w:rPr>
+          <w:rFonts w:ascii="Courier New" w:hAnsi="Courier New" w:cs="Courier New"/>
+          <w:color w:val="262626"/>
+          <w:sz w:val="14"/>
+          <w:szCs w:val="14"/>
+        </w:rPr>
+        <w:t xml:space="preserve">  }</w:t>
+      </w:r>
+    </w:p>
+    <w:p>
+      <w:pPr>
+        <w:pStyle w:val="NormalWeb"/>
+        <w:shd w:val="clear" w:color="auto" w:fill="F2F2F2"/>
+        <w:spacing w:before="0" w:beforeAutospacing="0" w:after="0" w:afterAutospacing="0" w:line="240" w:lineRule="auto"/>
+        <w:jc w:val="left"/>
+      </w:pPr>
+      <w:r>
+        <w:rPr>
+          <w:rFonts w:ascii="Courier New" w:hAnsi="Courier New" w:cs="Courier New"/>
+          <w:color w:val="262626"/>
+          <w:sz w:val="14"/>
+          <w:szCs w:val="14"/>
+        </w:rPr>
+        <w:t xml:space="preserve"> </w:t>
+      </w:r>
+    </w:p>
+    <w:p>
+      <w:pPr>
+        <w:pStyle w:val="NormalWeb"/>
+        <w:shd w:val="clear" w:color="auto" w:fill="F2F2F2"/>
+        <w:spacing w:before="0" w:beforeAutospacing="0" w:after="0" w:afterAutospacing="0" w:line="240" w:lineRule="auto"/>
+        <w:jc w:val="left"/>
+      </w:pPr>
+      <w:r>
+        <w:rPr>
+          <w:rFonts w:ascii="Courier New" w:hAnsi="Courier New" w:cs="Courier New"/>
+          <w:color w:val="262626"/>
+          <w:sz w:val="14"/>
+          <w:szCs w:val="14"/>
+        </w:rPr>
+        <w:t xml:space="preserve">  private void validarRanura(int ranura) {</w:t>
+      </w:r>
+    </w:p>
+    <w:p>
+      <w:pPr>
+        <w:pStyle w:val="NormalWeb"/>
+        <w:shd w:val="clear" w:color="auto" w:fill="F2F2F2"/>
+        <w:spacing w:before="0" w:beforeAutospacing="0" w:after="0" w:afterAutospacing="0" w:line="240" w:lineRule="auto"/>
+        <w:jc w:val="left"/>
+      </w:pPr>
+      <w:r>
+        <w:rPr>
+          <w:rFonts w:ascii="Courier New" w:hAnsi="Courier New" w:cs="Courier New"/>
+          <w:color w:val="262626"/>
+          <w:sz w:val="14"/>
+          <w:szCs w:val="14"/>
+        </w:rPr>
+        <w:t xml:space="preserve">    if (ranura &lt; 0 || ranura &gt;= ranuras.length) {</w:t>
+      </w:r>
+    </w:p>
+    <w:p>
+      <w:pPr>
+        <w:pStyle w:val="NormalWeb"/>
+        <w:shd w:val="clear" w:color="auto" w:fill="F2F2F2"/>
+        <w:spacing w:before="0" w:beforeAutospacing="0" w:after="0" w:afterAutospacing="0" w:line="240" w:lineRule="auto"/>
+        <w:jc w:val="left"/>
+      </w:pPr>
+      <w:r>
+        <w:rPr>
+          <w:rFonts w:ascii="Courier New" w:hAnsi="Courier New" w:cs="Courier New"/>
+          <w:color w:val="262626"/>
+          <w:sz w:val="14"/>
+          <w:szCs w:val="14"/>
+        </w:rPr>
+        <w:t xml:space="preserve">      throw new IllegalArgumentException("El control solo tiene los botones 0 a " + (ranuras.length - 1) + ".");</w:t>
+      </w:r>
+    </w:p>
+    <w:p>
+      <w:pPr>
+        <w:pStyle w:val="NormalWeb"/>
+        <w:shd w:val="clear" w:color="auto" w:fill="F2F2F2"/>
+        <w:spacing w:before="0" w:beforeAutospacing="0" w:after="0" w:afterAutospacing="0" w:line="240" w:lineRule="auto"/>
+        <w:jc w:val="left"/>
+      </w:pPr>
+      <w:r>
+        <w:rPr>
+          <w:rFonts w:ascii="Courier New" w:hAnsi="Courier New" w:cs="Courier New"/>
+          <w:color w:val="262626"/>
+          <w:sz w:val="14"/>
+          <w:szCs w:val="14"/>
+        </w:rPr>
+        <w:t xml:space="preserve">    }</w:t>
+      </w:r>
+    </w:p>
+    <w:p>
+      <w:pPr>
+        <w:pStyle w:val="NormalWeb"/>
         <w:shd w:val="clear" w:color="auto" w:fill="F2F2F2"/>
         <w:spacing w:before="0" w:beforeAutospacing="0" w:after="0" w:afterAutospacing="0" w:line="240" w:lineRule="auto"/>
         <w:jc w:val="left"/>
@@ -4200,6 +4856,58 @@
     <w:p>
       <w:pPr>
         <w:pStyle w:val="NormalWeb"/>
+        <w:keepNext/>
+        <w:shd w:val="clear" w:color="auto" w:fill="F2F2F2"/>
+        <w:spacing w:before="0" w:beforeAutospacing="0" w:after="0" w:afterAutospacing="0" w:line="240" w:lineRule="auto"/>
+        <w:jc w:val="left"/>
+      </w:pPr>
+      <w:r>
+        <w:rPr>
+          <w:rFonts w:ascii="Courier New" w:hAnsi="Courier New" w:cs="Courier New"/>
+          <w:color w:val="262626"/>
+          <w:sz w:val="14"/>
+          <w:szCs w:val="14"/>
+        </w:rPr>
+        <w:t xml:space="preserve">import java.util.ArrayDeque;</w:t>
+      </w:r>
+    </w:p>
+    <w:p>
+      <w:pPr>
+        <w:pStyle w:val="NormalWeb"/>
+        <w:shd w:val="clear" w:color="auto" w:fill="F2F2F2"/>
+        <w:spacing w:before="0" w:beforeAutospacing="0" w:after="0" w:afterAutospacing="0" w:line="240" w:lineRule="auto"/>
+        <w:jc w:val="left"/>
+      </w:pPr>
+      <w:r>
+        <w:rPr>
+          <w:rFonts w:ascii="Courier New" w:hAnsi="Courier New" w:cs="Courier New"/>
+          <w:color w:val="262626"/>
+          <w:sz w:val="14"/>
+          <w:szCs w:val="14"/>
+        </w:rPr>
+        <w:t xml:space="preserve">import java.util.Deque;</w:t>
+      </w:r>
+    </w:p>
+    <w:p>
+      <w:pPr>
+        <w:pStyle w:val="NormalWeb"/>
+        <w:shd w:val="clear" w:color="auto" w:fill="F2F2F2"/>
+        <w:spacing w:before="0" w:beforeAutospacing="0" w:after="0" w:afterAutospacing="0" w:line="240" w:lineRule="auto"/>
+        <w:jc w:val="left"/>
+      </w:pPr>
+      <w:r>
+        <w:rPr>
+          <w:rFonts w:ascii="Courier New" w:hAnsi="Courier New" w:cs="Courier New"/>
+          <w:color w:val="262626"/>
+          <w:sz w:val="14"/>
+          <w:szCs w:val="14"/>
+        </w:rPr>
+        <w:t xml:space="preserve"> </w:t>
+      </w:r>
+    </w:p>
+    <w:p>
+      <w:pPr>
+        <w:pStyle w:val="NormalWeb"/>
         <w:shd w:val="clear" w:color="auto" w:fill="F2F2F2"/>
         <w:spacing w:before="0" w:beforeAutospacing="0" w:after="0" w:afterAutospacing="0" w:line="240" w:lineRule="auto"/>
         <w:jc w:val="left"/>
@@ -4228,7 +4936,41 @@
           <w:sz w:val="14"/>
           <w:szCs w:val="14"/>
         </w:rPr>
-        <w:t xml:space="preserve">  private Luz luz;</w:t>
+        <w:t xml:space="preserve">  private final Luz luz;</w:t>
+      </w:r>
+    </w:p>
+    <w:p>
+      <w:pPr>
+        <w:pStyle w:val="NormalWeb"/>
+        <w:shd w:val="clear" w:color="auto" w:fill="F2F2F2"/>
+        <w:spacing w:before="0" w:beforeAutospacing="0" w:after="0" w:afterAutospacing="0" w:line="240" w:lineRule="auto"/>
+        <w:jc w:val="left"/>
+      </w:pPr>
+      <w:r>
+        <w:rPr>
+          <w:rFonts w:ascii="Courier New" w:hAnsi="Courier New" w:cs="Courier New"/>
+          <w:color w:val="262626"/>
+          <w:sz w:val="14"/>
+          <w:szCs w:val="14"/>
+        </w:rPr>
+        <w:t xml:space="preserve">  // Pila y no un solo campo: el mismo comando puede ejecutarse varias veces antes de deshacerse.</w:t>
+      </w:r>
+    </w:p>
+    <w:p>
+      <w:pPr>
+        <w:pStyle w:val="NormalWeb"/>
+        <w:shd w:val="clear" w:color="auto" w:fill="F2F2F2"/>
+        <w:spacing w:before="0" w:beforeAutospacing="0" w:after="0" w:afterAutospacing="0" w:line="240" w:lineRule="auto"/>
+        <w:jc w:val="left"/>
+      </w:pPr>
+      <w:r>
+        <w:rPr>
+          <w:rFonts w:ascii="Courier New" w:hAnsi="Courier New" w:cs="Courier New"/>
+          <w:color w:val="262626"/>
+          <w:sz w:val="14"/>
+          <w:szCs w:val="14"/>
+        </w:rPr>
+        <w:t xml:space="preserve">  private final Deque&lt;Boolean&gt; estadosPrevios = new ArrayDeque&lt;Boolean&gt;();</w:t>
       </w:r>
     </w:p>
     <w:p>
@@ -4381,13 +5123,29 @@
           <w:sz w:val="14"/>
           <w:szCs w:val="14"/>
         </w:rPr>
+        <w:t xml:space="preserve">    estadosPrevios.push(luz.estaEncendida());</w:t>
+      </w:r>
+    </w:p>
+    <w:p>
+      <w:pPr>
+        <w:pStyle w:val="NormalWeb"/>
+        <w:shd w:val="clear" w:color="auto" w:fill="F2F2F2"/>
+        <w:spacing w:before="0" w:beforeAutospacing="0" w:after="0" w:afterAutospacing="0" w:line="240" w:lineRule="auto"/>
+        <w:jc w:val="left"/>
+      </w:pPr>
+      <w:r>
+        <w:rPr>
+          <w:rFonts w:ascii="Courier New" w:hAnsi="Courier New" w:cs="Courier New"/>
+          <w:color w:val="262626"/>
+          <w:sz w:val="14"/>
+          <w:szCs w:val="14"/>
+        </w:rPr>
         <w:t xml:space="preserve">    luz.encender();</w:t>
       </w:r>
     </w:p>
     <w:p>
       <w:pPr>
         <w:pStyle w:val="NormalWeb"/>
-        <w:keepNext/>
         <w:shd w:val="clear" w:color="auto" w:fill="F2F2F2"/>
         <w:spacing w:before="0" w:beforeAutospacing="0" w:after="0" w:afterAutospacing="0" w:line="240" w:lineRule="auto"/>
         <w:jc w:val="left"/>
@@ -4406,6 +5164,142 @@
       <w:pPr>
         <w:pStyle w:val="NormalWeb"/>
         <w:shd w:val="clear" w:color="auto" w:fill="F2F2F2"/>
+        <w:spacing w:before="0" w:beforeAutospacing="0" w:after="0" w:afterAutospacing="0" w:line="240" w:lineRule="auto"/>
+        <w:jc w:val="left"/>
+      </w:pPr>
+      <w:r>
+        <w:rPr>
+          <w:rFonts w:ascii="Courier New" w:hAnsi="Courier New" w:cs="Courier New"/>
+          <w:color w:val="262626"/>
+          <w:sz w:val="14"/>
+          <w:szCs w:val="14"/>
+        </w:rPr>
+        <w:t xml:space="preserve"> </w:t>
+      </w:r>
+    </w:p>
+    <w:p>
+      <w:pPr>
+        <w:pStyle w:val="NormalWeb"/>
+        <w:shd w:val="clear" w:color="auto" w:fill="F2F2F2"/>
+        <w:spacing w:before="0" w:beforeAutospacing="0" w:after="0" w:afterAutospacing="0" w:line="240" w:lineRule="auto"/>
+        <w:jc w:val="left"/>
+      </w:pPr>
+      <w:r>
+        <w:rPr>
+          <w:rFonts w:ascii="Courier New" w:hAnsi="Courier New" w:cs="Courier New"/>
+          <w:color w:val="262626"/>
+          <w:sz w:val="14"/>
+          <w:szCs w:val="14"/>
+        </w:rPr>
+        <w:t xml:space="preserve">  @Override</w:t>
+      </w:r>
+    </w:p>
+    <w:p>
+      <w:pPr>
+        <w:pStyle w:val="NormalWeb"/>
+        <w:shd w:val="clear" w:color="auto" w:fill="F2F2F2"/>
+        <w:spacing w:before="0" w:beforeAutospacing="0" w:after="0" w:afterAutospacing="0" w:line="240" w:lineRule="auto"/>
+        <w:jc w:val="left"/>
+      </w:pPr>
+      <w:r>
+        <w:rPr>
+          <w:rFonts w:ascii="Courier New" w:hAnsi="Courier New" w:cs="Courier New"/>
+          <w:color w:val="262626"/>
+          <w:sz w:val="14"/>
+          <w:szCs w:val="14"/>
+        </w:rPr>
+        <w:t xml:space="preserve">  public void deshacer() {</w:t>
+      </w:r>
+    </w:p>
+    <w:p>
+      <w:pPr>
+        <w:pStyle w:val="NormalWeb"/>
+        <w:shd w:val="clear" w:color="auto" w:fill="F2F2F2"/>
+        <w:spacing w:before="0" w:beforeAutospacing="0" w:after="0" w:afterAutospacing="0" w:line="240" w:lineRule="auto"/>
+        <w:jc w:val="left"/>
+      </w:pPr>
+      <w:r>
+        <w:rPr>
+          <w:rFonts w:ascii="Courier New" w:hAnsi="Courier New" w:cs="Courier New"/>
+          <w:color w:val="262626"/>
+          <w:sz w:val="14"/>
+          <w:szCs w:val="14"/>
+        </w:rPr>
+        <w:t xml:space="preserve">    System.out.println("[Comando] Deshaciendo: Encender luz.");</w:t>
+      </w:r>
+    </w:p>
+    <w:p>
+      <w:pPr>
+        <w:pStyle w:val="NormalWeb"/>
+        <w:shd w:val="clear" w:color="auto" w:fill="F2F2F2"/>
+        <w:spacing w:before="0" w:beforeAutospacing="0" w:after="0" w:afterAutospacing="0" w:line="240" w:lineRule="auto"/>
+        <w:jc w:val="left"/>
+      </w:pPr>
+      <w:r>
+        <w:rPr>
+          <w:rFonts w:ascii="Courier New" w:hAnsi="Courier New" w:cs="Courier New"/>
+          <w:color w:val="262626"/>
+          <w:sz w:val="14"/>
+          <w:szCs w:val="14"/>
+        </w:rPr>
+        <w:t xml:space="preserve">    if (!estadosPrevios.pop()) {</w:t>
+      </w:r>
+    </w:p>
+    <w:p>
+      <w:pPr>
+        <w:pStyle w:val="NormalWeb"/>
+        <w:shd w:val="clear" w:color="auto" w:fill="F2F2F2"/>
+        <w:spacing w:before="0" w:beforeAutospacing="0" w:after="0" w:afterAutospacing="0" w:line="240" w:lineRule="auto"/>
+        <w:jc w:val="left"/>
+      </w:pPr>
+      <w:r>
+        <w:rPr>
+          <w:rFonts w:ascii="Courier New" w:hAnsi="Courier New" w:cs="Courier New"/>
+          <w:color w:val="262626"/>
+          <w:sz w:val="14"/>
+          <w:szCs w:val="14"/>
+        </w:rPr>
+        <w:t xml:space="preserve">      luz.apagar();</w:t>
+      </w:r>
+    </w:p>
+    <w:p>
+      <w:pPr>
+        <w:pStyle w:val="NormalWeb"/>
+        <w:shd w:val="clear" w:color="auto" w:fill="F2F2F2"/>
+        <w:spacing w:before="0" w:beforeAutospacing="0" w:after="0" w:afterAutospacing="0" w:line="240" w:lineRule="auto"/>
+        <w:jc w:val="left"/>
+      </w:pPr>
+      <w:r>
+        <w:rPr>
+          <w:rFonts w:ascii="Courier New" w:hAnsi="Courier New" w:cs="Courier New"/>
+          <w:color w:val="262626"/>
+          <w:sz w:val="14"/>
+          <w:szCs w:val="14"/>
+        </w:rPr>
+        <w:t xml:space="preserve">    }</w:t>
+      </w:r>
+    </w:p>
+    <w:p>
+      <w:pPr>
+        <w:pStyle w:val="NormalWeb"/>
+        <w:shd w:val="clear" w:color="auto" w:fill="F2F2F2"/>
+        <w:spacing w:before="0" w:beforeAutospacing="0" w:after="0" w:afterAutospacing="0" w:line="240" w:lineRule="auto"/>
+        <w:jc w:val="left"/>
+      </w:pPr>
+      <w:r>
+        <w:rPr>
+          <w:rFonts w:ascii="Courier New" w:hAnsi="Courier New" w:cs="Courier New"/>
+          <w:color w:val="262626"/>
+          <w:sz w:val="14"/>
+          <w:szCs w:val="14"/>
+        </w:rPr>
+        <w:t xml:space="preserve">  }</w:t>
+      </w:r>
+    </w:p>
+    <w:p>
+      <w:pPr>
+        <w:pStyle w:val="NormalWeb"/>
+        <w:shd w:val="clear" w:color="auto" w:fill="F2F2F2"/>
         <w:spacing w:before="0" w:beforeAutospacing="0" w:after="160" w:afterAutospacing="0" w:line="240" w:lineRule="auto"/>
         <w:jc w:val="left"/>
       </w:pPr>
@@ -4417,6 +5311,23 @@
           <w:szCs w:val="14"/>
         </w:rPr>
         <w:t xml:space="preserve">}</w:t>
+      </w:r>
+    </w:p>
+    <w:p>
+      <w:pPr>
+        <w:pStyle w:val="NormalWeb"/>
+        <w:shd w:val="clear" w:color="auto" w:fill="FFFFFF"/>
+        <w:spacing w:line="360" w:lineRule="auto"/>
+        <w:jc w:val="both"/>
+      </w:pPr>
+      <w:r>
+        <w:rPr>
+          <w:rFonts w:asciiTheme="minorHAnsi" w:hAnsiTheme="minorHAnsi" w:cstheme="minorHAnsi"/>
+          <w:color w:val="767171" w:themeColor="background2" w:themeShade="80"/>
+          <w:sz w:val="20"/>
+          <w:szCs w:val="20"/>
+        </w:rPr>
+        <w:t xml:space="preserve">Un detalle de implementación merece mención. Cada comando guarda sus estados previos en una pila y no en un único campo, porque el mismo objeto puede ejecutarse varias veces antes de deshacerse (por ejemplo, si se presiona dos veces el mismo botón). Con un solo campo, la segunda ejecución sobrescribiría el estado de la primera y el segundo deshacer dejaría la luz en un estado incorrecto. Como el historial del control es LIFO, las pilas de cada comando se vacían en el mismo orden.</w:t>
       </w:r>
     </w:p>
     <w:p>
@@ -4433,7 +5344,7 @@
         </w:rPr>
         <w:drawing>
           <wp:inline distT="0" distB="0" distL="0" distR="0">
-            <wp:extent cx="3657600" cy="1330683"/>
+            <wp:extent cx="4572000" cy="3801978"/>
             <wp:effectExtent l="0" t="0" r="0" b="0"/>
             <wp:docPr id="906" name="Figura 6"/>
             <wp:cNvGraphicFramePr>
@@ -4455,7 +5366,7 @@
                   <pic:spPr>
                     <a:xfrm>
                       <a:off x="0" y="0"/>
-                      <a:ext cx="3657600" cy="1330683"/>
+                      <a:ext cx="4572000" cy="3801978"/>
                     </a:xfrm>
                     <a:prstGeom prst="rect">
                       <a:avLst/>
@@ -4554,7 +5465,7 @@
           <w:sz w:val="20"/>
           <w:szCs w:val="20"/>
         </w:rPr>
-        <w:t xml:space="preserve"> el control ya no depende de la luz y un botón puede cambiar de acción en ejecución.</w:t>
+        <w:t xml:space="preserve"> el control quedó desacoplado de los dispositivos, un botón puede cambiar de acción en ejecución y cualquier acción, incluida una escena, se puede deshacer.</w:t>
       </w:r>
     </w:p>
     <w:p>
@@ -4577,16 +5488,16 @@
           <w:sz w:val="20"/>
           <w:szCs w:val="20"/>
         </w:rPr>
-        <w:t xml:space="preserve">Qué mejoró:</w:t>
-      </w:r>
-      <w:r>
-        <w:rPr>
-          <w:rFonts w:asciiTheme="minorHAnsi" w:hAnsiTheme="minorHAnsi" w:cstheme="minorHAnsi"/>
-          <w:color w:val="767171" w:themeColor="background2" w:themeShade="80"/>
-          <w:sz w:val="20"/>
-          <w:szCs w:val="20"/>
-        </w:rPr>
-        <w:t xml:space="preserve"> una acción nueva es una clase nueva; ControlRemoto no se modifica y no tiene condicionales. Además, deja la puerta abierta a un historial o a deshacer, que no están implementados.</w:t>
+        <w:t xml:space="preserve">Qué mejoró respecto de la solución directa:</w:t>
+      </w:r>
+      <w:r>
+        <w:rPr>
+          <w:rFonts w:asciiTheme="minorHAnsi" w:hAnsiTheme="minorHAnsi" w:cstheme="minorHAnsi"/>
+          <w:color w:val="767171" w:themeColor="background2" w:themeShade="80"/>
+          <w:sz w:val="20"/>
+          <w:szCs w:val="20"/>
+        </w:rPr>
+        <w:t xml:space="preserve"> incorporar el ventilador consistió en crear un receptor y un comando nuevos; ControlRemoto no se modificó y no contiene condicionales. Lo mismo ocurrió con la escena: MacroComando combina comandos existentes sin cambiarlos. En la versión directa cada uno de esos cambios habría tocado el control.</w:t>
       </w:r>
     </w:p>
     <w:p>
@@ -4609,16 +5520,16 @@
           <w:sz w:val="20"/>
           <w:szCs w:val="20"/>
         </w:rPr>
-        <w:t xml:space="preserve">Costo:</w:t>
-      </w:r>
-      <w:r>
-        <w:rPr>
-          <w:rFonts w:asciiTheme="minorHAnsi" w:hAnsiTheme="minorHAnsi" w:cstheme="minorHAnsi"/>
-          <w:color w:val="767171" w:themeColor="background2" w:themeShade="80"/>
-          <w:sz w:val="20"/>
-          <w:szCs w:val="20"/>
-        </w:rPr>
-        <w:t xml:space="preserve"> una clase por acción y una llamada intermedia. Deshacer exigiría guardar el estado anterior de la luz.</w:t>
+        <w:t xml:space="preserve">Costos y complejidad:</w:t>
+      </w:r>
+      <w:r>
+        <w:rPr>
+          <w:rFonts w:asciiTheme="minorHAnsi" w:hAnsiTheme="minorHAnsi" w:cstheme="minorHAnsi"/>
+          <w:color w:val="767171" w:themeColor="background2" w:themeShade="80"/>
+          <w:sz w:val="20"/>
+          <w:szCs w:val="20"/>
+        </w:rPr>
+        <w:t xml:space="preserve"> una clase por acción, una indirección adicional en cada llamada y una responsabilidad nueva para cada comando: saber revertirse. El historial crece sin límite y en un dispositivo real habría que acotarlo, por ejemplo a las últimas veinte acciones. El deshacer supone, además, que nadie modifica el dispositivo por fuera del control; si alguien enciende la luz desde la pared, el estado guardado deja de ser confiable.</w:t>
       </w:r>
     </w:p>
     <w:p>
@@ -4650,7 +5561,7 @@
           <w:sz w:val="20"/>
           <w:szCs w:val="20"/>
         </w:rPr>
-        <w:t xml:space="preserve"> si hay una sola operación fija que nunca se va a reasignar ni registrar (Refactoring.Guru, s. f.-a).</w:t>
+        <w:t xml:space="preserve"> cuando hay una sola operación fija que no se reasigna, no se registra ni se deshace; ahí una llamada directa es más clara (Refactoring.Guru, s. f.-a). Tampoco cuando lo único que varía es el algoritmo interno de un objeto, que es el terreno de Strategy.</w:t>
       </w:r>
     </w:p>
     <w:p>
@@ -4676,6 +5587,7 @@
     <w:p>
       <w:pPr>
         <w:pStyle w:val="NormalWeb"/>
+        <w:keepNext/>
         <w:numPr>
           <w:ilvl w:val="0"/>
           <w:numId w:val="11"/>
@@ -4716,6 +5628,7 @@
     <w:p>
       <w:pPr>
         <w:pStyle w:val="NormalWeb"/>
+        <w:keepNext/>
         <w:numPr>
           <w:ilvl w:val="0"/>
           <w:numId w:val="11"/>
@@ -4733,7 +5646,7 @@
           <w:sz w:val="20"/>
           <w:szCs w:val="20"/>
         </w:rPr>
-        <w:t xml:space="preserve">Recomendación aceptada y justificación:</w:t>
+        <w:t xml:space="preserve">Prompt de revisión:</w:t>
       </w:r>
     </w:p>
     <w:p>
@@ -4750,12 +5663,13 @@
           <w:sz w:val="20"/>
           <w:szCs w:val="20"/>
         </w:rPr>
-        <w:t xml:space="preserve">Una interfaz IComando con un único método ejecutar(), y que cada comando concreto guarde una referencia a Luz. Se aceptó porque ControlRemoto puede ejecutar cualquier comando sin saber qué dispositivo ni qué acción hay detrás.</w:t>
-      </w:r>
-    </w:p>
-    <w:p>
-      <w:pPr>
-        <w:pStyle w:val="NormalWeb"/>
+        <w:t xml:space="preserve">“Revisa el documento guía de la actividad y lo desarrollado en nuestra resolución (código, UML e informe) y dinos qué se puede mejorar para obtener la calificación más alta.”</w:t>
+      </w:r>
+    </w:p>
+    <w:p>
+      <w:pPr>
+        <w:pStyle w:val="NormalWeb"/>
+        <w:keepNext/>
         <w:numPr>
           <w:ilvl w:val="0"/>
           <w:numId w:val="11"/>
@@ -4773,7 +5687,7 @@
           <w:sz w:val="20"/>
           <w:szCs w:val="20"/>
         </w:rPr>
-        <w:t xml:space="preserve">Recomendación modificada o rechazada y justificación:</w:t>
+        <w:t xml:space="preserve">Recomendación aceptada y justificación:</w:t>
       </w:r>
     </w:p>
     <w:p>
@@ -4790,7 +5704,206 @@
           <w:sz w:val="20"/>
           <w:szCs w:val="20"/>
         </w:rPr>
-        <w:t xml:space="preserve">Poner la lógica directamente en ejecutar(), sin un receptor. Se rechazó porque el comando solo debe delegar: la lógica del dispositivo va en Luz. De lo contrario, cada comando acumula lógica de dominio.</w:t>
+        <w:t xml:space="preserve">En la primera iteración, la IA propuso una interfaz IComando y que cada comando concreto guardara una referencia a su receptor. Lo aceptamos porque ControlRemoto puede ejecutar cualquier comando sin saber qué dispositivo ni qué acción hay detrás.</w:t>
+      </w:r>
+    </w:p>
+    <w:p>
+      <w:pPr>
+        <w:pStyle w:val="NormalWeb"/>
+        <w:shd w:val="clear" w:color="auto" w:fill="FFFFFF"/>
+        <w:spacing w:line="360" w:lineRule="auto"/>
+        <w:jc w:val="both"/>
+      </w:pPr>
+      <w:r>
+        <w:rPr>
+          <w:rFonts w:asciiTheme="minorHAnsi" w:hAnsiTheme="minorHAnsi" w:cstheme="minorHAnsi"/>
+          <w:color w:val="767171" w:themeColor="background2" w:themeShade="80"/>
+          <w:sz w:val="20"/>
+          <w:szCs w:val="20"/>
+        </w:rPr>
+        <w:t xml:space="preserve">En la revisión, la IA observó que el escenario inicial (un botón, una luz, encender y apagar) no aprovechaba lo que distingue a Command de Strategy y que el propio informe mencionaba el deshacer como algo pendiente. Aceptamos agregar deshacer() con historial, un segundo receptor y un macrocomando, porque cada uno ejercita una consecuencia distinta del patrón.</w:t>
+      </w:r>
+    </w:p>
+    <w:p>
+      <w:pPr>
+        <w:pStyle w:val="NormalWeb"/>
+        <w:keepNext/>
+        <w:numPr>
+          <w:ilvl w:val="0"/>
+          <w:numId w:val="11"/>
+        </w:numPr>
+        <w:shd w:val="clear" w:color="auto" w:fill="FFFFFF"/>
+        <w:spacing w:before="60" w:beforeAutospacing="0" w:after="0" w:afterAutospacing="0" w:line="360" w:lineRule="auto"/>
+        <w:jc w:val="both"/>
+      </w:pPr>
+      <w:r>
+        <w:rPr>
+          <w:rFonts w:asciiTheme="minorHAnsi" w:hAnsiTheme="minorHAnsi" w:cstheme="minorHAnsi"/>
+          <w:b/>
+          <w:bCs/>
+          <w:color w:val="767171" w:themeColor="background2" w:themeShade="80"/>
+          <w:sz w:val="20"/>
+          <w:szCs w:val="20"/>
+        </w:rPr>
+        <w:t xml:space="preserve">Recomendación modificada o rechazada y justificación:</w:t>
+      </w:r>
+    </w:p>
+    <w:p>
+      <w:pPr>
+        <w:pStyle w:val="NormalWeb"/>
+        <w:shd w:val="clear" w:color="auto" w:fill="FFFFFF"/>
+        <w:spacing w:line="360" w:lineRule="auto"/>
+        <w:jc w:val="both"/>
+      </w:pPr>
+      <w:r>
+        <w:rPr>
+          <w:rFonts w:asciiTheme="minorHAnsi" w:hAnsiTheme="minorHAnsi" w:cstheme="minorHAnsi"/>
+          <w:color w:val="767171" w:themeColor="background2" w:themeShade="80"/>
+          <w:sz w:val="20"/>
+          <w:szCs w:val="20"/>
+        </w:rPr>
+        <w:t xml:space="preserve">Modificada: la propuesta de deshacer partía de que cada comando guardara el estado anterior del dispositivo en un campo, que es la forma habitual en la literatura. Al revisarla identificamos el caso del mismo comando ejecutado dos veces, en el que ese campo se sobrescribe, y cambiamos el diseño a una pila por comando. Agregamos además una prueba unitaria específica para ese escenario.</w:t>
+      </w:r>
+    </w:p>
+    <w:p>
+      <w:pPr>
+        <w:pStyle w:val="NormalWeb"/>
+        <w:shd w:val="clear" w:color="auto" w:fill="FFFFFF"/>
+        <w:spacing w:line="360" w:lineRule="auto"/>
+        <w:jc w:val="both"/>
+      </w:pPr>
+      <w:r>
+        <w:rPr>
+          <w:rFonts w:asciiTheme="minorHAnsi" w:hAnsiTheme="minorHAnsi" w:cstheme="minorHAnsi"/>
+          <w:color w:val="767171" w:themeColor="background2" w:themeShade="80"/>
+          <w:sz w:val="20"/>
+          <w:szCs w:val="20"/>
+        </w:rPr>
+        <w:t xml:space="preserve">Rechazada: en la primera iteración, la IA sugirió poner la lógica directamente en ejecutar(), sin un receptor. La rechazamos porque el comando solo debe delegar: la lógica del dispositivo pertenece a Luz o a Ventilador. De lo contrario, cada comando acumula lógica de dominio y se duplica entre comandos.</w:t>
+      </w:r>
+    </w:p>
+    <w:p>
+      <w:pPr>
+        <w:pStyle w:val="NormalWeb"/>
+        <w:keepNext/>
+        <w:shd w:val="clear" w:color="auto" w:fill="FFFFFF"/>
+        <w:spacing w:before="240" w:beforeAutospacing="0" w:after="120" w:afterAutospacing="0" w:line="360" w:lineRule="auto"/>
+        <w:jc w:val="left"/>
+      </w:pPr>
+      <w:r>
+        <w:rPr>
+          <w:rFonts w:asciiTheme="minorHAnsi" w:hAnsiTheme="minorHAnsi" w:cstheme="minorHAnsi"/>
+          <w:b/>
+          <w:bCs/>
+          <w:color w:val="2F5496" w:themeColor="accent1" w:themeShade="BF"/>
+          <w:sz w:val="26"/>
+          <w:szCs w:val="26"/>
+        </w:rPr>
+        <w:t xml:space="preserve">Pruebas automatizadas</w:t>
+      </w:r>
+    </w:p>
+    <w:p>
+      <w:pPr>
+        <w:pStyle w:val="NormalWeb"/>
+        <w:keepNext/>
+        <w:shd w:val="clear" w:color="auto" w:fill="FFFFFF"/>
+        <w:spacing w:line="360" w:lineRule="auto"/>
+        <w:jc w:val="both"/>
+      </w:pPr>
+      <w:r>
+        <w:rPr>
+          <w:rFonts w:asciiTheme="minorHAnsi" w:hAnsiTheme="minorHAnsi" w:cstheme="minorHAnsi"/>
+          <w:color w:val="767171" w:themeColor="background2" w:themeShade="80"/>
+          <w:sz w:val="20"/>
+          <w:szCs w:val="20"/>
+        </w:rPr>
+        <w:t xml:space="preserve">Para validar el comportamiento, y no solo la salida por consola, escribimos 13 pruebas con JUnit 5 que se ejecutan con mvn test (Figura 7). En Mediator verifican el orden de llegada, la prioridad del vuelo sanitario, el rechazo de solicitudes duplicadas o de aeronaves no registradas y que ninguna aeronave aterrice sin autorización. En Command verifican la ejecución por ranura, la reasignación en ejecución, el deshacer de cada tipo de comando, el deshacer de una macro como una sola acción, que un botón vacío no altere el historial y el rechazo de botones inexistentes.</w:t>
+      </w:r>
+    </w:p>
+    <w:p>
+      <w:pPr>
+        <w:pStyle w:val="NormalWeb"/>
+        <w:keepNext/>
+        <w:shd w:val="clear" w:color="auto" w:fill="FFFFFF"/>
+        <w:spacing w:before="120" w:beforeAutospacing="0" w:after="0" w:afterAutospacing="0" w:line="240" w:lineRule="auto"/>
+        <w:jc w:val="center"/>
+      </w:pPr>
+      <w:r>
+        <w:rPr>
+          <w:noProof/>
+        </w:rPr>
+        <w:drawing>
+          <wp:inline distT="0" distB="0" distL="0" distR="0">
+            <wp:extent cx="5394960" cy="1282575"/>
+            <wp:effectExtent l="0" t="0" r="0" b="0"/>
+            <wp:docPr id="907" name="Figura 7"/>
+            <wp:cNvGraphicFramePr>
+              <a:graphicFrameLocks xmlns:a="http://schemas.openxmlformats.org/drawingml/2006/main" noChangeAspect="1"/>
+            </wp:cNvGraphicFramePr>
+            <a:graphic xmlns:a="http://schemas.openxmlformats.org/drawingml/2006/main">
+              <a:graphicData uri="http://schemas.openxmlformats.org/drawingml/2006/picture">
+                <pic:pic xmlns:pic="http://schemas.openxmlformats.org/drawingml/2006/picture">
+                  <pic:nvPicPr>
+                    <pic:cNvPr id="907" name="informe7.png"/>
+                    <pic:cNvPicPr/>
+                  </pic:nvPicPr>
+                  <pic:blipFill>
+                    <a:blip r:embed="rIdInf7"/>
+                    <a:stretch>
+                      <a:fillRect/>
+                    </a:stretch>
+                  </pic:blipFill>
+                  <pic:spPr>
+                    <a:xfrm>
+                      <a:off x="0" y="0"/>
+                      <a:ext cx="5394960" cy="1282575"/>
+                    </a:xfrm>
+                    <a:prstGeom prst="rect">
+                      <a:avLst/>
+                    </a:prstGeom>
+                    <a:ln w="6350">
+                      <a:solidFill>
+                        <a:srgbClr val="BFBFBF"/>
+                      </a:solidFill>
+                    </a:ln>
+                  </pic:spPr>
+                </pic:pic>
+              </a:graphicData>
+            </a:graphic>
+          </wp:inline>
+        </w:drawing>
+      </w:r>
+    </w:p>
+    <w:p>
+      <w:pPr>
+        <w:pStyle w:val="NormalWeb"/>
+        <w:shd w:val="clear" w:color="auto" w:fill="FFFFFF"/>
+        <w:spacing w:before="60" w:beforeAutospacing="0" w:after="200" w:afterAutospacing="0" w:line="360" w:lineRule="auto"/>
+        <w:jc w:val="center"/>
+      </w:pPr>
+      <w:r>
+        <w:rPr>
+          <w:rFonts w:asciiTheme="minorHAnsi" w:hAnsiTheme="minorHAnsi" w:cstheme="minorHAnsi"/>
+          <w:b/>
+          <w:bCs/>
+          <w:i/>
+          <w:iCs/>
+          <w:color w:val="767171" w:themeColor="background2" w:themeShade="80"/>
+          <w:sz w:val="18"/>
+          <w:szCs w:val="18"/>
+        </w:rPr>
+        <w:t xml:space="preserve">Figura 7: </w:t>
+      </w:r>
+      <w:r>
+        <w:rPr>
+          <w:rFonts w:asciiTheme="minorHAnsi" w:hAnsiTheme="minorHAnsi" w:cstheme="minorHAnsi"/>
+          <w:i/>
+          <w:iCs/>
+          <w:color w:val="767171" w:themeColor="background2" w:themeShade="80"/>
+          <w:sz w:val="18"/>
+          <w:szCs w:val="18"/>
+        </w:rPr>
+        <w:t xml:space="preserve">Resultado de las pruebas unitarias (mvn test)</w:t>
       </w:r>
     </w:p>
     <w:p>
@@ -4938,7 +6051,7 @@
                 <w:sz w:val="18"/>
                 <w:szCs w:val="18"/>
               </w:rPr>
-              <w:t xml:space="preserve">Pregunta que responde</w:t>
+              <w:t xml:space="preserve">Intención (GoF)</w:t>
             </w:r>
           </w:p>
         </w:tc>
@@ -4960,7 +6073,7 @@
                 <w:sz w:val="18"/>
                 <w:szCs w:val="18"/>
               </w:rPr>
-              <w:t xml:space="preserve">¿Cómo coordinamos varios objetos?</w:t>
+              <w:t xml:space="preserve">Encapsular cómo interactúa un conjunto de objetos</w:t>
             </w:r>
           </w:p>
         </w:tc>
@@ -4982,7 +6095,7 @@
                 <w:sz w:val="18"/>
                 <w:szCs w:val="18"/>
               </w:rPr>
-              <w:t xml:space="preserve">¿Cómo representamos una solicitud?</w:t>
+              <w:t xml:space="preserve">Encapsular una solicitud como objeto</w:t>
             </w:r>
           </w:p>
         </w:tc>
@@ -5011,7 +6124,7 @@
                 <w:sz w:val="18"/>
                 <w:szCs w:val="18"/>
               </w:rPr>
-              <w:t xml:space="preserve">Centro del patrón</w:t>
+              <w:t xml:space="preserve">Pregunta que responde</w:t>
             </w:r>
           </w:p>
         </w:tc>
@@ -5033,7 +6146,7 @@
                 <w:sz w:val="18"/>
                 <w:szCs w:val="18"/>
               </w:rPr>
-              <w:t xml:space="preserve">Reglas de interacción</w:t>
+              <w:t xml:space="preserve">¿Quién coordina a varios objetos que dependen unos de otros?</w:t>
             </w:r>
           </w:p>
         </w:tc>
@@ -5055,7 +6168,7 @@
                 <w:sz w:val="18"/>
                 <w:szCs w:val="18"/>
               </w:rPr>
-              <w:t xml:space="preserve">Objeto Command</w:t>
+              <w:t xml:space="preserve">¿Cómo represento una orden para guardarla, reasignarla o deshacerla?</w:t>
             </w:r>
           </w:p>
         </w:tc>
@@ -5084,7 +6197,7 @@
                 <w:sz w:val="18"/>
                 <w:szCs w:val="18"/>
               </w:rPr>
-              <w:t xml:space="preserve">Dependencia reducida</w:t>
+              <w:t xml:space="preserve">Dependencia que elimina</w:t>
             </w:r>
           </w:p>
         </w:tc>
@@ -5157,7 +6270,7 @@
                 <w:sz w:val="18"/>
                 <w:szCs w:val="18"/>
               </w:rPr>
-              <w:t xml:space="preserve">Ejemplo implementado</w:t>
+              <w:t xml:space="preserve">Dónde queda la lógica</w:t>
             </w:r>
           </w:p>
         </w:tc>
@@ -5179,7 +6292,7 @@
                 <w:sz w:val="18"/>
                 <w:szCs w:val="18"/>
               </w:rPr>
-              <w:t xml:space="preserve">Torre de control</w:t>
+              <w:t xml:space="preserve">En el mediador: reglas de interacción</w:t>
             </w:r>
           </w:p>
         </w:tc>
@@ -5201,7 +6314,80 @@
                 <w:sz w:val="18"/>
                 <w:szCs w:val="18"/>
               </w:rPr>
-              <w:t xml:space="preserve">Control remoto</w:t>
+              <w:t xml:space="preserve">En los comandos: qué hacer y cómo revertirlo</w:t>
+            </w:r>
+          </w:p>
+        </w:tc>
+      </w:tr>
+      <w:tr>
+        <w:trPr>
+          <w:cantSplit/>
+        </w:trPr>
+        <w:tc>
+          <w:tcPr>
+            <w:tcW w:w="2400" w:type="dxa"/>
+            <w:shd w:val="clear" w:color="auto" w:fill="F2F2F2"/>
+            <w:vAlign w:val="center"/>
+          </w:tcPr>
+          <w:p>
+            <w:pPr>
+              <w:spacing w:before="40" w:after="40" w:line="240" w:lineRule="auto"/>
+              <w:jc w:val="left"/>
+            </w:pPr>
+            <w:r>
+              <w:rPr>
+                <w:rFonts w:asciiTheme="minorHAnsi" w:hAnsiTheme="minorHAnsi" w:cstheme="minorHAnsi"/>
+                <w:b/>
+                <w:bCs/>
+                <w:color w:val="767171" w:themeColor="background2" w:themeShade="80"/>
+                <w:sz w:val="18"/>
+                <w:szCs w:val="18"/>
+              </w:rPr>
+              <w:t xml:space="preserve">Extensión demostrada</w:t>
+            </w:r>
+          </w:p>
+        </w:tc>
+        <w:tc>
+          <w:tcPr>
+            <w:tcW w:w="3000" w:type="dxa"/>
+            <w:shd w:val="clear" w:color="auto" w:fill="FFFFFF"/>
+            <w:vAlign w:val="center"/>
+          </w:tcPr>
+          <w:p>
+            <w:pPr>
+              <w:spacing w:before="40" w:after="40" w:line="240" w:lineRule="auto"/>
+              <w:jc w:val="left"/>
+            </w:pPr>
+            <w:r>
+              <w:rPr>
+                <w:rFonts w:asciiTheme="minorHAnsi" w:hAnsiTheme="minorHAnsi" w:cstheme="minorHAnsi"/>
+                <w:color w:val="767171" w:themeColor="background2" w:themeShade="80"/>
+                <w:sz w:val="18"/>
+                <w:szCs w:val="18"/>
+              </w:rPr>
+              <w:t xml:space="preserve">AvionSanitario y regla de prioridad</w:t>
+            </w:r>
+          </w:p>
+        </w:tc>
+        <w:tc>
+          <w:tcPr>
+            <w:tcW w:w="3000" w:type="dxa"/>
+            <w:shd w:val="clear" w:color="auto" w:fill="FFFFFF"/>
+            <w:vAlign w:val="center"/>
+          </w:tcPr>
+          <w:p>
+            <w:pPr>
+              <w:spacing w:before="40" w:after="40" w:line="240" w:lineRule="auto"/>
+              <w:jc w:val="left"/>
+            </w:pPr>
+            <w:r>
+              <w:rPr>
+                <w:rFonts w:asciiTheme="minorHAnsi" w:hAnsiTheme="minorHAnsi" w:cstheme="minorHAnsi"/>
+                <w:color w:val="767171" w:themeColor="background2" w:themeShade="80"/>
+                <w:sz w:val="18"/>
+                <w:szCs w:val="18"/>
+              </w:rPr>
+              <w:t xml:space="preserve">Ventilador, deshacer y MacroComando</w:t>
             </w:r>
           </w:p>
         </w:tc>
@@ -5252,7 +6438,7 @@
                 <w:sz w:val="18"/>
                 <w:szCs w:val="18"/>
               </w:rPr>
-              <w:t xml:space="preserve">Mediator monolítico</w:t>
+              <w:t xml:space="preserve">Mediador monolítico</w:t>
             </w:r>
           </w:p>
         </w:tc>
@@ -5274,7 +6460,80 @@
                 <w:sz w:val="18"/>
                 <w:szCs w:val="18"/>
               </w:rPr>
-              <w:t xml:space="preserve">Proliferación de clases</w:t>
+              <w:t xml:space="preserve">Proliferación de clases pequeñas</w:t>
+            </w:r>
+          </w:p>
+        </w:tc>
+      </w:tr>
+      <w:tr>
+        <w:trPr>
+          <w:cantSplit/>
+        </w:trPr>
+        <w:tc>
+          <w:tcPr>
+            <w:tcW w:w="2400" w:type="dxa"/>
+            <w:shd w:val="clear" w:color="auto" w:fill="F2F2F2"/>
+            <w:vAlign w:val="center"/>
+          </w:tcPr>
+          <w:p>
+            <w:pPr>
+              <w:spacing w:before="40" w:after="40" w:line="240" w:lineRule="auto"/>
+              <w:jc w:val="left"/>
+            </w:pPr>
+            <w:r>
+              <w:rPr>
+                <w:rFonts w:asciiTheme="minorHAnsi" w:hAnsiTheme="minorHAnsi" w:cstheme="minorHAnsi"/>
+                <w:b/>
+                <w:bCs/>
+                <w:color w:val="767171" w:themeColor="background2" w:themeShade="80"/>
+                <w:sz w:val="18"/>
+                <w:szCs w:val="18"/>
+              </w:rPr>
+              <w:t xml:space="preserve">Señal para no usarlo</w:t>
+            </w:r>
+          </w:p>
+        </w:tc>
+        <w:tc>
+          <w:tcPr>
+            <w:tcW w:w="3000" w:type="dxa"/>
+            <w:shd w:val="clear" w:color="auto" w:fill="FFFFFF"/>
+            <w:vAlign w:val="center"/>
+          </w:tcPr>
+          <w:p>
+            <w:pPr>
+              <w:spacing w:before="40" w:after="40" w:line="240" w:lineRule="auto"/>
+              <w:jc w:val="left"/>
+            </w:pPr>
+            <w:r>
+              <w:rPr>
+                <w:rFonts w:asciiTheme="minorHAnsi" w:hAnsiTheme="minorHAnsi" w:cstheme="minorHAnsi"/>
+                <w:color w:val="767171" w:themeColor="background2" w:themeShade="80"/>
+                <w:sz w:val="18"/>
+                <w:szCs w:val="18"/>
+              </w:rPr>
+              <w:t xml:space="preserve">Pocos objetos con relaciones estables</w:t>
+            </w:r>
+          </w:p>
+        </w:tc>
+        <w:tc>
+          <w:tcPr>
+            <w:tcW w:w="3000" w:type="dxa"/>
+            <w:shd w:val="clear" w:color="auto" w:fill="FFFFFF"/>
+            <w:vAlign w:val="center"/>
+          </w:tcPr>
+          <w:p>
+            <w:pPr>
+              <w:spacing w:before="40" w:after="40" w:line="240" w:lineRule="auto"/>
+              <w:jc w:val="left"/>
+            </w:pPr>
+            <w:r>
+              <w:rPr>
+                <w:rFonts w:asciiTheme="minorHAnsi" w:hAnsiTheme="minorHAnsi" w:cstheme="minorHAnsi"/>
+                <w:color w:val="767171" w:themeColor="background2" w:themeShade="80"/>
+                <w:sz w:val="18"/>
+                <w:szCs w:val="18"/>
+              </w:rPr>
+              <w:t xml:space="preserve">Operación única que no se reasigna ni se deshace</w:t>
             </w:r>
           </w:p>
         </w:tc>
@@ -5294,7 +6553,44 @@
           <w:sz w:val="20"/>
           <w:szCs w:val="20"/>
         </w:rPr>
-        <w:t xml:space="preserve">Para elegir entre ambos, primero hay que ver si el problema es coordinar varios objetos o representar una solicitud.</w:t>
+        <w:t xml:space="preserve">Ambos patrones reducen el acoplamiento introduciendo un objeto intermedio, pero en direcciones opuestas. Mediator centraliza: reúne en un solo lugar reglas que antes estaban dispersas. Command distribuye: saca la lógica del invocador y la reparte en objetos pequeños e intercambiables. Por eso, al elegir entre ellos, la pregunta no es cuál desacopla más, sino si el problema consiste en coordinar a varios participantes o en representar una petición.</w:t>
+      </w:r>
+    </w:p>
+    <w:p>
+      <w:pPr>
+        <w:pStyle w:val="NormalWeb"/>
+        <w:keepNext/>
+        <w:shd w:val="clear" w:color="auto" w:fill="FFFFFF"/>
+        <w:spacing w:before="200" w:beforeAutospacing="0" w:after="60" w:afterAutospacing="0" w:line="360" w:lineRule="auto"/>
+        <w:jc w:val="left"/>
+      </w:pPr>
+      <w:r>
+        <w:rPr>
+          <w:rFonts w:asciiTheme="minorHAnsi" w:hAnsiTheme="minorHAnsi" w:cstheme="minorHAnsi"/>
+          <w:b/>
+          <w:bCs/>
+          <w:color w:val="2F5496" w:themeColor="accent1" w:themeShade="BF"/>
+          <w:sz w:val="20"/>
+          <w:szCs w:val="20"/>
+        </w:rPr>
+        <w:t xml:space="preserve">Balance del uso de inteligencia artificial</w:t>
+      </w:r>
+    </w:p>
+    <w:p>
+      <w:pPr>
+        <w:pStyle w:val="NormalWeb"/>
+        <w:shd w:val="clear" w:color="auto" w:fill="FFFFFF"/>
+        <w:spacing w:line="360" w:lineRule="auto"/>
+        <w:jc w:val="both"/>
+      </w:pPr>
+      <w:r>
+        <w:rPr>
+          <w:rFonts w:asciiTheme="minorHAnsi" w:hAnsiTheme="minorHAnsi" w:cstheme="minorHAnsi"/>
+          <w:color w:val="767171" w:themeColor="background2" w:themeShade="80"/>
+          <w:sz w:val="20"/>
+          <w:szCs w:val="20"/>
+        </w:rPr>
+        <w:t xml:space="preserve">Usamos la IA en dos momentos: al inicio, para obtener una primera estructura de cada solución, y al final, como revisor crítico del trabajo completo frente a la rúbrica. En ambos casos aplicamos tres filtros antes de aceptar una sugerencia: que respetara los roles GoF, que pudiera verificarse con una prueba ejecutable y que mantuviera la correspondencia entre el UML y el código. Las propuestas que no superaban alguno de esos filtros se modificaron o se descartaron, como se detalla en cada patrón.</w:t>
       </w:r>
     </w:p>
     <w:p>
@@ -5331,7 +6627,7 @@
           <w:sz w:val="20"/>
           <w:szCs w:val="20"/>
         </w:rPr>
-        <w:t xml:space="preserve">La elección de cada patrón dependió de ubicar bien el problema. En la torre de control el problema era de coordinación: varias aeronaves compiten por una pista y, sin un punto central, cada una tendría que conocer a las demás. Con Mediator, TorreControlConcreta lleva el estado de la pista y la cola, y cada aeronave solo reporta, pide turno y aterriza. En el control remoto el problema era cómo representar la orden. Con Command, ControlRemoto llama a ejecutar() sin saber que del otro lado hay una luz, y el mismo botón cambia de acción en ejecución.</w:t>
+        <w:t xml:space="preserve">La elección de cada patrón dependió más de ubicar bien el problema que de conocer el catálogo. En la torre de control el problema era de coordinación: varias aeronaves compiten por un recurso y, sin un punto central, cada una tendría que conocer a las demás. Mediator lo resolvió, y lo demostró al incorporar los vuelos sanitarios, que exigieron cambiar solo la torre. En el control remoto el problema era cómo representar una orden; Command permitió reasignar botones, deshacer acciones y componer escenas sin tocar el invocador.</w:t>
       </w:r>
     </w:p>
     <w:p>
@@ -5348,7 +6644,7 @@
           <w:sz w:val="20"/>
           <w:szCs w:val="20"/>
         </w:rPr>
-        <w:t xml:space="preserve">Ninguno de los dos patrones es gratuito. La torre concentra toda la lógica y puede volverse difícil de mantener si se le siguen agregando reglas; Command suma una clase por cada acción y una llamada intermedia. En estos dos casos el costo se justifica, pero en un problema más simple no se justificaría.</w:t>
+        <w:t xml:space="preserve">Ninguno de los dos es gratuito. La torre acumula reglas y, si el sistema creciera, habría que dividirla; Command multiplica las clases y obliga a cada comando a saber revertirse, asumiendo que el dispositivo no cambia por fuera del control. En ambos casos el costo se justifica por la variabilidad del escenario; en un problema pequeño y estable no se justificaría.</w:t>
       </w:r>
     </w:p>
     <w:p>
@@ -5365,7 +6661,7 @@
           <w:sz w:val="20"/>
           <w:szCs w:val="20"/>
         </w:rPr>
-        <w:t xml:space="preserve">La IA sirvió para obtener una primera propuesta de estructura, pero cada sugerencia se revisó contra los roles GoF. Se aceptaron las que mantenían separadas las responsabilidades y se rechazaron las que volvían a acoplar a las aeronaves entre sí o ponían la lógica de la luz dentro de los comandos.</w:t>
+        <w:t xml:space="preserve">La IA fue útil como punto de partida y como revisor, pero ninguna sugerencia entró al proyecto sin contrastarla con los roles del patrón y con una prueba. El caso más ilustrativo fue el deshacer: la solución habitual funcionaba en el ejemplo simple y fallaba en un caso límite que detectamos al revisarla.</w:t>
       </w:r>
     </w:p>
     <w:p>
@@ -5441,7 +6737,7 @@
           <w:sz w:val="20"/>
           <w:szCs w:val="20"/>
         </w:rPr>
-        <w:t xml:space="preserve">Gamma, E., Helm, R., Johnson, R., y Vlissides, J. (1994). </w:t>
+        <w:t xml:space="preserve">Freeman, E., y Robson, E. (2020). </w:t>
       </w:r>
       <w:r>
         <w:rPr>
@@ -5452,6 +6748,44 @@
           <w:sz w:val="20"/>
           <w:szCs w:val="20"/>
         </w:rPr>
+        <w:t xml:space="preserve">Head First design patterns</w:t>
+      </w:r>
+      <w:r>
+        <w:rPr>
+          <w:rFonts w:asciiTheme="minorHAnsi" w:hAnsiTheme="minorHAnsi" w:cstheme="minorHAnsi"/>
+          <w:color w:val="767171" w:themeColor="background2" w:themeShade="80"/>
+          <w:sz w:val="20"/>
+          <w:szCs w:val="20"/>
+        </w:rPr>
+        <w:t xml:space="preserve"> (2.ª ed.). O’Reilly Media.</w:t>
+      </w:r>
+    </w:p>
+    <w:p>
+      <w:pPr>
+        <w:pStyle w:val="NormalWeb"/>
+        <w:shd w:val="clear" w:color="auto" w:fill="FFFFFF"/>
+        <w:spacing w:before="20" w:beforeAutospacing="0" w:after="40" w:afterAutospacing="0" w:line="276" w:lineRule="auto"/>
+        <w:ind w:left="567" w:hanging="567"/>
+        <w:jc w:val="left"/>
+      </w:pPr>
+      <w:r>
+        <w:rPr>
+          <w:rFonts w:asciiTheme="minorHAnsi" w:hAnsiTheme="minorHAnsi" w:cstheme="minorHAnsi"/>
+          <w:color w:val="767171" w:themeColor="background2" w:themeShade="80"/>
+          <w:sz w:val="20"/>
+          <w:szCs w:val="20"/>
+        </w:rPr>
+        <w:t xml:space="preserve">Gamma, E., Helm, R., Johnson, R., y Vlissides, J. (1994). </w:t>
+      </w:r>
+      <w:r>
+        <w:rPr>
+          <w:rFonts w:asciiTheme="minorHAnsi" w:hAnsiTheme="minorHAnsi" w:cstheme="minorHAnsi"/>
+          <w:i/>
+          <w:iCs/>
+          <w:color w:val="767171" w:themeColor="background2" w:themeShade="80"/>
+          <w:sz w:val="20"/>
+          <w:szCs w:val="20"/>
+        </w:rPr>
         <w:t xml:space="preserve">Design patterns: Elements of reusable object-oriented software</w:t>
       </w:r>
       <w:r>
@@ -5462,6 +6796,44 @@
           <w:szCs w:val="20"/>
         </w:rPr>
         <w:t xml:space="preserve">. Addison-Wesley.</w:t>
+      </w:r>
+    </w:p>
+    <w:p>
+      <w:pPr>
+        <w:pStyle w:val="NormalWeb"/>
+        <w:shd w:val="clear" w:color="auto" w:fill="FFFFFF"/>
+        <w:spacing w:before="20" w:beforeAutospacing="0" w:after="40" w:afterAutospacing="0" w:line="276" w:lineRule="auto"/>
+        <w:ind w:left="567" w:hanging="567"/>
+        <w:jc w:val="left"/>
+      </w:pPr>
+      <w:r>
+        <w:rPr>
+          <w:rFonts w:asciiTheme="minorHAnsi" w:hAnsiTheme="minorHAnsi" w:cstheme="minorHAnsi"/>
+          <w:color w:val="767171" w:themeColor="background2" w:themeShade="80"/>
+          <w:sz w:val="20"/>
+          <w:szCs w:val="20"/>
+        </w:rPr>
+        <w:t xml:space="preserve">JUnit Team. (s. f.). </w:t>
+      </w:r>
+      <w:r>
+        <w:rPr>
+          <w:rFonts w:asciiTheme="minorHAnsi" w:hAnsiTheme="minorHAnsi" w:cstheme="minorHAnsi"/>
+          <w:i/>
+          <w:iCs/>
+          <w:color w:val="767171" w:themeColor="background2" w:themeShade="80"/>
+          <w:sz w:val="20"/>
+          <w:szCs w:val="20"/>
+        </w:rPr>
+        <w:t xml:space="preserve">JUnit 5 user guide</w:t>
+      </w:r>
+      <w:r>
+        <w:rPr>
+          <w:rFonts w:asciiTheme="minorHAnsi" w:hAnsiTheme="minorHAnsi" w:cstheme="minorHAnsi"/>
+          <w:color w:val="767171" w:themeColor="background2" w:themeShade="80"/>
+          <w:sz w:val="20"/>
+          <w:szCs w:val="20"/>
+        </w:rPr>
+        <w:t xml:space="preserve">. https://junit.org/junit5/docs/current/user-guide/</w:t>
       </w:r>
     </w:p>
     <w:p>
@@ -7729,6 +9101,18 @@
     <w:abstractNumId w:val="3"/>
   </w:num>
   <w:numIdMacAtCleanup w:val="6"/>
+  <w:num w:numId="12">
+    <w:abstractNumId w:val="10"/>
+    <w:lvlOverride w:ilvl="0">
+      <w:startOverride w:val="1"/>
+    </w:lvlOverride>
+  </w:num>
+  <w:num w:numId="13">
+    <w:abstractNumId w:val="10"/>
+    <w:lvlOverride w:ilvl="0">
+      <w:startOverride w:val="1"/>
+    </w:lvlOverride>
+  </w:num>
 </w:numbering>
 </file>
 

</xml_diff>